<commit_message>
Consolidated Satin review: price top of search on the effective bid, stage the 900% setting, size rule for colour switches, Queen Grey test, held-term cap
Co-Authored-By: Claude Opus 5.5 <noreply@anthropic.com>
Claude-Session: https://claude.ai/code/session_01YNgDp4Dr6K8rA49jFuXt44
</commit_message>
<xml_diff>
--- a/satin_deliverables/Satin4_US_audit_20260929_consolidated_review.docx
+++ b/satin_deliverables/Satin4_US_audit_20260929_consolidated_review.docx
@@ -41,7 +41,7 @@
         <w:spacing w:after="120"/>
       </w:pPr>
       <w:r>
-        <w:t xml:space="preserve">The two reviews reached most of the same conclusions from different angles. Both reject the audit's colour switches on the ranking campaigns, its cuts on the ranking terms, its circular pauses and its B6-derived rules. Both price on Sellerboard's realised margin, and both keep Queen, Full and Twin ranking on their Black colours. Of the audit's 381 decisions that change price, state, colour or structure, both say "don't load as written" on 238 and "load" on 18. Many of the rest differ only in how the same price is reached.</w:t>
+        <w:t xml:space="preserve">The two reviews reached most of the same conclusions from different angles. Both reject the audit's colour switches on the ranking campaigns, its cuts on the ranking terms, and its circular pauses, and both check the rows that cite the team's B4 and B6 corrections against this product's data. Both price on Sellerboard's realised margin, and both keep Queen, Full and Twin ranking on their Black colours. Of the audit's 381 decisions that change price, state, colour or structure, both say "don't load as written" on 238 and "load" on 18. Many of the rest differ only in how the same price is reached.</w:t>
       </w:r>
     </w:p>
     <w:p>
@@ -111,10 +111,20 @@
           <w:b/>
           <w:bCs/>
         </w:rPr>
-        <w:t xml:space="preserve">Ranking: no price cuts on the ranking terms, and every exact campaign goes top of search only</w:t>
-      </w:r>
-      <w:r>
-        <w:t xml:space="preserve"> (Review B's setting: boost 900%, base bid = top-of-search price ÷ 10, rest of search and product pages 0%, down-only bidding). Today's top-of-search price is held, so the product-page and rest-of-search spend moves to the top.</w:t>
+        <w:t xml:space="preserve">Ranking: no price cuts on the ranking terms, and exact campaigns go top of search only</w:t>
+      </w:r>
+      <w:r>
+        <w:t xml:space="preserve"> (Review B's setting: boost 900%, base bid = the top-of-search bid ÷ 10, rest of search and product pages 0%, down-only bidding). The top-of-search bid is today's </w:t>
+      </w:r>
+      <w:r>
+        <w:rPr>
+          <w:i/>
+          <w:iCs/>
+        </w:rPr>
+        <w:t xml:space="preserve">effective bid</w:t>
+      </w:r>
+      <w:r>
+        <w:t xml:space="preserve"> (base × (1 + boost)), not the cost per click. Down-only bidding pays at or below the bid, so a bid set at the average cost per click loses the auctions that clear above it. On 20 ranking keywords Review B's bases would have cut the bid by 4–90% ("king size silk sheets" $4.60 → $3.40, "satin bed sheets full" $4.56 → $3.20). The one limit is the market bound (the term's top-of-search cost per click + 15%, where the term has enough clicks to read it), above which a higher bid buys no more clicks. The setting goes out in two waves: the 70 ranking campaigns now, the 220 other exact campaigns after the 16 Oct read (Section 4.2).</w:t>
       </w:r>
     </w:p>
     <w:p>
@@ -133,7 +143,7 @@
         <w:t xml:space="preserve">Push volume only where our listing converts at or near the market's rate</w:t>
       </w:r>
       <w:r>
-        <w:t xml:space="preserve"> (Review A's gate on Review B's term list and click sizing). That keeps 26 of Review B's 36 push terms, stages "silk sheets" (call 3), and holds 9 Queen terms (8 campaigns) at today's presence: no cut and no increase until the Queen offer is fixed. On those 9 we convert at 40–85% of the market's rate (search-query data, 30 Aug–26 Sep).</w:t>
+        <w:t xml:space="preserve"> (Review A's gate on Review B's term list and click sizing). That keeps 26 of Review B's 36 push terms, stages "silk sheets" (call 3), and holds 9 Queen terms (8 campaigns) at today's bid: no cut and no increase. On those 9 we convert at 40–85% of the market's rate (search-query data, 30 Aug–26 Sep). The hold has a cap and a date: the 8 campaigns spend no more than their $72 a day of the last 30 days, Brand Management decides the Queen offer by 10 Oct, and they are re-scored on 16 Oct.</w:t>
       </w:r>
     </w:p>
     <w:p>
@@ -190,7 +200,7 @@
         <w:t xml:space="preserve">LTSF comes first for everything that isn't ranking</w:t>
       </w:r>
       <w:r>
-        <w:t xml:space="preserve"> (Review B). Non-ranking Queen traffic moves from Queen Black to Queen Grey, the #1 LTSF SKU ($448.95 of the $1,632.92 charge, about 888 aged units). The two LTSF campaigns get their product ads fixed. This also takes most of Queen Black's loss-making non-ranking spend off it, which Review A had flagged.</w:t>
+        <w:t xml:space="preserve"> (Review B). Non-ranking Queen traffic, 94 campaigns, moves from Queen Black to Queen Grey, the #1 LTSF SKU ($448.95 of the $1,632.92 charge, about 888 aged units). Queen Grey passes the same test that rejects Stone Grey, but only while its aged units last. It converts at 11.2% of paid clicks against Queen Black's 14.3%, and is clicked at 0.36% against 0.65% (4,022 against 26,434 clicks, 90 days). With the storage it avoids, it earns about $1.12 a click against Queen Black's $0.72. When the aged units clear (about 5 Dec), those campaigns go back to Queen Black, not on to Stone Grey. The two LTSF campaigns get their product ads fixed, and Queen Black's loss-making non-ranking spend comes off the colour the push needs.</w:t>
       </w:r>
     </w:p>
     <w:p>
@@ -309,8 +319,8 @@
         </w:tblBorders>
       </w:tblPr>
       <w:tblGrid>
-        <w:gridCol w:w="4387"/>
-        <w:gridCol w:w="9653"/>
+        <w:gridCol w:w="4680"/>
+        <w:gridCol w:w="9360"/>
       </w:tblGrid>
       <w:tr>
         <w:trPr>
@@ -318,7 +328,7 @@
         </w:trPr>
         <w:tc>
           <w:tcPr>
-            <w:tcW w:type="dxa" w:w="4387"/>
+            <w:tcW w:type="dxa" w:w="4680"/>
             <w:tcBorders>
               <w:top w:val="single" w:color="BFBFBF" w:sz="4"/>
               <w:left w:val="single" w:color="BFBFBF" w:sz="4"/>
@@ -348,7 +358,7 @@
         </w:tc>
         <w:tc>
           <w:tcPr>
-            <w:tcW w:type="dxa" w:w="9653"/>
+            <w:tcW w:type="dxa" w:w="9360"/>
             <w:tcBorders>
               <w:top w:val="single" w:color="BFBFBF" w:sz="4"/>
               <w:left w:val="single" w:color="BFBFBF" w:sz="4"/>
@@ -383,7 +393,7 @@
         </w:trPr>
         <w:tc>
           <w:tcPr>
-            <w:tcW w:type="dxa" w:w="4387"/>
+            <w:tcW w:type="dxa" w:w="4680"/>
             <w:tcBorders>
               <w:top w:val="single" w:color="BFBFBF" w:sz="4"/>
               <w:left w:val="single" w:color="BFBFBF" w:sz="4"/>
@@ -409,7 +419,7 @@
         </w:tc>
         <w:tc>
           <w:tcPr>
-            <w:tcW w:type="dxa" w:w="9653"/>
+            <w:tcW w:type="dxa" w:w="9360"/>
             <w:tcBorders>
               <w:top w:val="single" w:color="BFBFBF" w:sz="4"/>
               <w:left w:val="single" w:color="BFBFBF" w:sz="4"/>
@@ -440,7 +450,7 @@
         </w:trPr>
         <w:tc>
           <w:tcPr>
-            <w:tcW w:type="dxa" w:w="4387"/>
+            <w:tcW w:type="dxa" w:w="4680"/>
             <w:tcBorders>
               <w:top w:val="single" w:color="BFBFBF" w:sz="4"/>
               <w:left w:val="single" w:color="BFBFBF" w:sz="4"/>
@@ -466,27 +476,27 @@
         </w:tc>
         <w:tc>
           <w:tcPr>
-            <w:tcW w:type="dxa" w:w="9653"/>
-            <w:tcBorders>
-              <w:top w:val="single" w:color="BFBFBF" w:sz="4"/>
-              <w:left w:val="single" w:color="BFBFBF" w:sz="4"/>
-              <w:bottom w:val="single" w:color="BFBFBF" w:sz="4"/>
-              <w:right w:val="single" w:color="BFBFBF" w:sz="4"/>
-            </w:tcBorders>
-            <w:tcMar>
-              <w:top w:type="dxa" w:w="60"/>
-              <w:left w:type="dxa" w:w="90"/>
-              <w:bottom w:type="dxa" w:w="60"/>
-              <w:right w:type="dxa" w:w="90"/>
-            </w:tcMar>
-          </w:tcPr>
-          <w:p>
-            <w:r>
-              <w:rPr>
-                <w:sz w:val="17"/>
-                <w:szCs w:val="17"/>
-              </w:rPr>
-              <w:t xml:space="preserve">Review B's setting for exact campaigns: top-of-search boost 900% (Amazon's maximum), base bid = the top-of-search price ÷ 10, rest-of-search and product-page boosts 0%, bidding "Dynamic – down only". The top-of-search price stays where it is; the other placements see only the small base bid.</w:t>
+            <w:tcW w:type="dxa" w:w="9360"/>
+            <w:tcBorders>
+              <w:top w:val="single" w:color="BFBFBF" w:sz="4"/>
+              <w:left w:val="single" w:color="BFBFBF" w:sz="4"/>
+              <w:bottom w:val="single" w:color="BFBFBF" w:sz="4"/>
+              <w:right w:val="single" w:color="BFBFBF" w:sz="4"/>
+            </w:tcBorders>
+            <w:tcMar>
+              <w:top w:type="dxa" w:w="60"/>
+              <w:left w:type="dxa" w:w="90"/>
+              <w:bottom w:type="dxa" w:w="60"/>
+              <w:right w:type="dxa" w:w="90"/>
+            </w:tcMar>
+          </w:tcPr>
+          <w:p>
+            <w:r>
+              <w:rPr>
+                <w:sz w:val="17"/>
+                <w:szCs w:val="17"/>
+              </w:rPr>
+              <w:t xml:space="preserve">Review B's setting for exact campaigns: top-of-search boost 900% (Amazon's maximum), base bid = the effective top-of-search bid ÷ 10, rest-of-search and product-page boosts 0%, bidding "Dynamic – down only". The top-of-search bid stays where it is; the other placements see only the small base bid.</w:t>
             </w:r>
           </w:p>
         </w:tc>
@@ -497,53 +507,53 @@
         </w:trPr>
         <w:tc>
           <w:tcPr>
-            <w:tcW w:type="dxa" w:w="4387"/>
-            <w:tcBorders>
-              <w:top w:val="single" w:color="BFBFBF" w:sz="4"/>
-              <w:left w:val="single" w:color="BFBFBF" w:sz="4"/>
-              <w:bottom w:val="single" w:color="BFBFBF" w:sz="4"/>
-              <w:right w:val="single" w:color="BFBFBF" w:sz="4"/>
-            </w:tcBorders>
-            <w:tcMar>
-              <w:top w:type="dxa" w:w="60"/>
-              <w:left w:type="dxa" w:w="90"/>
-              <w:bottom w:type="dxa" w:w="60"/>
-              <w:right w:type="dxa" w:w="90"/>
-            </w:tcMar>
-          </w:tcPr>
-          <w:p>
-            <w:r>
-              <w:rPr>
-                <w:sz w:val="17"/>
-                <w:szCs w:val="17"/>
-              </w:rPr>
-              <w:t xml:space="preserve">Like-for-like conversion</w:t>
-            </w:r>
-          </w:p>
-        </w:tc>
-        <w:tc>
-          <w:tcPr>
-            <w:tcW w:type="dxa" w:w="9653"/>
-            <w:tcBorders>
-              <w:top w:val="single" w:color="BFBFBF" w:sz="4"/>
-              <w:left w:val="single" w:color="BFBFBF" w:sz="4"/>
-              <w:bottom w:val="single" w:color="BFBFBF" w:sz="4"/>
-              <w:right w:val="single" w:color="BFBFBF" w:sz="4"/>
-            </w:tcBorders>
-            <w:tcMar>
-              <w:top w:type="dxa" w:w="60"/>
-              <w:left w:type="dxa" w:w="90"/>
-              <w:bottom w:type="dxa" w:w="60"/>
-              <w:right w:type="dxa" w:w="90"/>
-            </w:tcMar>
-          </w:tcPr>
-          <w:p>
-            <w:r>
-              <w:rPr>
-                <w:sz w:val="17"/>
-                <w:szCs w:val="17"/>
-              </w:rPr>
-              <w:t xml:space="preserve">Amazon's search query data: our listing's purchases ÷ clicks against the whole market's, same weeks (30 Aug–26 Sep). Ad-reported conversion credits any colour bought within 7 days and runs 3–4 times higher, so it is compared only with other ad figures.</w:t>
+            <w:tcW w:type="dxa" w:w="4680"/>
+            <w:tcBorders>
+              <w:top w:val="single" w:color="BFBFBF" w:sz="4"/>
+              <w:left w:val="single" w:color="BFBFBF" w:sz="4"/>
+              <w:bottom w:val="single" w:color="BFBFBF" w:sz="4"/>
+              <w:right w:val="single" w:color="BFBFBF" w:sz="4"/>
+            </w:tcBorders>
+            <w:tcMar>
+              <w:top w:type="dxa" w:w="60"/>
+              <w:left w:type="dxa" w:w="90"/>
+              <w:bottom w:type="dxa" w:w="60"/>
+              <w:right w:type="dxa" w:w="90"/>
+            </w:tcMar>
+          </w:tcPr>
+          <w:p>
+            <w:r>
+              <w:rPr>
+                <w:sz w:val="17"/>
+                <w:szCs w:val="17"/>
+              </w:rPr>
+              <w:t xml:space="preserve">Effective top-of-search bid</w:t>
+            </w:r>
+          </w:p>
+        </w:tc>
+        <w:tc>
+          <w:tcPr>
+            <w:tcW w:type="dxa" w:w="9360"/>
+            <w:tcBorders>
+              <w:top w:val="single" w:color="BFBFBF" w:sz="4"/>
+              <w:left w:val="single" w:color="BFBFBF" w:sz="4"/>
+              <w:bottom w:val="single" w:color="BFBFBF" w:sz="4"/>
+              <w:right w:val="single" w:color="BFBFBF" w:sz="4"/>
+            </w:tcBorders>
+            <w:tcMar>
+              <w:top w:type="dxa" w:w="60"/>
+              <w:left w:type="dxa" w:w="90"/>
+              <w:bottom w:type="dxa" w:w="60"/>
+              <w:right w:type="dxa" w:w="90"/>
+            </w:tcMar>
+          </w:tcPr>
+          <w:p>
+            <w:r>
+              <w:rPr>
+                <w:sz w:val="17"/>
+                <w:szCs w:val="17"/>
+              </w:rPr>
+              <w:t xml:space="preserve">Base bid × (1 + top-of-search boost): the most we pay at the top. With down-only bidding the cost per click is at or below it, so it is the figure to hold. "Cost per click" means what was actually paid on average.</w:t>
             </w:r>
           </w:p>
         </w:tc>
@@ -554,53 +564,53 @@
         </w:trPr>
         <w:tc>
           <w:tcPr>
-            <w:tcW w:type="dxa" w:w="4387"/>
-            <w:tcBorders>
-              <w:top w:val="single" w:color="BFBFBF" w:sz="4"/>
-              <w:left w:val="single" w:color="BFBFBF" w:sz="4"/>
-              <w:bottom w:val="single" w:color="BFBFBF" w:sz="4"/>
-              <w:right w:val="single" w:color="BFBFBF" w:sz="4"/>
-            </w:tcBorders>
-            <w:tcMar>
-              <w:top w:type="dxa" w:w="60"/>
-              <w:left w:type="dxa" w:w="90"/>
-              <w:bottom w:type="dxa" w:w="60"/>
-              <w:right w:type="dxa" w:w="90"/>
-            </w:tcMar>
-          </w:tcPr>
-          <w:p>
-            <w:r>
-              <w:rPr>
-                <w:sz w:val="17"/>
-                <w:szCs w:val="17"/>
-              </w:rPr>
-              <w:t xml:space="preserve">Rank-share curve</w:t>
-            </w:r>
-          </w:p>
-        </w:tc>
-        <w:tc>
-          <w:tcPr>
-            <w:tcW w:type="dxa" w:w="9653"/>
-            <w:tcBorders>
-              <w:top w:val="single" w:color="BFBFBF" w:sz="4"/>
-              <w:left w:val="single" w:color="BFBFBF" w:sz="4"/>
-              <w:bottom w:val="single" w:color="BFBFBF" w:sz="4"/>
-              <w:right w:val="single" w:color="BFBFBF" w:sz="4"/>
-            </w:tcBorders>
-            <w:tcMar>
-              <w:top w:type="dxa" w:w="60"/>
-              <w:left w:type="dxa" w:w="90"/>
-              <w:bottom w:type="dxa" w:w="60"/>
-              <w:right w:type="dxa" w:w="90"/>
-            </w:tcMar>
-          </w:tcPr>
-          <w:p>
-            <w:r>
-              <w:rPr>
-                <w:sz w:val="17"/>
-                <w:szCs w:val="17"/>
-              </w:rPr>
-              <w:t xml:space="preserve">Review B's link between organic rank and share of purchases, from our own search-query data (Q3): rank 1–3 about 10.4%, 4–5 about 6.2%, 6–10 about 3.6%, 11–20 about 1.8%. It sets the clicks a term needs to reach the next rank band.</w:t>
+            <w:tcW w:type="dxa" w:w="4680"/>
+            <w:tcBorders>
+              <w:top w:val="single" w:color="BFBFBF" w:sz="4"/>
+              <w:left w:val="single" w:color="BFBFBF" w:sz="4"/>
+              <w:bottom w:val="single" w:color="BFBFBF" w:sz="4"/>
+              <w:right w:val="single" w:color="BFBFBF" w:sz="4"/>
+            </w:tcBorders>
+            <w:tcMar>
+              <w:top w:type="dxa" w:w="60"/>
+              <w:left w:type="dxa" w:w="90"/>
+              <w:bottom w:type="dxa" w:w="60"/>
+              <w:right w:type="dxa" w:w="90"/>
+            </w:tcMar>
+          </w:tcPr>
+          <w:p>
+            <w:r>
+              <w:rPr>
+                <w:sz w:val="17"/>
+                <w:szCs w:val="17"/>
+              </w:rPr>
+              <w:t xml:space="preserve">Market bound</w:t>
+            </w:r>
+          </w:p>
+        </w:tc>
+        <w:tc>
+          <w:tcPr>
+            <w:tcW w:type="dxa" w:w="9360"/>
+            <w:tcBorders>
+              <w:top w:val="single" w:color="BFBFBF" w:sz="4"/>
+              <w:left w:val="single" w:color="BFBFBF" w:sz="4"/>
+              <w:bottom w:val="single" w:color="BFBFBF" w:sz="4"/>
+              <w:right w:val="single" w:color="BFBFBF" w:sz="4"/>
+            </w:tcBorders>
+            <w:tcMar>
+              <w:top w:type="dxa" w:w="60"/>
+              <w:left w:type="dxa" w:w="90"/>
+              <w:bottom w:type="dxa" w:w="60"/>
+              <w:right w:type="dxa" w:w="90"/>
+            </w:tcMar>
+          </w:tcPr>
+          <w:p>
+            <w:r>
+              <w:rPr>
+                <w:sz w:val="17"/>
+                <w:szCs w:val="17"/>
+              </w:rPr>
+              <w:t xml:space="preserve">The term's top-of-search cost per click + 15%. Above it a higher bid buys no more clicks. It is used only where the term has at least 0.5 top-of-search clicks a day; below that the cost per click is noise.</w:t>
             </w:r>
           </w:p>
         </w:tc>
@@ -611,53 +621,53 @@
         </w:trPr>
         <w:tc>
           <w:tcPr>
-            <w:tcW w:type="dxa" w:w="4387"/>
-            <w:tcBorders>
-              <w:top w:val="single" w:color="BFBFBF" w:sz="4"/>
-              <w:left w:val="single" w:color="BFBFBF" w:sz="4"/>
-              <w:bottom w:val="single" w:color="BFBFBF" w:sz="4"/>
-              <w:right w:val="single" w:color="BFBFBF" w:sz="4"/>
-            </w:tcBorders>
-            <w:tcMar>
-              <w:top w:type="dxa" w:w="60"/>
-              <w:left w:type="dxa" w:w="90"/>
-              <w:bottom w:type="dxa" w:w="60"/>
-              <w:right w:type="dxa" w:w="90"/>
-            </w:tcMar>
-          </w:tcPr>
-          <w:p>
-            <w:r>
-              <w:rPr>
-                <w:sz w:val="17"/>
-                <w:szCs w:val="17"/>
-              </w:rPr>
-              <w:t xml:space="preserve">Profit per unit</w:t>
-            </w:r>
-          </w:p>
-        </w:tc>
-        <w:tc>
-          <w:tcPr>
-            <w:tcW w:type="dxa" w:w="9653"/>
-            <w:tcBorders>
-              <w:top w:val="single" w:color="BFBFBF" w:sz="4"/>
-              <w:left w:val="single" w:color="BFBFBF" w:sz="4"/>
-              <w:bottom w:val="single" w:color="BFBFBF" w:sz="4"/>
-              <w:right w:val="single" w:color="BFBFBF" w:sz="4"/>
-            </w:tcBorders>
-            <w:tcMar>
-              <w:top w:type="dxa" w:w="60"/>
-              <w:left w:type="dxa" w:w="90"/>
-              <w:bottom w:type="dxa" w:w="60"/>
-              <w:right w:type="dxa" w:w="90"/>
-            </w:tcMar>
-          </w:tcPr>
-          <w:p>
-            <w:r>
-              <w:rPr>
-                <w:sz w:val="17"/>
-                <w:szCs w:val="17"/>
-              </w:rPr>
-              <w:t xml:space="preserve">Sellerboard profit before ads (after product cost, fees, refunds and storage). Full price for pricing forward; deal price on deal days.</w:t>
+            <w:tcW w:type="dxa" w:w="4680"/>
+            <w:tcBorders>
+              <w:top w:val="single" w:color="BFBFBF" w:sz="4"/>
+              <w:left w:val="single" w:color="BFBFBF" w:sz="4"/>
+              <w:bottom w:val="single" w:color="BFBFBF" w:sz="4"/>
+              <w:right w:val="single" w:color="BFBFBF" w:sz="4"/>
+            </w:tcBorders>
+            <w:tcMar>
+              <w:top w:type="dxa" w:w="60"/>
+              <w:left w:type="dxa" w:w="90"/>
+              <w:bottom w:type="dxa" w:w="60"/>
+              <w:right w:type="dxa" w:w="90"/>
+            </w:tcMar>
+          </w:tcPr>
+          <w:p>
+            <w:r>
+              <w:rPr>
+                <w:sz w:val="17"/>
+                <w:szCs w:val="17"/>
+              </w:rPr>
+              <w:t xml:space="preserve">Like-for-like conversion</w:t>
+            </w:r>
+          </w:p>
+        </w:tc>
+        <w:tc>
+          <w:tcPr>
+            <w:tcW w:type="dxa" w:w="9360"/>
+            <w:tcBorders>
+              <w:top w:val="single" w:color="BFBFBF" w:sz="4"/>
+              <w:left w:val="single" w:color="BFBFBF" w:sz="4"/>
+              <w:bottom w:val="single" w:color="BFBFBF" w:sz="4"/>
+              <w:right w:val="single" w:color="BFBFBF" w:sz="4"/>
+            </w:tcBorders>
+            <w:tcMar>
+              <w:top w:type="dxa" w:w="60"/>
+              <w:left w:type="dxa" w:w="90"/>
+              <w:bottom w:type="dxa" w:w="60"/>
+              <w:right w:type="dxa" w:w="90"/>
+            </w:tcMar>
+          </w:tcPr>
+          <w:p>
+            <w:r>
+              <w:rPr>
+                <w:sz w:val="17"/>
+                <w:szCs w:val="17"/>
+              </w:rPr>
+              <w:t xml:space="preserve">Amazon's search query data: our listing's purchases ÷ clicks against the whole market's, same weeks (30 Aug–26 Sep). Ad-reported conversion credits any colour bought within 7 days and runs 3–4 times higher, so it is compared only with other ad figures.</w:t>
             </w:r>
           </w:p>
         </w:tc>
@@ -668,53 +678,53 @@
         </w:trPr>
         <w:tc>
           <w:tcPr>
-            <w:tcW w:type="dxa" w:w="4387"/>
-            <w:tcBorders>
-              <w:top w:val="single" w:color="BFBFBF" w:sz="4"/>
-              <w:left w:val="single" w:color="BFBFBF" w:sz="4"/>
-              <w:bottom w:val="single" w:color="BFBFBF" w:sz="4"/>
-              <w:right w:val="single" w:color="BFBFBF" w:sz="4"/>
-            </w:tcBorders>
-            <w:tcMar>
-              <w:top w:type="dxa" w:w="60"/>
-              <w:left w:type="dxa" w:w="90"/>
-              <w:bottom w:type="dxa" w:w="60"/>
-              <w:right w:type="dxa" w:w="90"/>
-            </w:tcMar>
-          </w:tcPr>
-          <w:p>
-            <w:r>
-              <w:rPr>
-                <w:sz w:val="17"/>
-                <w:szCs w:val="17"/>
-              </w:rPr>
-              <w:t xml:space="preserve">LTSF</w:t>
-            </w:r>
-          </w:p>
-        </w:tc>
-        <w:tc>
-          <w:tcPr>
-            <w:tcW w:type="dxa" w:w="9653"/>
-            <w:tcBorders>
-              <w:top w:val="single" w:color="BFBFBF" w:sz="4"/>
-              <w:left w:val="single" w:color="BFBFBF" w:sz="4"/>
-              <w:bottom w:val="single" w:color="BFBFBF" w:sz="4"/>
-              <w:right w:val="single" w:color="BFBFBF" w:sz="4"/>
-            </w:tcBorders>
-            <w:tcMar>
-              <w:top w:type="dxa" w:w="60"/>
-              <w:left w:type="dxa" w:w="90"/>
-              <w:bottom w:type="dxa" w:w="60"/>
-              <w:right w:type="dxa" w:w="90"/>
-            </w:tcMar>
-          </w:tcPr>
-          <w:p>
-            <w:r>
-              <w:rPr>
-                <w:sz w:val="17"/>
-                <w:szCs w:val="17"/>
-              </w:rPr>
-              <w:t xml:space="preserve">Long-term storage and aged-inventory surcharge. Selling an aged unit avoids its charge, so a colour's clearance break-even can be higher than its selling break-even (Queen Grey: 34% against 11%).</w:t>
+            <w:tcW w:type="dxa" w:w="4680"/>
+            <w:tcBorders>
+              <w:top w:val="single" w:color="BFBFBF" w:sz="4"/>
+              <w:left w:val="single" w:color="BFBFBF" w:sz="4"/>
+              <w:bottom w:val="single" w:color="BFBFBF" w:sz="4"/>
+              <w:right w:val="single" w:color="BFBFBF" w:sz="4"/>
+            </w:tcBorders>
+            <w:tcMar>
+              <w:top w:type="dxa" w:w="60"/>
+              <w:left w:type="dxa" w:w="90"/>
+              <w:bottom w:type="dxa" w:w="60"/>
+              <w:right w:type="dxa" w:w="90"/>
+            </w:tcMar>
+          </w:tcPr>
+          <w:p>
+            <w:r>
+              <w:rPr>
+                <w:sz w:val="17"/>
+                <w:szCs w:val="17"/>
+              </w:rPr>
+              <w:t xml:space="preserve">Rank-share curve</w:t>
+            </w:r>
+          </w:p>
+        </w:tc>
+        <w:tc>
+          <w:tcPr>
+            <w:tcW w:type="dxa" w:w="9360"/>
+            <w:tcBorders>
+              <w:top w:val="single" w:color="BFBFBF" w:sz="4"/>
+              <w:left w:val="single" w:color="BFBFBF" w:sz="4"/>
+              <w:bottom w:val="single" w:color="BFBFBF" w:sz="4"/>
+              <w:right w:val="single" w:color="BFBFBF" w:sz="4"/>
+            </w:tcBorders>
+            <w:tcMar>
+              <w:top w:type="dxa" w:w="60"/>
+              <w:left w:type="dxa" w:w="90"/>
+              <w:bottom w:type="dxa" w:w="60"/>
+              <w:right w:type="dxa" w:w="90"/>
+            </w:tcMar>
+          </w:tcPr>
+          <w:p>
+            <w:r>
+              <w:rPr>
+                <w:sz w:val="17"/>
+                <w:szCs w:val="17"/>
+              </w:rPr>
+              <w:t xml:space="preserve">Review B's link between organic rank and share of purchases, from our own search-query data (Q3): rank 1–3 about 10.4%, 4–5 about 6.2%, 6–10 about 3.6%, 11–20 about 1.8%. It sets the clicks a term needs to reach the next rank band.</w:t>
             </w:r>
           </w:p>
         </w:tc>
@@ -725,7 +735,121 @@
         </w:trPr>
         <w:tc>
           <w:tcPr>
-            <w:tcW w:type="dxa" w:w="4387"/>
+            <w:tcW w:type="dxa" w:w="4680"/>
+            <w:tcBorders>
+              <w:top w:val="single" w:color="BFBFBF" w:sz="4"/>
+              <w:left w:val="single" w:color="BFBFBF" w:sz="4"/>
+              <w:bottom w:val="single" w:color="BFBFBF" w:sz="4"/>
+              <w:right w:val="single" w:color="BFBFBF" w:sz="4"/>
+            </w:tcBorders>
+            <w:tcMar>
+              <w:top w:type="dxa" w:w="60"/>
+              <w:left w:type="dxa" w:w="90"/>
+              <w:bottom w:type="dxa" w:w="60"/>
+              <w:right w:type="dxa" w:w="90"/>
+            </w:tcMar>
+          </w:tcPr>
+          <w:p>
+            <w:r>
+              <w:rPr>
+                <w:sz w:val="17"/>
+                <w:szCs w:val="17"/>
+              </w:rPr>
+              <w:t xml:space="preserve">Profit per unit</w:t>
+            </w:r>
+          </w:p>
+        </w:tc>
+        <w:tc>
+          <w:tcPr>
+            <w:tcW w:type="dxa" w:w="9360"/>
+            <w:tcBorders>
+              <w:top w:val="single" w:color="BFBFBF" w:sz="4"/>
+              <w:left w:val="single" w:color="BFBFBF" w:sz="4"/>
+              <w:bottom w:val="single" w:color="BFBFBF" w:sz="4"/>
+              <w:right w:val="single" w:color="BFBFBF" w:sz="4"/>
+            </w:tcBorders>
+            <w:tcMar>
+              <w:top w:type="dxa" w:w="60"/>
+              <w:left w:type="dxa" w:w="90"/>
+              <w:bottom w:type="dxa" w:w="60"/>
+              <w:right w:type="dxa" w:w="90"/>
+            </w:tcMar>
+          </w:tcPr>
+          <w:p>
+            <w:r>
+              <w:rPr>
+                <w:sz w:val="17"/>
+                <w:szCs w:val="17"/>
+              </w:rPr>
+              <w:t xml:space="preserve">Sellerboard profit before ads (after product cost, fees, refunds and storage). Full price for pricing forward; deal price on deal days.</w:t>
+            </w:r>
+          </w:p>
+        </w:tc>
+      </w:tr>
+      <w:tr>
+        <w:trPr>
+          <w:tblHeader w:val="off"/>
+        </w:trPr>
+        <w:tc>
+          <w:tcPr>
+            <w:tcW w:type="dxa" w:w="4680"/>
+            <w:tcBorders>
+              <w:top w:val="single" w:color="BFBFBF" w:sz="4"/>
+              <w:left w:val="single" w:color="BFBFBF" w:sz="4"/>
+              <w:bottom w:val="single" w:color="BFBFBF" w:sz="4"/>
+              <w:right w:val="single" w:color="BFBFBF" w:sz="4"/>
+            </w:tcBorders>
+            <w:tcMar>
+              <w:top w:type="dxa" w:w="60"/>
+              <w:left w:type="dxa" w:w="90"/>
+              <w:bottom w:type="dxa" w:w="60"/>
+              <w:right w:type="dxa" w:w="90"/>
+            </w:tcMar>
+          </w:tcPr>
+          <w:p>
+            <w:r>
+              <w:rPr>
+                <w:sz w:val="17"/>
+                <w:szCs w:val="17"/>
+              </w:rPr>
+              <w:t xml:space="preserve">LTSF</w:t>
+            </w:r>
+          </w:p>
+        </w:tc>
+        <w:tc>
+          <w:tcPr>
+            <w:tcW w:type="dxa" w:w="9360"/>
+            <w:tcBorders>
+              <w:top w:val="single" w:color="BFBFBF" w:sz="4"/>
+              <w:left w:val="single" w:color="BFBFBF" w:sz="4"/>
+              <w:bottom w:val="single" w:color="BFBFBF" w:sz="4"/>
+              <w:right w:val="single" w:color="BFBFBF" w:sz="4"/>
+            </w:tcBorders>
+            <w:tcMar>
+              <w:top w:type="dxa" w:w="60"/>
+              <w:left w:type="dxa" w:w="90"/>
+              <w:bottom w:type="dxa" w:w="60"/>
+              <w:right w:type="dxa" w:w="90"/>
+            </w:tcMar>
+          </w:tcPr>
+          <w:p>
+            <w:r>
+              <w:rPr>
+                <w:sz w:val="17"/>
+                <w:szCs w:val="17"/>
+              </w:rPr>
+              <w:t xml:space="preserve">Long-term storage and aged-inventory surcharge. Selling an aged unit avoids its charge, so a colour's clearance break-even can be higher than its selling break-even (Queen Grey: 34% against 11%).</w:t>
+            </w:r>
+          </w:p>
+        </w:tc>
+      </w:tr>
+      <w:tr>
+        <w:trPr>
+          <w:tblHeader w:val="off"/>
+        </w:trPr>
+        <w:tc>
+          <w:tcPr>
+            <w:tcW w:type="dxa" w:w="4680"/>
             <w:tcBorders>
               <w:top w:val="single" w:color="BFBFBF" w:sz="4"/>
               <w:left w:val="single" w:color="BFBFBF" w:sz="4"/>
@@ -751,7 +875,7 @@
         </w:tc>
         <w:tc>
           <w:tcPr>
-            <w:tcW w:type="dxa" w:w="9653"/>
+            <w:tcW w:type="dxa" w:w="9360"/>
             <w:tcBorders>
               <w:top w:val="single" w:color="BFBFBF" w:sz="4"/>
               <w:left w:val="single" w:color="BFBFBF" w:sz="4"/>
@@ -1867,10 +1991,10 @@
           <w:b/>
           <w:bCs/>
         </w:rPr>
-        <w:t xml:space="preserve">On the audit's rules copied from B6</w:t>
-      </w:r>
-      <w:r>
-        <w:t xml:space="preserve"> (35 rows), both reviews re-decide on this product's data.</w:t>
+        <w:t xml:space="preserve">The rows that cite the team's own rules</w:t>
+      </w:r>
+      <w:r>
+        <w:t xml:space="preserve"> (173 cite the B4 corrections, 35 the B6 corrections, loaded into the engine on 28 Sep) apply those rules as written. Both reviews check them against this product's data. Where the result is wrong, the fault is in the data under the rule (the impressions feed reads 0 on spending campaigns) or in a test the rule lacks (the revive rule has no ACoS test), not in the rule itself (appendix).</w:t>
       </w:r>
     </w:p>
     <w:p>
@@ -2608,7 +2732,7 @@
                 <w:sz w:val="17"/>
                 <w:szCs w:val="17"/>
               </w:rPr>
-              <w:t xml:space="preserve">The conquest and B6-derived rows are re-decided on this product's data</w:t>
+              <w:t xml:space="preserve">The rows citing the B4 and B6 corrections are checked against this product's data</w:t>
             </w:r>
           </w:p>
         </w:tc>
@@ -2660,7 +2784,7 @@
                 <w:sz w:val="17"/>
                 <w:szCs w:val="17"/>
               </w:rPr>
-              <w:t xml:space="preserve">Same call.</w:t>
+              <w:t xml:space="preserve">The rules stand. Two need fixing underneath: the "not serving" hold fires because the impressions feed reads 0 on 103 campaigns that spent (for example $279, $226 and $205 in 14 days), and the revive rule needs an ACoS test.</w:t>
             </w:r>
           </w:p>
         </w:tc>
@@ -3062,7 +3186,7 @@
                 <w:sz w:val="17"/>
                 <w:szCs w:val="17"/>
               </w:rPr>
-              <w:t xml:space="preserve">Top-of-search only at 900% in one write, on every exact campaign</w:t>
+              <w:t xml:space="preserve">Top-of-search only at 900% in one write, on every exact campaign; top-of-search price = today's cost per click on the term</w:t>
             </w:r>
           </w:p>
         </w:tc>
@@ -3088,7 +3212,7 @@
                 <w:sz w:val="17"/>
                 <w:szCs w:val="17"/>
               </w:rPr>
-              <w:t xml:space="preserve">B</w:t>
+              <w:t xml:space="preserve">B's setting, on the effective bid, in two waves</w:t>
             </w:r>
           </w:p>
         </w:tc>
@@ -3114,7 +3238,7 @@
                 <w:sz w:val="17"/>
                 <w:szCs w:val="17"/>
               </w:rPr>
-              <w:t xml:space="preserve">It delivers the same top-of-search price in one clean write and moves almost all clicks to the top, which is what an exact campaign is for. A's step caps protect orders on product pages; on ranking campaigns those orders run at 43–76% ACoS. The only exception is a campaign whose own data shows top of search converting worse, and B found none.</w:t>
+              <w:t xml:space="preserve">It moves almost all clicks to the top in one clean write, which is what an exact campaign is for; A's step caps protect product-page orders that on ranking campaigns run at 43–76% ACoS. But the price must be the effective bid, not the cost per click, or the setting cuts the ranking terms it is meant to protect. And it goes out in two waves, so the first can be read (7–15 Oct) before it reaches the other 220 campaigns.</w:t>
             </w:r>
           </w:p>
         </w:tc>
@@ -3223,7 +3347,7 @@
                 <w:sz w:val="17"/>
                 <w:szCs w:val="17"/>
               </w:rPr>
-              <w:t xml:space="preserve">Hold today's price at top of search only; no push</w:t>
+              <w:t xml:space="preserve">Hold today's effective bid ($3.82 / $3.87; base $0.39) at top of search only; no push</w:t>
             </w:r>
           </w:p>
         </w:tc>
@@ -4360,7 +4484,7 @@
                 <w:sz w:val="17"/>
                 <w:szCs w:val="17"/>
               </w:rPr>
-              <w:t xml:space="preserve">"grey satin king sheet set" (row 1938)</w:t>
+              <w:t xml:space="preserve">Colour switches that change the size (ten audit rows)</w:t>
             </w:r>
           </w:p>
         </w:tc>
@@ -4386,7 +4510,7 @@
                 <w:sz w:val="17"/>
                 <w:szCs w:val="17"/>
               </w:rPr>
-              <w:t xml:space="preserve">Reject the switch</w:t>
+              <w:t xml:space="preserve">Reject 1938; move red and dark green from Queen to King or Full</w:t>
             </w:r>
           </w:p>
         </w:tc>
@@ -4412,7 +4536,7 @@
                 <w:sz w:val="17"/>
                 <w:szCs w:val="17"/>
               </w:rPr>
-              <w:t xml:space="preserve">Accept: move to Queen Grey for LTSF</w:t>
+              <w:t xml:space="preserve">Accept 1938 (to Queen Grey) for LTSF</w:t>
             </w:r>
           </w:p>
         </w:tc>
@@ -4438,7 +4562,7 @@
                 <w:sz w:val="17"/>
                 <w:szCs w:val="17"/>
               </w:rPr>
-              <w:t xml:space="preserve">A</w:t>
+              <w:t xml:space="preserve">One stated rule, applied to all ten (Section 4.4)</w:t>
             </w:r>
           </w:p>
         </w:tc>
@@ -4464,7 +4588,7 @@
                 <w:sz w:val="17"/>
                 <w:szCs w:val="17"/>
               </w:rPr>
-              <w:t xml:space="preserve">It would put a King search on a Queen sheet. A colour switch never changes the size.</w:t>
+              <w:t xml:space="preserve">A size-named term always advertises its named size. A colour-named term with no size advertises its colour in that colour's best-selling size with stock, and may change size when that runs out. "grey satin king sheet set" advertises Queen Black today, so it goes to King Grey, not Queen Grey.</w:t>
             </w:r>
           </w:p>
         </w:tc>
@@ -4892,7 +5016,7 @@
         <w:pStyle w:val="Heading2"/>
       </w:pPr>
       <w:r>
-        <w:t xml:space="preserve">4.2 One setting for every exact campaign: top of search only</w:t>
+        <w:t xml:space="preserve">4.2 One setting for every exact campaign: top of search only, on the bid, in two waves</w:t>
       </w:r>
     </w:p>
     <w:p>
@@ -4900,7 +5024,7 @@
         <w:spacing w:after="120"/>
       </w:pPr>
       <w:r>
-        <w:t xml:space="preserve">Adopt Review B's setting on every enabled exact campaign (64 ranking, 226 others): top-of-search boost 900%, base bid = the top-of-search price ÷ 10, rest of search and product pages 0%, bidding "Dynamic – down only".</w:t>
+        <w:t xml:space="preserve">Adopt Review B's setting on the enabled exact campaigns: top-of-search boost 900%, base bid = the effective top-of-search bid ÷ 10, rest of search and product pages 0%, bidding "Dynamic – down only". Two corrections to how it is priced and when it goes out:</w:t>
       </w:r>
     </w:p>
     <w:p>
@@ -4916,10 +5040,34 @@
           <w:b/>
           <w:bCs/>
         </w:rPr>
-        <w:t xml:space="preserve">Ranking campaigns</w:t>
-      </w:r>
-      <w:r>
-        <w:t xml:space="preserve"> keep today's top-of-search price (Review B uses today's top-of-search cost per click on the term), so nothing is cut at the top.</w:t>
+        <w:t xml:space="preserve">Price on the bid, not the cost per click.</w:t>
+      </w:r>
+      <w:r>
+        <w:t xml:space="preserve"> The effective top-of-search bid (base × (1 + boost)) is what we offer; the cost per click is what we paid on average, and with down-only bidding it sits below the bid (for example "satin sheets queen" $3.01 against $3.87). A bid set at the average cost per click loses the auctions that cleared above it, about half of them.</w:t>
+      </w:r>
+    </w:p>
+    <w:p>
+      <w:pPr>
+        <w:pStyle w:val="ListParagraph"/>
+        <w:numPr>
+          <w:ilvl w:val="1"/>
+          <w:numId w:val="2"/>
+        </w:numPr>
+      </w:pPr>
+      <w:r>
+        <w:t xml:space="preserve">On 20 ranking keywords Review B's bases would have lowered the bid by 4–90%: "king size silk sheets" $4.60 → $3.40, "satin bed sheets full" $4.56 → $3.20, "king size satin sheet set" $3.90 → $3.00, "full satin sheets set" $4.40 → $3.50, "silk sheets full size" $2.56 → $2.20.</w:t>
+      </w:r>
+    </w:p>
+    <w:p>
+      <w:pPr>
+        <w:pStyle w:val="ListParagraph"/>
+        <w:numPr>
+          <w:ilvl w:val="1"/>
+          <w:numId w:val="2"/>
+        </w:numPr>
+      </w:pPr>
+      <w:r>
+        <w:t xml:space="preserve">The consolidated workbook sets every base from the effective bid. The only limit is the market bound (the term's top-of-search cost per click + 15%) where the term has at least 0.5 top-of-search clicks a day. "king size silk sheets" therefore goes to $3.93, not $3.40 and not $4.60.</w:t>
       </w:r>
     </w:p>
     <w:p>
@@ -4935,10 +5083,76 @@
           <w:b/>
           <w:bCs/>
         </w:rPr>
-        <w:t xml:space="preserve">Other exact campaigns</w:t>
-      </w:r>
-      <w:r>
-        <w:t xml:space="preserve"> keep today's top-of-search price, less a −15% step where their ACoS is above their colour's break-even.</w:t>
+        <w:t xml:space="preserve">Two waves, because the deals leave few clean days to read.</w:t>
+      </w:r>
+    </w:p>
+    <w:p>
+      <w:pPr>
+        <w:pStyle w:val="ListParagraph"/>
+        <w:numPr>
+          <w:ilvl w:val="1"/>
+          <w:numId w:val="2"/>
+        </w:numPr>
+      </w:pPr>
+      <w:r>
+        <w:rPr>
+          <w:b/>
+          <w:bCs/>
+        </w:rPr>
+        <w:t xml:space="preserve">Wave 1, now: the 70 ranking campaigns</w:t>
+      </w:r>
+      <w:r>
+        <w:t xml:space="preserve"> (push, maintain, held and staged terms).</w:t>
+      </w:r>
+    </w:p>
+    <w:p>
+      <w:pPr>
+        <w:pStyle w:val="ListParagraph"/>
+        <w:numPr>
+          <w:ilvl w:val="1"/>
+          <w:numId w:val="2"/>
+        </w:numPr>
+      </w:pPr>
+      <w:r>
+        <w:rPr>
+          <w:b/>
+          <w:bCs/>
+        </w:rPr>
+        <w:t xml:space="preserve">Read on 7–15 Oct</w:t>
+      </w:r>
+      <w:r>
+        <w:t xml:space="preserve">, the only clean days before the Best Deal: orders, top-of-search share and clicks against target. Spend, clicks and share are final on day one; orders settle by 22 Oct.</w:t>
+      </w:r>
+    </w:p>
+    <w:p>
+      <w:pPr>
+        <w:pStyle w:val="ListParagraph"/>
+        <w:numPr>
+          <w:ilvl w:val="1"/>
+          <w:numId w:val="2"/>
+        </w:numPr>
+      </w:pPr>
+      <w:r>
+        <w:rPr>
+          <w:b/>
+          <w:bCs/>
+        </w:rPr>
+        <w:t xml:space="preserve">Wave 2, from 16 Oct if wave 1 held its orders: the other 220 exact campaigns.</w:t>
+      </w:r>
+      <w:r>
+        <w:t xml:space="preserve"> Their own first clean read is 29 Oct–11 Nov.</w:t>
+      </w:r>
+    </w:p>
+    <w:p>
+      <w:pPr>
+        <w:pStyle w:val="ListParagraph"/>
+        <w:numPr>
+          <w:ilvl w:val="1"/>
+          <w:numId w:val="2"/>
+        </w:numPr>
+      </w:pPr>
+      <w:r>
+        <w:t xml:space="preserve">Until wave 2, those campaigns take only the −15% step (on their current setting) where ACoS is above their colour's break-even.</w:t>
       </w:r>
     </w:p>
     <w:p>
@@ -4954,10 +5168,10 @@
           <w:b/>
           <w:bCs/>
         </w:rPr>
-        <w:t xml:space="preserve">What it replaces</w:t>
-      </w:r>
-      <w:r>
-        <w:t xml:space="preserve">: Review A's mix fixes (base −25%, boost up), which move toward the same end in steps.</w:t>
+        <w:t xml:space="preserve">Other exact campaigns</w:t>
+      </w:r>
+      <w:r>
+        <w:t xml:space="preserve"> keep today's effective bid, less the −15% step where it applies.</w:t>
       </w:r>
     </w:p>
     <w:p>
@@ -4992,10 +5206,10 @@
           <w:b/>
           <w:bCs/>
         </w:rPr>
-        <w:t xml:space="preserve">Guard</w:t>
-      </w:r>
-      <w:r>
-        <w:t xml:space="preserve">: read each campaign's orders after 7 clean days. The one exception is a campaign whose own 90-day data shows top of search converting significantly worse; Review B tested every campaign and found none.</w:t>
+        <w:t xml:space="preserve">Exception</w:t>
+      </w:r>
+      <w:r>
+        <w:t xml:space="preserve">: a campaign whose own 90-day data shows top of search converting significantly worse. Review B tested every campaign and found none.</w:t>
       </w:r>
     </w:p>
     <w:p>
@@ -12998,7 +13212,76 @@
         <w:t xml:space="preserve">The 9 held Queen terms</w:t>
       </w:r>
       <w:r>
-        <w:t xml:space="preserve"> keep today's top-of-search price and clicks under the top-of-search-only setting. There is no cut, which withdraws Review A's −15% on "satin sheets queen size", and no push. What holds them back is the offer: rivals at #1–2 sell at $17.99–19.99 against our $29.95, and our search-query conversion there is 40–85% of the market's. Send the offer to Brand Management (price, main image, title) and re-score them on the 12 Nov read.</w:t>
+        <w:t xml:space="preserve"> keep today's effective bid under the top-of-search-only setting. There is no cut, which withdraws Review A's −15% on "satin sheets queen size", and no push.</w:t>
+      </w:r>
+    </w:p>
+    <w:p>
+      <w:pPr>
+        <w:pStyle w:val="ListParagraph"/>
+        <w:numPr>
+          <w:ilvl w:val="1"/>
+          <w:numId w:val="2"/>
+        </w:numPr>
+      </w:pPr>
+      <w:r>
+        <w:rPr>
+          <w:b/>
+          <w:bCs/>
+        </w:rPr>
+        <w:t xml:space="preserve">What holds them back is the offer</w:t>
+      </w:r>
+      <w:r>
+        <w:t xml:space="preserve">: rivals at #1–2 sell at $17.99–19.99 against our $29.95, and our search-query conversion there is 40–85% of the market's.</w:t>
+      </w:r>
+    </w:p>
+    <w:p>
+      <w:pPr>
+        <w:pStyle w:val="ListParagraph"/>
+        <w:numPr>
+          <w:ilvl w:val="1"/>
+          <w:numId w:val="2"/>
+        </w:numPr>
+      </w:pPr>
+      <w:r>
+        <w:rPr>
+          <w:b/>
+          <w:bCs/>
+        </w:rPr>
+        <w:t xml:space="preserve">The hold has a cap and a date.</w:t>
+      </w:r>
+      <w:r>
+        <w:t xml:space="preserve"> The 8 campaigns together spend no more than $72 a day, their average over the last 30 days. Brand Management decides the Queen offer (price, main image, title) by 10 Oct, so the Best Deal price can be part of it.</w:t>
+      </w:r>
+    </w:p>
+    <w:p>
+      <w:pPr>
+        <w:pStyle w:val="ListParagraph"/>
+        <w:numPr>
+          <w:ilvl w:val="1"/>
+          <w:numId w:val="2"/>
+        </w:numPr>
+      </w:pPr>
+      <w:r>
+        <w:rPr>
+          <w:b/>
+          <w:bCs/>
+        </w:rPr>
+        <w:t xml:space="preserve">They are re-scored on 16 Oct and again on 12 Nov.</w:t>
+      </w:r>
+      <w:r>
+        <w:t xml:space="preserve"> If there is no decision by 10 Oct, they stay capped and are not pushed into Q4.</w:t>
+      </w:r>
+    </w:p>
+    <w:p>
+      <w:pPr>
+        <w:pStyle w:val="ListParagraph"/>
+        <w:numPr>
+          <w:ilvl w:val="1"/>
+          <w:numId w:val="2"/>
+        </w:numPr>
+      </w:pPr>
+      <w:r>
+        <w:t xml:space="preserve">The top-of-search-only setting already stops the product-page clicks that ran at 43–76% ACoS on these campaigns.</w:t>
       </w:r>
     </w:p>
     <w:p>
@@ -13017,7 +13300,7 @@
         <w:t xml:space="preserve">"silk sheets"</w:t>
       </w:r>
       <w:r>
-        <w:t xml:space="preserve">: move the ad to Queen Black and set top of search only at today's $2.12–2.30, with the budget from $20 to $25 so it stops capping out.</w:t>
+        <w:t xml:space="preserve">: move the ad to Queen Black and set top of search only at today's effective bid ($2.25; base $0.23 gives $2.30), with the budget from $20 to $25 so it stops capping out.</w:t>
       </w:r>
     </w:p>
     <w:p>
@@ -13029,7 +13312,14 @@
         </w:numPr>
       </w:pPr>
       <w:r>
-        <w:t xml:space="preserve">Check that the live title still carries the "silky" and "silk" wording that the 25 Aug title change removed (Review B).</w:t>
+        <w:rPr>
+          <w:b/>
+          <w:bCs/>
+        </w:rPr>
+        <w:t xml:space="preserve">The two conversion figures measure different things.</w:t>
+      </w:r>
+      <w:r>
+        <w:t xml:space="preserve"> The exact campaign converts 17.8% of paid clicks (21 orders on 118 clicks, the audit's 90-day read). That is ad attribution: any colour bought within 7 days, from an ad showing Queen Grey. The search-query figure (0.36 times the market) is Queen Black's own page on the term, mostly organic clicks at rank 27. Neither measures Queen Black ads on the term, which is why the read below decides it.</w:t>
       </w:r>
     </w:p>
     <w:p>
@@ -13041,7 +13331,19 @@
         </w:numPr>
       </w:pPr>
       <w:r>
-        <w:t xml:space="preserve">Read Queen Black's top-of-search conversion on the term over 7–15 Oct. At 11% or better (today's paid conversion on Queen Grey), scale to Review B's $44 a day and 17 clicks a day.</w:t>
+        <w:t xml:space="preserve">Check that the live title still carries the "silky" and "silk" wording that the 25 Aug title change removed (Review B).</w:t>
+      </w:r>
+    </w:p>
+    <w:p>
+      <w:pPr>
+        <w:pStyle w:val="ListParagraph"/>
+        <w:numPr>
+          <w:ilvl w:val="1"/>
+          <w:numId w:val="2"/>
+        </w:numPr>
+      </w:pPr>
+      <w:r>
+        <w:t xml:space="preserve">Read Queen Black's top-of-search conversion on the term over 7–15 Oct. At 11% or better (Review B's paid conversion for the term), scale to Review B's $44 a day and 17 clicks a day.</w:t>
       </w:r>
     </w:p>
     <w:p>
@@ -13139,10 +13441,10 @@
         </w:tblBorders>
       </w:tblPr>
       <w:tblGrid>
-        <w:gridCol w:w="1002"/>
-        <w:gridCol w:w="2005"/>
-        <w:gridCol w:w="5014"/>
-        <w:gridCol w:w="6019"/>
+        <w:gridCol w:w="1127"/>
+        <w:gridCol w:w="2254"/>
+        <w:gridCol w:w="3894"/>
+        <w:gridCol w:w="6765"/>
       </w:tblGrid>
       <w:tr>
         <w:trPr>
@@ -13150,7 +13452,7 @@
         </w:trPr>
         <w:tc>
           <w:tcPr>
-            <w:tcW w:type="dxa" w:w="1002"/>
+            <w:tcW w:type="dxa" w:w="1127"/>
             <w:tcBorders>
               <w:top w:val="single" w:color="BFBFBF" w:sz="4"/>
               <w:left w:val="single" w:color="BFBFBF" w:sz="4"/>
@@ -13180,7 +13482,7 @@
         </w:tc>
         <w:tc>
           <w:tcPr>
-            <w:tcW w:type="dxa" w:w="2005"/>
+            <w:tcW w:type="dxa" w:w="2254"/>
             <w:tcBorders>
               <w:top w:val="single" w:color="BFBFBF" w:sz="4"/>
               <w:left w:val="single" w:color="BFBFBF" w:sz="4"/>
@@ -13210,7 +13512,7 @@
         </w:tc>
         <w:tc>
           <w:tcPr>
-            <w:tcW w:type="dxa" w:w="5014"/>
+            <w:tcW w:type="dxa" w:w="3894"/>
             <w:tcBorders>
               <w:top w:val="single" w:color="BFBFBF" w:sz="4"/>
               <w:left w:val="single" w:color="BFBFBF" w:sz="4"/>
@@ -13240,7 +13542,7 @@
         </w:tc>
         <w:tc>
           <w:tcPr>
-            <w:tcW w:type="dxa" w:w="6019"/>
+            <w:tcW w:type="dxa" w:w="6765"/>
             <w:tcBorders>
               <w:top w:val="single" w:color="BFBFBF" w:sz="4"/>
               <w:left w:val="single" w:color="BFBFBF" w:sz="4"/>
@@ -13275,7 +13577,7 @@
         </w:trPr>
         <w:tc>
           <w:tcPr>
-            <w:tcW w:type="dxa" w:w="1002"/>
+            <w:tcW w:type="dxa" w:w="1127"/>
             <w:tcBorders>
               <w:top w:val="single" w:color="BFBFBF" w:sz="4"/>
               <w:left w:val="single" w:color="BFBFBF" w:sz="4"/>
@@ -13301,7 +13603,7 @@
         </w:tc>
         <w:tc>
           <w:tcPr>
-            <w:tcW w:type="dxa" w:w="2005"/>
+            <w:tcW w:type="dxa" w:w="2254"/>
             <w:tcBorders>
               <w:top w:val="single" w:color="BFBFBF" w:sz="4"/>
               <w:left w:val="single" w:color="BFBFBF" w:sz="4"/>
@@ -13327,53 +13629,53 @@
         </w:tc>
         <w:tc>
           <w:tcPr>
-            <w:tcW w:type="dxa" w:w="5014"/>
-            <w:tcBorders>
-              <w:top w:val="single" w:color="BFBFBF" w:sz="4"/>
-              <w:left w:val="single" w:color="BFBFBF" w:sz="4"/>
-              <w:bottom w:val="single" w:color="BFBFBF" w:sz="4"/>
-              <w:right w:val="single" w:color="BFBFBF" w:sz="4"/>
-            </w:tcBorders>
-            <w:tcMar>
-              <w:top w:type="dxa" w:w="60"/>
-              <w:left w:type="dxa" w:w="90"/>
-              <w:bottom w:type="dxa" w:w="60"/>
-              <w:right w:type="dxa" w:w="90"/>
-            </w:tcMar>
-          </w:tcPr>
-          <w:p>
-            <w:r>
-              <w:rPr>
-                <w:sz w:val="17"/>
-                <w:szCs w:val="17"/>
-              </w:rPr>
-              <w:t xml:space="preserve">Queen Grey, then Stone Grey (maintain level only)</w:t>
-            </w:r>
-          </w:p>
-        </w:tc>
-        <w:tc>
-          <w:tcPr>
-            <w:tcW w:type="dxa" w:w="6019"/>
-            <w:tcBorders>
-              <w:top w:val="single" w:color="BFBFBF" w:sz="4"/>
-              <w:left w:val="single" w:color="BFBFBF" w:sz="4"/>
-              <w:bottom w:val="single" w:color="BFBFBF" w:sz="4"/>
-              <w:right w:val="single" w:color="BFBFBF" w:sz="4"/>
-            </w:tcBorders>
-            <w:tcMar>
-              <w:top w:type="dxa" w:w="60"/>
-              <w:left w:type="dxa" w:w="90"/>
-              <w:bottom w:type="dxa" w:w="60"/>
-              <w:right w:type="dxa" w:w="90"/>
-            </w:tcMar>
-          </w:tcPr>
-          <w:p>
-            <w:r>
-              <w:rPr>
-                <w:sz w:val="17"/>
-                <w:szCs w:val="17"/>
-              </w:rPr>
-              <w:t xml:space="preserve">Both reviews. Switch when Queen Black drops under 14 days; switch back at 30.</w:t>
+            <w:tcW w:type="dxa" w:w="3894"/>
+            <w:tcBorders>
+              <w:top w:val="single" w:color="BFBFBF" w:sz="4"/>
+              <w:left w:val="single" w:color="BFBFBF" w:sz="4"/>
+              <w:bottom w:val="single" w:color="BFBFBF" w:sz="4"/>
+              <w:right w:val="single" w:color="BFBFBF" w:sz="4"/>
+            </w:tcBorders>
+            <w:tcMar>
+              <w:top w:type="dxa" w:w="60"/>
+              <w:left w:type="dxa" w:w="90"/>
+              <w:bottom w:type="dxa" w:w="60"/>
+              <w:right w:type="dxa" w:w="90"/>
+            </w:tcMar>
+          </w:tcPr>
+          <w:p>
+            <w:r>
+              <w:rPr>
+                <w:sz w:val="17"/>
+                <w:szCs w:val="17"/>
+              </w:rPr>
+              <w:t xml:space="preserve">Queen Grey (maintain level only)</w:t>
+            </w:r>
+          </w:p>
+        </w:tc>
+        <w:tc>
+          <w:tcPr>
+            <w:tcW w:type="dxa" w:w="6765"/>
+            <w:tcBorders>
+              <w:top w:val="single" w:color="BFBFBF" w:sz="4"/>
+              <w:left w:val="single" w:color="BFBFBF" w:sz="4"/>
+              <w:bottom w:val="single" w:color="BFBFBF" w:sz="4"/>
+              <w:right w:val="single" w:color="BFBFBF" w:sz="4"/>
+            </w:tcBorders>
+            <w:tcMar>
+              <w:top w:type="dxa" w:w="60"/>
+              <w:left w:type="dxa" w:w="90"/>
+              <w:bottom w:type="dxa" w:w="60"/>
+              <w:right w:type="dxa" w:w="90"/>
+            </w:tcMar>
+          </w:tcPr>
+          <w:p>
+            <w:r>
+              <w:rPr>
+                <w:sz w:val="17"/>
+                <w:szCs w:val="17"/>
+              </w:rPr>
+              <w:t xml:space="preserve">Both reviews. Switch when Queen Black drops under 14 days; switch back at 30. Stone Grey, Review B's second back-up, is only a back-up once it passes the conversion test that Queen Grey passes (4.8% on 21 clicks today).</w:t>
             </w:r>
           </w:p>
         </w:tc>
@@ -13384,7 +13686,7 @@
         </w:trPr>
         <w:tc>
           <w:tcPr>
-            <w:tcW w:type="dxa" w:w="1002"/>
+            <w:tcW w:type="dxa" w:w="1127"/>
             <w:tcBorders>
               <w:top w:val="single" w:color="BFBFBF" w:sz="4"/>
               <w:left w:val="single" w:color="BFBFBF" w:sz="4"/>
@@ -13410,7 +13712,7 @@
         </w:tc>
         <w:tc>
           <w:tcPr>
-            <w:tcW w:type="dxa" w:w="2005"/>
+            <w:tcW w:type="dxa" w:w="2254"/>
             <w:tcBorders>
               <w:top w:val="single" w:color="BFBFBF" w:sz="4"/>
               <w:left w:val="single" w:color="BFBFBF" w:sz="4"/>
@@ -13436,7 +13738,7 @@
         </w:tc>
         <w:tc>
           <w:tcPr>
-            <w:tcW w:type="dxa" w:w="5014"/>
+            <w:tcW w:type="dxa" w:w="3894"/>
             <w:tcBorders>
               <w:top w:val="single" w:color="BFBFBF" w:sz="4"/>
               <w:left w:val="single" w:color="BFBFBF" w:sz="4"/>
@@ -13462,7 +13764,7 @@
         </w:tc>
         <w:tc>
           <w:tcPr>
-            <w:tcW w:type="dxa" w:w="6019"/>
+            <w:tcW w:type="dxa" w:w="6765"/>
             <w:tcBorders>
               <w:top w:val="single" w:color="BFBFBF" w:sz="4"/>
               <w:left w:val="single" w:color="BFBFBF" w:sz="4"/>
@@ -13493,7 +13795,7 @@
         </w:trPr>
         <w:tc>
           <w:tcPr>
-            <w:tcW w:type="dxa" w:w="1002"/>
+            <w:tcW w:type="dxa" w:w="1127"/>
             <w:tcBorders>
               <w:top w:val="single" w:color="BFBFBF" w:sz="4"/>
               <w:left w:val="single" w:color="BFBFBF" w:sz="4"/>
@@ -13519,7 +13821,7 @@
         </w:tc>
         <w:tc>
           <w:tcPr>
-            <w:tcW w:type="dxa" w:w="2005"/>
+            <w:tcW w:type="dxa" w:w="2254"/>
             <w:tcBorders>
               <w:top w:val="single" w:color="BFBFBF" w:sz="4"/>
               <w:left w:val="single" w:color="BFBFBF" w:sz="4"/>
@@ -13547,7 +13849,7 @@
         </w:tc>
         <w:tc>
           <w:tcPr>
-            <w:tcW w:type="dxa" w:w="5014"/>
+            <w:tcW w:type="dxa" w:w="3894"/>
             <w:tcBorders>
               <w:top w:val="single" w:color="BFBFBF" w:sz="4"/>
               <w:left w:val="single" w:color="BFBFBF" w:sz="4"/>
@@ -13573,7 +13875,7 @@
         </w:tc>
         <w:tc>
           <w:tcPr>
-            <w:tcW w:type="dxa" w:w="6019"/>
+            <w:tcW w:type="dxa" w:w="6765"/>
             <w:tcBorders>
               <w:top w:val="single" w:color="BFBFBF" w:sz="4"/>
               <w:left w:val="single" w:color="BFBFBF" w:sz="4"/>
@@ -13604,7 +13906,7 @@
         </w:trPr>
         <w:tc>
           <w:tcPr>
-            <w:tcW w:type="dxa" w:w="1002"/>
+            <w:tcW w:type="dxa" w:w="1127"/>
             <w:tcBorders>
               <w:top w:val="single" w:color="BFBFBF" w:sz="4"/>
               <w:left w:val="single" w:color="BFBFBF" w:sz="4"/>
@@ -13630,7 +13932,7 @@
         </w:tc>
         <w:tc>
           <w:tcPr>
-            <w:tcW w:type="dxa" w:w="2005"/>
+            <w:tcW w:type="dxa" w:w="2254"/>
             <w:tcBorders>
               <w:top w:val="single" w:color="BFBFBF" w:sz="4"/>
               <w:left w:val="single" w:color="BFBFBF" w:sz="4"/>
@@ -13656,7 +13958,7 @@
         </w:tc>
         <w:tc>
           <w:tcPr>
-            <w:tcW w:type="dxa" w:w="5014"/>
+            <w:tcW w:type="dxa" w:w="3894"/>
             <w:tcBorders>
               <w:top w:val="single" w:color="BFBFBF" w:sz="4"/>
               <w:left w:val="single" w:color="BFBFBF" w:sz="4"/>
@@ -13682,7 +13984,7 @@
         </w:tc>
         <w:tc>
           <w:tcPr>
-            <w:tcW w:type="dxa" w:w="6019"/>
+            <w:tcW w:type="dxa" w:w="6765"/>
             <w:tcBorders>
               <w:top w:val="single" w:color="BFBFBF" w:sz="4"/>
               <w:left w:val="single" w:color="BFBFBF" w:sz="4"/>
@@ -13711,21 +14013,14 @@
     <w:p/>
     <w:p>
       <w:pPr>
-        <w:pStyle w:val="ListParagraph"/>
-        <w:numPr>
-          <w:ilvl w:val="0"/>
-          <w:numId w:val="2"/>
-        </w:numPr>
+        <w:spacing w:after="120"/>
       </w:pPr>
       <w:r>
         <w:rPr>
           <w:b/>
           <w:bCs/>
         </w:rPr>
-        <w:t xml:space="preserve">Colour-named terms</w:t>
-      </w:r>
-      <w:r>
-        <w:t xml:space="preserve"> advertise their own colour. The LTSF colours take their colour searches (grey → Queen Grey, green → Full Dark Green; Review B).</w:t>
+        <w:t xml:space="preserve">The rule for colour switches, applied to all ten audit rows that change size:</w:t>
       </w:r>
     </w:p>
     <w:p>
@@ -13741,10 +14036,10 @@
           <w:b/>
           <w:bCs/>
         </w:rPr>
-        <w:t xml:space="preserve">Before they run out</w:t>
-      </w:r>
-      <w:r>
-        <w:t xml:space="preserve"> (Review A): move the "red satin sheet(s)" terms from Queen Red (34 units, out about 10 Oct) to King Red, and the Queen Dark Green campaigns (6 units, out about 2 Oct) to King or Full Dark Green.</w:t>
+        <w:t xml:space="preserve">A size-named term always advertises its named size</w:t>
+      </w:r>
+      <w:r>
+        <w:t xml:space="preserve"> (in that size's ranking colour, or its own colour if the term names one).</w:t>
       </w:r>
     </w:p>
     <w:p>
@@ -13760,10 +14055,1053 @@
           <w:b/>
           <w:bCs/>
         </w:rPr>
-        <w:t xml:space="preserve">No switch may change the size.</w:t>
-      </w:r>
-      <w:r>
-        <w:t xml:space="preserve"> Reject row 1938 ("grey satin king sheet set" to Queen Grey), which Review B accepts for LTSF.</w:t>
+        <w:t xml:space="preserve">A colour-named term with no size</w:t>
+      </w:r>
+      <w:r>
+        <w:t xml:space="preserve"> advertises the colour it names, in that colour's best-selling size with at least 30 days of cover. It may change size when that runs out.</w:t>
+      </w:r>
+    </w:p>
+    <w:p>
+      <w:pPr>
+        <w:pStyle w:val="ListParagraph"/>
+        <w:numPr>
+          <w:ilvl w:val="0"/>
+          <w:numId w:val="2"/>
+        </w:numPr>
+      </w:pPr>
+      <w:r>
+        <w:rPr>
+          <w:b/>
+          <w:bCs/>
+        </w:rPr>
+        <w:t xml:space="preserve">Otherwise, no switch.</w:t>
+      </w:r>
+      <w:r>
+        <w:t xml:space="preserve"> LTSF colours take the searches for their own colour (grey → Queen Grey, green → Full Dark Green; Review B).</w:t>
+      </w:r>
+    </w:p>
+    <w:tbl>
+      <w:tblPr>
+        <w:tblW w:type="dxa" w:w="14040"/>
+        <w:tblBorders>
+          <w:top w:val="single" w:color="auto" w:sz="4"/>
+          <w:left w:val="single" w:color="auto" w:sz="4"/>
+          <w:bottom w:val="single" w:color="auto" w:sz="4"/>
+          <w:right w:val="single" w:color="auto" w:sz="4"/>
+          <w:insideH w:val="single" w:color="auto" w:sz="4"/>
+          <w:insideV w:val="single" w:color="auto" w:sz="4"/>
+        </w:tblBorders>
+      </w:tblPr>
+      <w:tblGrid>
+        <w:gridCol w:w="1325"/>
+        <w:gridCol w:w="2832"/>
+        <w:gridCol w:w="2410"/>
+        <w:gridCol w:w="3494"/>
+        <w:gridCol w:w="3979"/>
+      </w:tblGrid>
+      <w:tr>
+        <w:trPr>
+          <w:tblHeader/>
+        </w:trPr>
+        <w:tc>
+          <w:tcPr>
+            <w:tcW w:type="dxa" w:w="1325"/>
+            <w:tcBorders>
+              <w:top w:val="single" w:color="BFBFBF" w:sz="4"/>
+              <w:left w:val="single" w:color="BFBFBF" w:sz="4"/>
+              <w:bottom w:val="single" w:color="BFBFBF" w:sz="4"/>
+              <w:right w:val="single" w:color="BFBFBF" w:sz="4"/>
+            </w:tcBorders>
+            <w:shd w:fill="1F3864" w:color="auto" w:val="clear"/>
+            <w:tcMar>
+              <w:top w:type="dxa" w:w="60"/>
+              <w:left w:type="dxa" w:w="90"/>
+              <w:bottom w:type="dxa" w:w="60"/>
+              <w:right w:type="dxa" w:w="90"/>
+            </w:tcMar>
+          </w:tcPr>
+          <w:p>
+            <w:r>
+              <w:rPr>
+                <w:b/>
+                <w:bCs/>
+                <w:color w:val="FFFFFF"/>
+                <w:sz w:val="17"/>
+                <w:szCs w:val="17"/>
+              </w:rPr>
+              <w:t xml:space="preserve">Audit row</w:t>
+            </w:r>
+          </w:p>
+        </w:tc>
+        <w:tc>
+          <w:tcPr>
+            <w:tcW w:type="dxa" w:w="2832"/>
+            <w:tcBorders>
+              <w:top w:val="single" w:color="BFBFBF" w:sz="4"/>
+              <w:left w:val="single" w:color="BFBFBF" w:sz="4"/>
+              <w:bottom w:val="single" w:color="BFBFBF" w:sz="4"/>
+              <w:right w:val="single" w:color="BFBFBF" w:sz="4"/>
+            </w:tcBorders>
+            <w:shd w:fill="1F3864" w:color="auto" w:val="clear"/>
+            <w:tcMar>
+              <w:top w:type="dxa" w:w="60"/>
+              <w:left w:type="dxa" w:w="90"/>
+              <w:bottom w:type="dxa" w:w="60"/>
+              <w:right w:type="dxa" w:w="90"/>
+            </w:tcMar>
+          </w:tcPr>
+          <w:p>
+            <w:r>
+              <w:rPr>
+                <w:b/>
+                <w:bCs/>
+                <w:color w:val="FFFFFF"/>
+                <w:sz w:val="17"/>
+                <w:szCs w:val="17"/>
+              </w:rPr>
+              <w:t xml:space="preserve">Term</w:t>
+            </w:r>
+          </w:p>
+        </w:tc>
+        <w:tc>
+          <w:tcPr>
+            <w:tcW w:type="dxa" w:w="2410"/>
+            <w:tcBorders>
+              <w:top w:val="single" w:color="BFBFBF" w:sz="4"/>
+              <w:left w:val="single" w:color="BFBFBF" w:sz="4"/>
+              <w:bottom w:val="single" w:color="BFBFBF" w:sz="4"/>
+              <w:right w:val="single" w:color="BFBFBF" w:sz="4"/>
+            </w:tcBorders>
+            <w:shd w:fill="1F3864" w:color="auto" w:val="clear"/>
+            <w:tcMar>
+              <w:top w:type="dxa" w:w="60"/>
+              <w:left w:type="dxa" w:w="90"/>
+              <w:bottom w:type="dxa" w:w="60"/>
+              <w:right w:type="dxa" w:w="90"/>
+            </w:tcMar>
+          </w:tcPr>
+          <w:p>
+            <w:r>
+              <w:rPr>
+                <w:b/>
+                <w:bCs/>
+                <w:color w:val="FFFFFF"/>
+                <w:sz w:val="17"/>
+                <w:szCs w:val="17"/>
+              </w:rPr>
+              <w:t xml:space="preserve">Audit move</w:t>
+            </w:r>
+          </w:p>
+        </w:tc>
+        <w:tc>
+          <w:tcPr>
+            <w:tcW w:type="dxa" w:w="3494"/>
+            <w:tcBorders>
+              <w:top w:val="single" w:color="BFBFBF" w:sz="4"/>
+              <w:left w:val="single" w:color="BFBFBF" w:sz="4"/>
+              <w:bottom w:val="single" w:color="BFBFBF" w:sz="4"/>
+              <w:right w:val="single" w:color="BFBFBF" w:sz="4"/>
+            </w:tcBorders>
+            <w:shd w:fill="1F3864" w:color="auto" w:val="clear"/>
+            <w:tcMar>
+              <w:top w:type="dxa" w:w="60"/>
+              <w:left w:type="dxa" w:w="90"/>
+              <w:bottom w:type="dxa" w:w="60"/>
+              <w:right w:type="dxa" w:w="90"/>
+            </w:tcMar>
+          </w:tcPr>
+          <w:p>
+            <w:r>
+              <w:rPr>
+                <w:b/>
+                <w:bCs/>
+                <w:color w:val="FFFFFF"/>
+                <w:sz w:val="17"/>
+                <w:szCs w:val="17"/>
+              </w:rPr>
+              <w:t xml:space="preserve">Call</w:t>
+            </w:r>
+          </w:p>
+        </w:tc>
+        <w:tc>
+          <w:tcPr>
+            <w:tcW w:type="dxa" w:w="3979"/>
+            <w:tcBorders>
+              <w:top w:val="single" w:color="BFBFBF" w:sz="4"/>
+              <w:left w:val="single" w:color="BFBFBF" w:sz="4"/>
+              <w:bottom w:val="single" w:color="BFBFBF" w:sz="4"/>
+              <w:right w:val="single" w:color="BFBFBF" w:sz="4"/>
+            </w:tcBorders>
+            <w:shd w:fill="1F3864" w:color="auto" w:val="clear"/>
+            <w:tcMar>
+              <w:top w:type="dxa" w:w="60"/>
+              <w:left w:type="dxa" w:w="90"/>
+              <w:bottom w:type="dxa" w:w="60"/>
+              <w:right w:type="dxa" w:w="90"/>
+            </w:tcMar>
+          </w:tcPr>
+          <w:p>
+            <w:r>
+              <w:rPr>
+                <w:b/>
+                <w:bCs/>
+                <w:color w:val="FFFFFF"/>
+                <w:sz w:val="17"/>
+                <w:szCs w:val="17"/>
+              </w:rPr>
+              <w:t xml:space="preserve">Why</w:t>
+            </w:r>
+          </w:p>
+        </w:tc>
+      </w:tr>
+      <w:tr>
+        <w:trPr>
+          <w:tblHeader w:val="off"/>
+        </w:trPr>
+        <w:tc>
+          <w:tcPr>
+            <w:tcW w:type="dxa" w:w="1325"/>
+            <w:tcBorders>
+              <w:top w:val="single" w:color="BFBFBF" w:sz="4"/>
+              <w:left w:val="single" w:color="BFBFBF" w:sz="4"/>
+              <w:bottom w:val="single" w:color="BFBFBF" w:sz="4"/>
+              <w:right w:val="single" w:color="BFBFBF" w:sz="4"/>
+            </w:tcBorders>
+            <w:tcMar>
+              <w:top w:type="dxa" w:w="60"/>
+              <w:left w:type="dxa" w:w="90"/>
+              <w:bottom w:type="dxa" w:w="60"/>
+              <w:right w:type="dxa" w:w="90"/>
+            </w:tcMar>
+          </w:tcPr>
+          <w:p>
+            <w:r>
+              <w:rPr>
+                <w:sz w:val="17"/>
+                <w:szCs w:val="17"/>
+              </w:rPr>
+              <w:t xml:space="preserve">1804, 1825, 1956</w:t>
+            </w:r>
+          </w:p>
+        </w:tc>
+        <w:tc>
+          <w:tcPr>
+            <w:tcW w:type="dxa" w:w="2832"/>
+            <w:tcBorders>
+              <w:top w:val="single" w:color="BFBFBF" w:sz="4"/>
+              <w:left w:val="single" w:color="BFBFBF" w:sz="4"/>
+              <w:bottom w:val="single" w:color="BFBFBF" w:sz="4"/>
+              <w:right w:val="single" w:color="BFBFBF" w:sz="4"/>
+            </w:tcBorders>
+            <w:tcMar>
+              <w:top w:type="dxa" w:w="60"/>
+              <w:left w:type="dxa" w:w="90"/>
+              <w:bottom w:type="dxa" w:w="60"/>
+              <w:right w:type="dxa" w:w="90"/>
+            </w:tcMar>
+          </w:tcPr>
+          <w:p>
+            <w:r>
+              <w:rPr>
+                <w:sz w:val="17"/>
+                <w:szCs w:val="17"/>
+              </w:rPr>
+              <w:t xml:space="preserve">"red satin sheet(s)"</w:t>
+            </w:r>
+          </w:p>
+        </w:tc>
+        <w:tc>
+          <w:tcPr>
+            <w:tcW w:type="dxa" w:w="2410"/>
+            <w:tcBorders>
+              <w:top w:val="single" w:color="BFBFBF" w:sz="4"/>
+              <w:left w:val="single" w:color="BFBFBF" w:sz="4"/>
+              <w:bottom w:val="single" w:color="BFBFBF" w:sz="4"/>
+              <w:right w:val="single" w:color="BFBFBF" w:sz="4"/>
+            </w:tcBorders>
+            <w:tcMar>
+              <w:top w:type="dxa" w:w="60"/>
+              <w:left w:type="dxa" w:w="90"/>
+              <w:bottom w:type="dxa" w:w="60"/>
+              <w:right w:type="dxa" w:w="90"/>
+            </w:tcMar>
+          </w:tcPr>
+          <w:p>
+            <w:r>
+              <w:rPr>
+                <w:sz w:val="17"/>
+                <w:szCs w:val="17"/>
+              </w:rPr>
+              <w:t xml:space="preserve">Queen Red → King Red</w:t>
+            </w:r>
+          </w:p>
+        </w:tc>
+        <w:tc>
+          <w:tcPr>
+            <w:tcW w:type="dxa" w:w="3494"/>
+            <w:tcBorders>
+              <w:top w:val="single" w:color="BFBFBF" w:sz="4"/>
+              <w:left w:val="single" w:color="BFBFBF" w:sz="4"/>
+              <w:bottom w:val="single" w:color="BFBFBF" w:sz="4"/>
+              <w:right w:val="single" w:color="BFBFBF" w:sz="4"/>
+            </w:tcBorders>
+            <w:tcMar>
+              <w:top w:type="dxa" w:w="60"/>
+              <w:left w:type="dxa" w:w="90"/>
+              <w:bottom w:type="dxa" w:w="60"/>
+              <w:right w:type="dxa" w:w="90"/>
+            </w:tcMar>
+          </w:tcPr>
+          <w:p>
+            <w:r>
+              <w:rPr>
+                <w:b/>
+                <w:bCs/>
+                <w:sz w:val="17"/>
+                <w:szCs w:val="17"/>
+              </w:rPr>
+              <w:t xml:space="preserve">Load (audit's row)</w:t>
+            </w:r>
+          </w:p>
+        </w:tc>
+        <w:tc>
+          <w:tcPr>
+            <w:tcW w:type="dxa" w:w="3979"/>
+            <w:tcBorders>
+              <w:top w:val="single" w:color="BFBFBF" w:sz="4"/>
+              <w:left w:val="single" w:color="BFBFBF" w:sz="4"/>
+              <w:bottom w:val="single" w:color="BFBFBF" w:sz="4"/>
+              <w:right w:val="single" w:color="BFBFBF" w:sz="4"/>
+            </w:tcBorders>
+            <w:tcMar>
+              <w:top w:type="dxa" w:w="60"/>
+              <w:left w:type="dxa" w:w="90"/>
+              <w:bottom w:type="dxa" w:w="60"/>
+              <w:right w:type="dxa" w:w="90"/>
+            </w:tcMar>
+          </w:tcPr>
+          <w:p>
+            <w:r>
+              <w:rPr>
+                <w:sz w:val="17"/>
+                <w:szCs w:val="17"/>
+              </w:rPr>
+              <w:t xml:space="preserve">Colour term, no size; Queen Red has 34 units and runs out about 10 Oct; King Red has 262 plus 402 inbound</w:t>
+            </w:r>
+          </w:p>
+        </w:tc>
+      </w:tr>
+      <w:tr>
+        <w:trPr>
+          <w:tblHeader w:val="off"/>
+        </w:trPr>
+        <w:tc>
+          <w:tcPr>
+            <w:tcW w:type="dxa" w:w="1325"/>
+            <w:tcBorders>
+              <w:top w:val="single" w:color="BFBFBF" w:sz="4"/>
+              <w:left w:val="single" w:color="BFBFBF" w:sz="4"/>
+              <w:bottom w:val="single" w:color="BFBFBF" w:sz="4"/>
+              <w:right w:val="single" w:color="BFBFBF" w:sz="4"/>
+            </w:tcBorders>
+            <w:tcMar>
+              <w:top w:type="dxa" w:w="60"/>
+              <w:left w:type="dxa" w:w="90"/>
+              <w:bottom w:type="dxa" w:w="60"/>
+              <w:right w:type="dxa" w:w="90"/>
+            </w:tcMar>
+          </w:tcPr>
+          <w:p>
+            <w:r>
+              <w:rPr>
+                <w:sz w:val="17"/>
+                <w:szCs w:val="17"/>
+              </w:rPr>
+              <w:t xml:space="preserve">1837, 1921</w:t>
+            </w:r>
+          </w:p>
+        </w:tc>
+        <w:tc>
+          <w:tcPr>
+            <w:tcW w:type="dxa" w:w="2832"/>
+            <w:tcBorders>
+              <w:top w:val="single" w:color="BFBFBF" w:sz="4"/>
+              <w:left w:val="single" w:color="BFBFBF" w:sz="4"/>
+              <w:bottom w:val="single" w:color="BFBFBF" w:sz="4"/>
+              <w:right w:val="single" w:color="BFBFBF" w:sz="4"/>
+            </w:tcBorders>
+            <w:tcMar>
+              <w:top w:type="dxa" w:w="60"/>
+              <w:left w:type="dxa" w:w="90"/>
+              <w:bottom w:type="dxa" w:w="60"/>
+              <w:right w:type="dxa" w:w="90"/>
+            </w:tcMar>
+          </w:tcPr>
+          <w:p>
+            <w:r>
+              <w:rPr>
+                <w:sz w:val="17"/>
+                <w:szCs w:val="17"/>
+              </w:rPr>
+              <w:t xml:space="preserve">"green satin sheets", "green silk sheets"</w:t>
+            </w:r>
+          </w:p>
+        </w:tc>
+        <w:tc>
+          <w:tcPr>
+            <w:tcW w:type="dxa" w:w="2410"/>
+            <w:tcBorders>
+              <w:top w:val="single" w:color="BFBFBF" w:sz="4"/>
+              <w:left w:val="single" w:color="BFBFBF" w:sz="4"/>
+              <w:bottom w:val="single" w:color="BFBFBF" w:sz="4"/>
+              <w:right w:val="single" w:color="BFBFBF" w:sz="4"/>
+            </w:tcBorders>
+            <w:tcMar>
+              <w:top w:type="dxa" w:w="60"/>
+              <w:left w:type="dxa" w:w="90"/>
+              <w:bottom w:type="dxa" w:w="60"/>
+              <w:right w:type="dxa" w:w="90"/>
+            </w:tcMar>
+          </w:tcPr>
+          <w:p>
+            <w:r>
+              <w:rPr>
+                <w:sz w:val="17"/>
+                <w:szCs w:val="17"/>
+              </w:rPr>
+              <w:t xml:space="preserve">Queen Dark Green → King Sage Green</w:t>
+            </w:r>
+          </w:p>
+        </w:tc>
+        <w:tc>
+          <w:tcPr>
+            <w:tcW w:type="dxa" w:w="3494"/>
+            <w:tcBorders>
+              <w:top w:val="single" w:color="BFBFBF" w:sz="4"/>
+              <w:left w:val="single" w:color="BFBFBF" w:sz="4"/>
+              <w:bottom w:val="single" w:color="BFBFBF" w:sz="4"/>
+              <w:right w:val="single" w:color="BFBFBF" w:sz="4"/>
+            </w:tcBorders>
+            <w:tcMar>
+              <w:top w:type="dxa" w:w="60"/>
+              <w:left w:type="dxa" w:w="90"/>
+              <w:bottom w:type="dxa" w:w="60"/>
+              <w:right w:type="dxa" w:w="90"/>
+            </w:tcMar>
+          </w:tcPr>
+          <w:p>
+            <w:r>
+              <w:rPr>
+                <w:b/>
+                <w:bCs/>
+                <w:sz w:val="17"/>
+                <w:szCs w:val="17"/>
+              </w:rPr>
+              <w:t xml:space="preserve">Switch kept, colour corrected</w:t>
+            </w:r>
+            <w:r>
+              <w:rPr>
+                <w:sz w:val="17"/>
+                <w:szCs w:val="17"/>
+              </w:rPr>
+              <w:t xml:space="preserve"> to Full Dark Green</w:t>
+            </w:r>
+          </w:p>
+        </w:tc>
+        <w:tc>
+          <w:tcPr>
+            <w:tcW w:type="dxa" w:w="3979"/>
+            <w:tcBorders>
+              <w:top w:val="single" w:color="BFBFBF" w:sz="4"/>
+              <w:left w:val="single" w:color="BFBFBF" w:sz="4"/>
+              <w:bottom w:val="single" w:color="BFBFBF" w:sz="4"/>
+              <w:right w:val="single" w:color="BFBFBF" w:sz="4"/>
+            </w:tcBorders>
+            <w:tcMar>
+              <w:top w:type="dxa" w:w="60"/>
+              <w:left w:type="dxa" w:w="90"/>
+              <w:bottom w:type="dxa" w:w="60"/>
+              <w:right w:type="dxa" w:w="90"/>
+            </w:tcMar>
+          </w:tcPr>
+          <w:p>
+            <w:r>
+              <w:rPr>
+                <w:sz w:val="17"/>
+                <w:szCs w:val="17"/>
+              </w:rPr>
+              <w:t xml:space="preserve">Queen Dark Green has 6 units (out about 2 Oct); Full Dark Green is the same shade and LTSF #5</w:t>
+            </w:r>
+          </w:p>
+        </w:tc>
+      </w:tr>
+      <w:tr>
+        <w:trPr>
+          <w:tblHeader w:val="off"/>
+        </w:trPr>
+        <w:tc>
+          <w:tcPr>
+            <w:tcW w:type="dxa" w:w="1325"/>
+            <w:tcBorders>
+              <w:top w:val="single" w:color="BFBFBF" w:sz="4"/>
+              <w:left w:val="single" w:color="BFBFBF" w:sz="4"/>
+              <w:bottom w:val="single" w:color="BFBFBF" w:sz="4"/>
+              <w:right w:val="single" w:color="BFBFBF" w:sz="4"/>
+            </w:tcBorders>
+            <w:tcMar>
+              <w:top w:type="dxa" w:w="60"/>
+              <w:left w:type="dxa" w:w="90"/>
+              <w:bottom w:type="dxa" w:w="60"/>
+              <w:right w:type="dxa" w:w="90"/>
+            </w:tcMar>
+          </w:tcPr>
+          <w:p>
+            <w:r>
+              <w:rPr>
+                <w:sz w:val="17"/>
+                <w:szCs w:val="17"/>
+              </w:rPr>
+              <w:t xml:space="preserve">1842, 1877</w:t>
+            </w:r>
+          </w:p>
+        </w:tc>
+        <w:tc>
+          <w:tcPr>
+            <w:tcW w:type="dxa" w:w="2832"/>
+            <w:tcBorders>
+              <w:top w:val="single" w:color="BFBFBF" w:sz="4"/>
+              <w:left w:val="single" w:color="BFBFBF" w:sz="4"/>
+              <w:bottom w:val="single" w:color="BFBFBF" w:sz="4"/>
+              <w:right w:val="single" w:color="BFBFBF" w:sz="4"/>
+            </w:tcBorders>
+            <w:tcMar>
+              <w:top w:type="dxa" w:w="60"/>
+              <w:left w:type="dxa" w:w="90"/>
+              <w:bottom w:type="dxa" w:w="60"/>
+              <w:right w:type="dxa" w:w="90"/>
+            </w:tcMar>
+          </w:tcPr>
+          <w:p>
+            <w:r>
+              <w:rPr>
+                <w:sz w:val="17"/>
+                <w:szCs w:val="17"/>
+              </w:rPr>
+              <w:t xml:space="preserve">"blue satin sheets" (exact, phrase)</w:t>
+            </w:r>
+          </w:p>
+        </w:tc>
+        <w:tc>
+          <w:tcPr>
+            <w:tcW w:type="dxa" w:w="2410"/>
+            <w:tcBorders>
+              <w:top w:val="single" w:color="BFBFBF" w:sz="4"/>
+              <w:left w:val="single" w:color="BFBFBF" w:sz="4"/>
+              <w:bottom w:val="single" w:color="BFBFBF" w:sz="4"/>
+              <w:right w:val="single" w:color="BFBFBF" w:sz="4"/>
+            </w:tcBorders>
+            <w:tcMar>
+              <w:top w:type="dxa" w:w="60"/>
+              <w:left w:type="dxa" w:w="90"/>
+              <w:bottom w:type="dxa" w:w="60"/>
+              <w:right w:type="dxa" w:w="90"/>
+            </w:tcMar>
+          </w:tcPr>
+          <w:p>
+            <w:r>
+              <w:rPr>
+                <w:sz w:val="17"/>
+                <w:szCs w:val="17"/>
+              </w:rPr>
+              <w:t xml:space="preserve">Twin Blue → Queen Navy Blue</w:t>
+            </w:r>
+          </w:p>
+        </w:tc>
+        <w:tc>
+          <w:tcPr>
+            <w:tcW w:type="dxa" w:w="3494"/>
+            <w:tcBorders>
+              <w:top w:val="single" w:color="BFBFBF" w:sz="4"/>
+              <w:left w:val="single" w:color="BFBFBF" w:sz="4"/>
+              <w:bottom w:val="single" w:color="BFBFBF" w:sz="4"/>
+              <w:right w:val="single" w:color="BFBFBF" w:sz="4"/>
+            </w:tcBorders>
+            <w:tcMar>
+              <w:top w:type="dxa" w:w="60"/>
+              <w:left w:type="dxa" w:w="90"/>
+              <w:bottom w:type="dxa" w:w="60"/>
+              <w:right w:type="dxa" w:w="90"/>
+            </w:tcMar>
+          </w:tcPr>
+          <w:p>
+            <w:r>
+              <w:rPr>
+                <w:b/>
+                <w:bCs/>
+                <w:sz w:val="17"/>
+                <w:szCs w:val="17"/>
+              </w:rPr>
+              <w:t xml:space="preserve">Switch kept, colour corrected</w:t>
+            </w:r>
+            <w:r>
+              <w:rPr>
+                <w:sz w:val="17"/>
+                <w:szCs w:val="17"/>
+              </w:rPr>
+              <w:t xml:space="preserve"> to Queen Blue</w:t>
+            </w:r>
+          </w:p>
+        </w:tc>
+        <w:tc>
+          <w:tcPr>
+            <w:tcW w:type="dxa" w:w="3979"/>
+            <w:tcBorders>
+              <w:top w:val="single" w:color="BFBFBF" w:sz="4"/>
+              <w:left w:val="single" w:color="BFBFBF" w:sz="4"/>
+              <w:bottom w:val="single" w:color="BFBFBF" w:sz="4"/>
+              <w:right w:val="single" w:color="BFBFBF" w:sz="4"/>
+            </w:tcBorders>
+            <w:tcMar>
+              <w:top w:type="dxa" w:w="60"/>
+              <w:left w:type="dxa" w:w="90"/>
+              <w:bottom w:type="dxa" w:w="60"/>
+              <w:right w:type="dxa" w:w="90"/>
+            </w:tcMar>
+          </w:tcPr>
+          <w:p>
+            <w:r>
+              <w:rPr>
+                <w:sz w:val="17"/>
+                <w:szCs w:val="17"/>
+              </w:rPr>
+              <w:t xml:space="preserve">The colour named is Blue; Queen Blue is its best-selling size with cover (1.10 units a day, 269 days) against Twin Blue's 0.33</w:t>
+            </w:r>
+          </w:p>
+        </w:tc>
+      </w:tr>
+      <w:tr>
+        <w:trPr>
+          <w:tblHeader w:val="off"/>
+        </w:trPr>
+        <w:tc>
+          <w:tcPr>
+            <w:tcW w:type="dxa" w:w="1325"/>
+            <w:tcBorders>
+              <w:top w:val="single" w:color="BFBFBF" w:sz="4"/>
+              <w:left w:val="single" w:color="BFBFBF" w:sz="4"/>
+              <w:bottom w:val="single" w:color="BFBFBF" w:sz="4"/>
+              <w:right w:val="single" w:color="BFBFBF" w:sz="4"/>
+            </w:tcBorders>
+            <w:tcMar>
+              <w:top w:type="dxa" w:w="60"/>
+              <w:left w:type="dxa" w:w="90"/>
+              <w:bottom w:type="dxa" w:w="60"/>
+              <w:right w:type="dxa" w:w="90"/>
+            </w:tcMar>
+          </w:tcPr>
+          <w:p>
+            <w:r>
+              <w:rPr>
+                <w:sz w:val="17"/>
+                <w:szCs w:val="17"/>
+              </w:rPr>
+              <w:t xml:space="preserve">1876</w:t>
+            </w:r>
+          </w:p>
+        </w:tc>
+        <w:tc>
+          <w:tcPr>
+            <w:tcW w:type="dxa" w:w="2832"/>
+            <w:tcBorders>
+              <w:top w:val="single" w:color="BFBFBF" w:sz="4"/>
+              <w:left w:val="single" w:color="BFBFBF" w:sz="4"/>
+              <w:bottom w:val="single" w:color="BFBFBF" w:sz="4"/>
+              <w:right w:val="single" w:color="BFBFBF" w:sz="4"/>
+            </w:tcBorders>
+            <w:tcMar>
+              <w:top w:type="dxa" w:w="60"/>
+              <w:left w:type="dxa" w:w="90"/>
+              <w:bottom w:type="dxa" w:w="60"/>
+              <w:right w:type="dxa" w:w="90"/>
+            </w:tcMar>
+          </w:tcPr>
+          <w:p>
+            <w:r>
+              <w:rPr>
+                <w:sz w:val="17"/>
+                <w:szCs w:val="17"/>
+              </w:rPr>
+              <w:t xml:space="preserve">"light blue satin sheets"</w:t>
+            </w:r>
+          </w:p>
+        </w:tc>
+        <w:tc>
+          <w:tcPr>
+            <w:tcW w:type="dxa" w:w="2410"/>
+            <w:tcBorders>
+              <w:top w:val="single" w:color="BFBFBF" w:sz="4"/>
+              <w:left w:val="single" w:color="BFBFBF" w:sz="4"/>
+              <w:bottom w:val="single" w:color="BFBFBF" w:sz="4"/>
+              <w:right w:val="single" w:color="BFBFBF" w:sz="4"/>
+            </w:tcBorders>
+            <w:tcMar>
+              <w:top w:type="dxa" w:w="60"/>
+              <w:left w:type="dxa" w:w="90"/>
+              <w:bottom w:type="dxa" w:w="60"/>
+              <w:right w:type="dxa" w:w="90"/>
+            </w:tcMar>
+          </w:tcPr>
+          <w:p>
+            <w:r>
+              <w:rPr>
+                <w:sz w:val="17"/>
+                <w:szCs w:val="17"/>
+              </w:rPr>
+              <w:t xml:space="preserve">Full Baby Blue → Queen Navy Blue</w:t>
+            </w:r>
+          </w:p>
+        </w:tc>
+        <w:tc>
+          <w:tcPr>
+            <w:tcW w:type="dxa" w:w="3494"/>
+            <w:tcBorders>
+              <w:top w:val="single" w:color="BFBFBF" w:sz="4"/>
+              <w:left w:val="single" w:color="BFBFBF" w:sz="4"/>
+              <w:bottom w:val="single" w:color="BFBFBF" w:sz="4"/>
+              <w:right w:val="single" w:color="BFBFBF" w:sz="4"/>
+            </w:tcBorders>
+            <w:tcMar>
+              <w:top w:type="dxa" w:w="60"/>
+              <w:left w:type="dxa" w:w="90"/>
+              <w:bottom w:type="dxa" w:w="60"/>
+              <w:right w:type="dxa" w:w="90"/>
+            </w:tcMar>
+          </w:tcPr>
+          <w:p>
+            <w:r>
+              <w:rPr>
+                <w:b/>
+                <w:bCs/>
+                <w:sz w:val="17"/>
+                <w:szCs w:val="17"/>
+              </w:rPr>
+              <w:t xml:space="preserve">Reject</w:t>
+            </w:r>
+          </w:p>
+        </w:tc>
+        <w:tc>
+          <w:tcPr>
+            <w:tcW w:type="dxa" w:w="3979"/>
+            <w:tcBorders>
+              <w:top w:val="single" w:color="BFBFBF" w:sz="4"/>
+              <w:left w:val="single" w:color="BFBFBF" w:sz="4"/>
+              <w:bottom w:val="single" w:color="BFBFBF" w:sz="4"/>
+              <w:right w:val="single" w:color="BFBFBF" w:sz="4"/>
+            </w:tcBorders>
+            <w:tcMar>
+              <w:top w:type="dxa" w:w="60"/>
+              <w:left w:type="dxa" w:w="90"/>
+              <w:bottom w:type="dxa" w:w="60"/>
+              <w:right w:type="dxa" w:w="90"/>
+            </w:tcMar>
+          </w:tcPr>
+          <w:p>
+            <w:r>
+              <w:rPr>
+                <w:sz w:val="17"/>
+                <w:szCs w:val="17"/>
+              </w:rPr>
+              <w:t xml:space="preserve">Light blue isn't navy; Full Baby Blue is Baby Blue's best seller (1.07 a day, 135 days)</w:t>
+            </w:r>
+          </w:p>
+        </w:tc>
+      </w:tr>
+      <w:tr>
+        <w:trPr>
+          <w:tblHeader w:val="off"/>
+        </w:trPr>
+        <w:tc>
+          <w:tcPr>
+            <w:tcW w:type="dxa" w:w="1325"/>
+            <w:tcBorders>
+              <w:top w:val="single" w:color="BFBFBF" w:sz="4"/>
+              <w:left w:val="single" w:color="BFBFBF" w:sz="4"/>
+              <w:bottom w:val="single" w:color="BFBFBF" w:sz="4"/>
+              <w:right w:val="single" w:color="BFBFBF" w:sz="4"/>
+            </w:tcBorders>
+            <w:tcMar>
+              <w:top w:type="dxa" w:w="60"/>
+              <w:left w:type="dxa" w:w="90"/>
+              <w:bottom w:type="dxa" w:w="60"/>
+              <w:right w:type="dxa" w:w="90"/>
+            </w:tcMar>
+          </w:tcPr>
+          <w:p>
+            <w:r>
+              <w:rPr>
+                <w:sz w:val="17"/>
+                <w:szCs w:val="17"/>
+              </w:rPr>
+              <w:t xml:space="preserve">1924</w:t>
+            </w:r>
+          </w:p>
+        </w:tc>
+        <w:tc>
+          <w:tcPr>
+            <w:tcW w:type="dxa" w:w="2832"/>
+            <w:tcBorders>
+              <w:top w:val="single" w:color="BFBFBF" w:sz="4"/>
+              <w:left w:val="single" w:color="BFBFBF" w:sz="4"/>
+              <w:bottom w:val="single" w:color="BFBFBF" w:sz="4"/>
+              <w:right w:val="single" w:color="BFBFBF" w:sz="4"/>
+            </w:tcBorders>
+            <w:tcMar>
+              <w:top w:type="dxa" w:w="60"/>
+              <w:left w:type="dxa" w:w="90"/>
+              <w:bottom w:type="dxa" w:w="60"/>
+              <w:right w:type="dxa" w:w="90"/>
+            </w:tcMar>
+          </w:tcPr>
+          <w:p>
+            <w:r>
+              <w:rPr>
+                <w:sz w:val="17"/>
+                <w:szCs w:val="17"/>
+              </w:rPr>
+              <w:t xml:space="preserve">"double bed sheets sets satin"</w:t>
+            </w:r>
+          </w:p>
+        </w:tc>
+        <w:tc>
+          <w:tcPr>
+            <w:tcW w:type="dxa" w:w="2410"/>
+            <w:tcBorders>
+              <w:top w:val="single" w:color="BFBFBF" w:sz="4"/>
+              <w:left w:val="single" w:color="BFBFBF" w:sz="4"/>
+              <w:bottom w:val="single" w:color="BFBFBF" w:sz="4"/>
+              <w:right w:val="single" w:color="BFBFBF" w:sz="4"/>
+            </w:tcBorders>
+            <w:tcMar>
+              <w:top w:type="dxa" w:w="60"/>
+              <w:left w:type="dxa" w:w="90"/>
+              <w:bottom w:type="dxa" w:w="60"/>
+              <w:right w:type="dxa" w:w="90"/>
+            </w:tcMar>
+          </w:tcPr>
+          <w:p>
+            <w:r>
+              <w:rPr>
+                <w:sz w:val="17"/>
+                <w:szCs w:val="17"/>
+              </w:rPr>
+              <w:t xml:space="preserve">→ Full Rosewood</w:t>
+            </w:r>
+          </w:p>
+        </w:tc>
+        <w:tc>
+          <w:tcPr>
+            <w:tcW w:type="dxa" w:w="3494"/>
+            <w:tcBorders>
+              <w:top w:val="single" w:color="BFBFBF" w:sz="4"/>
+              <w:left w:val="single" w:color="BFBFBF" w:sz="4"/>
+              <w:bottom w:val="single" w:color="BFBFBF" w:sz="4"/>
+              <w:right w:val="single" w:color="BFBFBF" w:sz="4"/>
+            </w:tcBorders>
+            <w:tcMar>
+              <w:top w:type="dxa" w:w="60"/>
+              <w:left w:type="dxa" w:w="90"/>
+              <w:bottom w:type="dxa" w:w="60"/>
+              <w:right w:type="dxa" w:w="90"/>
+            </w:tcMar>
+          </w:tcPr>
+          <w:p>
+            <w:r>
+              <w:rPr>
+                <w:b/>
+                <w:bCs/>
+                <w:sz w:val="17"/>
+                <w:szCs w:val="17"/>
+              </w:rPr>
+              <w:t xml:space="preserve">Reject</w:t>
+            </w:r>
+          </w:p>
+        </w:tc>
+        <w:tc>
+          <w:tcPr>
+            <w:tcW w:type="dxa" w:w="3979"/>
+            <w:tcBorders>
+              <w:top w:val="single" w:color="BFBFBF" w:sz="4"/>
+              <w:left w:val="single" w:color="BFBFBF" w:sz="4"/>
+              <w:bottom w:val="single" w:color="BFBFBF" w:sz="4"/>
+              <w:right w:val="single" w:color="BFBFBF" w:sz="4"/>
+            </w:tcBorders>
+            <w:tcMar>
+              <w:top w:type="dxa" w:w="60"/>
+              <w:left w:type="dxa" w:w="90"/>
+              <w:bottom w:type="dxa" w:w="60"/>
+              <w:right w:type="dxa" w:w="90"/>
+            </w:tcMar>
+          </w:tcPr>
+          <w:p>
+            <w:r>
+              <w:rPr>
+                <w:sz w:val="17"/>
+                <w:szCs w:val="17"/>
+              </w:rPr>
+              <w:t xml:space="preserve">"Double" is Full size, and the campaign already advertises Full Black, the Full ranking colour</w:t>
+            </w:r>
+          </w:p>
+        </w:tc>
+      </w:tr>
+      <w:tr>
+        <w:trPr>
+          <w:tblHeader w:val="off"/>
+        </w:trPr>
+        <w:tc>
+          <w:tcPr>
+            <w:tcW w:type="dxa" w:w="1325"/>
+            <w:tcBorders>
+              <w:top w:val="single" w:color="BFBFBF" w:sz="4"/>
+              <w:left w:val="single" w:color="BFBFBF" w:sz="4"/>
+              <w:bottom w:val="single" w:color="BFBFBF" w:sz="4"/>
+              <w:right w:val="single" w:color="BFBFBF" w:sz="4"/>
+            </w:tcBorders>
+            <w:tcMar>
+              <w:top w:type="dxa" w:w="60"/>
+              <w:left w:type="dxa" w:w="90"/>
+              <w:bottom w:type="dxa" w:w="60"/>
+              <w:right w:type="dxa" w:w="90"/>
+            </w:tcMar>
+          </w:tcPr>
+          <w:p>
+            <w:r>
+              <w:rPr>
+                <w:sz w:val="17"/>
+                <w:szCs w:val="17"/>
+              </w:rPr>
+              <w:t xml:space="preserve">1938</w:t>
+            </w:r>
+          </w:p>
+        </w:tc>
+        <w:tc>
+          <w:tcPr>
+            <w:tcW w:type="dxa" w:w="2832"/>
+            <w:tcBorders>
+              <w:top w:val="single" w:color="BFBFBF" w:sz="4"/>
+              <w:left w:val="single" w:color="BFBFBF" w:sz="4"/>
+              <w:bottom w:val="single" w:color="BFBFBF" w:sz="4"/>
+              <w:right w:val="single" w:color="BFBFBF" w:sz="4"/>
+            </w:tcBorders>
+            <w:tcMar>
+              <w:top w:type="dxa" w:w="60"/>
+              <w:left w:type="dxa" w:w="90"/>
+              <w:bottom w:type="dxa" w:w="60"/>
+              <w:right w:type="dxa" w:w="90"/>
+            </w:tcMar>
+          </w:tcPr>
+          <w:p>
+            <w:r>
+              <w:rPr>
+                <w:sz w:val="17"/>
+                <w:szCs w:val="17"/>
+              </w:rPr>
+              <w:t xml:space="preserve">"grey satin king sheet set"</w:t>
+            </w:r>
+          </w:p>
+        </w:tc>
+        <w:tc>
+          <w:tcPr>
+            <w:tcW w:type="dxa" w:w="2410"/>
+            <w:tcBorders>
+              <w:top w:val="single" w:color="BFBFBF" w:sz="4"/>
+              <w:left w:val="single" w:color="BFBFBF" w:sz="4"/>
+              <w:bottom w:val="single" w:color="BFBFBF" w:sz="4"/>
+              <w:right w:val="single" w:color="BFBFBF" w:sz="4"/>
+            </w:tcBorders>
+            <w:tcMar>
+              <w:top w:type="dxa" w:w="60"/>
+              <w:left w:type="dxa" w:w="90"/>
+              <w:bottom w:type="dxa" w:w="60"/>
+              <w:right w:type="dxa" w:w="90"/>
+            </w:tcMar>
+          </w:tcPr>
+          <w:p>
+            <w:r>
+              <w:rPr>
+                <w:sz w:val="17"/>
+                <w:szCs w:val="17"/>
+              </w:rPr>
+              <w:t xml:space="preserve">→ Queen Grey</w:t>
+            </w:r>
+          </w:p>
+        </w:tc>
+        <w:tc>
+          <w:tcPr>
+            <w:tcW w:type="dxa" w:w="3494"/>
+            <w:tcBorders>
+              <w:top w:val="single" w:color="BFBFBF" w:sz="4"/>
+              <w:left w:val="single" w:color="BFBFBF" w:sz="4"/>
+              <w:bottom w:val="single" w:color="BFBFBF" w:sz="4"/>
+              <w:right w:val="single" w:color="BFBFBF" w:sz="4"/>
+            </w:tcBorders>
+            <w:tcMar>
+              <w:top w:type="dxa" w:w="60"/>
+              <w:left w:type="dxa" w:w="90"/>
+              <w:bottom w:type="dxa" w:w="60"/>
+              <w:right w:type="dxa" w:w="90"/>
+            </w:tcMar>
+          </w:tcPr>
+          <w:p>
+            <w:r>
+              <w:rPr>
+                <w:b/>
+                <w:bCs/>
+                <w:sz w:val="17"/>
+                <w:szCs w:val="17"/>
+              </w:rPr>
+              <w:t xml:space="preserve">Change to King Grey</w:t>
+            </w:r>
+          </w:p>
+        </w:tc>
+        <w:tc>
+          <w:tcPr>
+            <w:tcW w:type="dxa" w:w="3979"/>
+            <w:tcBorders>
+              <w:top w:val="single" w:color="BFBFBF" w:sz="4"/>
+              <w:left w:val="single" w:color="BFBFBF" w:sz="4"/>
+              <w:bottom w:val="single" w:color="BFBFBF" w:sz="4"/>
+              <w:right w:val="single" w:color="BFBFBF" w:sz="4"/>
+            </w:tcBorders>
+            <w:tcMar>
+              <w:top w:type="dxa" w:w="60"/>
+              <w:left w:type="dxa" w:w="90"/>
+              <w:bottom w:type="dxa" w:w="60"/>
+              <w:right w:type="dxa" w:w="90"/>
+            </w:tcMar>
+          </w:tcPr>
+          <w:p>
+            <w:r>
+              <w:rPr>
+                <w:sz w:val="17"/>
+                <w:szCs w:val="17"/>
+              </w:rPr>
+              <w:t xml:space="preserve">Size-named: it advertises Queen Black today, the wrong size already; the rule puts it on King Grey, not Queen Grey</w:t>
+            </w:r>
+          </w:p>
+        </w:tc>
+      </w:tr>
+    </w:tbl>
+    <w:p/>
+    <w:p>
+      <w:pPr>
+        <w:spacing w:after="120"/>
+      </w:pPr>
+      <w:r>
+        <w:rPr>
+          <w:i/>
+          <w:iCs/>
+        </w:rPr>
+        <w:t xml:space="preserve">Stock and pace: Sellerboard, 29 Sep and 30 Aug–29 Sep. Each switch is a manual product-ad change.</w:t>
       </w:r>
     </w:p>
     <w:p>
@@ -14895,10 +16233,850 @@
           <w:b/>
           <w:bCs/>
         </w:rPr>
-        <w:t xml:space="preserve">When Queen Grey is about two weeks from clearing</w:t>
-      </w:r>
-      <w:r>
-        <w:t xml:space="preserve"> (about 5 Dec), move its campaigns to Queen Stone Grey (LTSF #2, about 235 aged units).</w:t>
+        <w:t xml:space="preserve">Why Queen Grey passes where Stone Grey fails.</w:t>
+      </w:r>
+      <w:r>
+        <w:t xml:space="preserve"> Both reviews reject Stone Grey for the ranking terms on conversion (4.8% on 21 clicks). The same test on Queen Grey, 90 days of paid data:</w:t>
+      </w:r>
+    </w:p>
+    <w:tbl>
+      <w:tblPr>
+        <w:tblW w:type="dxa" w:w="14040"/>
+        <w:tblBorders>
+          <w:top w:val="single" w:color="auto" w:sz="4"/>
+          <w:left w:val="single" w:color="auto" w:sz="4"/>
+          <w:bottom w:val="single" w:color="auto" w:sz="4"/>
+          <w:right w:val="single" w:color="auto" w:sz="4"/>
+          <w:insideH w:val="single" w:color="auto" w:sz="4"/>
+          <w:insideV w:val="single" w:color="auto" w:sz="4"/>
+        </w:tblBorders>
+      </w:tblPr>
+      <w:tblGrid>
+        <w:gridCol w:w="1816"/>
+        <w:gridCol w:w="1404"/>
+        <w:gridCol w:w="1569"/>
+        <w:gridCol w:w="1321"/>
+        <w:gridCol w:w="2477"/>
+        <w:gridCol w:w="3468"/>
+        <w:gridCol w:w="1985"/>
+      </w:tblGrid>
+      <w:tr>
+        <w:trPr>
+          <w:tblHeader/>
+        </w:trPr>
+        <w:tc>
+          <w:tcPr>
+            <w:tcW w:type="dxa" w:w="1816"/>
+            <w:tcBorders>
+              <w:top w:val="single" w:color="BFBFBF" w:sz="4"/>
+              <w:left w:val="single" w:color="BFBFBF" w:sz="4"/>
+              <w:bottom w:val="single" w:color="BFBFBF" w:sz="4"/>
+              <w:right w:val="single" w:color="BFBFBF" w:sz="4"/>
+            </w:tcBorders>
+            <w:shd w:fill="1F3864" w:color="auto" w:val="clear"/>
+            <w:tcMar>
+              <w:top w:type="dxa" w:w="60"/>
+              <w:left w:type="dxa" w:w="90"/>
+              <w:bottom w:type="dxa" w:w="60"/>
+              <w:right w:type="dxa" w:w="90"/>
+            </w:tcMar>
+          </w:tcPr>
+          <w:p>
+            <w:r>
+              <w:rPr>
+                <w:b/>
+                <w:bCs/>
+                <w:color w:val="FFFFFF"/>
+                <w:sz w:val="17"/>
+                <w:szCs w:val="17"/>
+              </w:rPr>
+              <w:t xml:space="preserve">Colour</w:t>
+            </w:r>
+          </w:p>
+        </w:tc>
+        <w:tc>
+          <w:tcPr>
+            <w:tcW w:type="dxa" w:w="1404"/>
+            <w:tcBorders>
+              <w:top w:val="single" w:color="BFBFBF" w:sz="4"/>
+              <w:left w:val="single" w:color="BFBFBF" w:sz="4"/>
+              <w:bottom w:val="single" w:color="BFBFBF" w:sz="4"/>
+              <w:right w:val="single" w:color="BFBFBF" w:sz="4"/>
+            </w:tcBorders>
+            <w:shd w:fill="1F3864" w:color="auto" w:val="clear"/>
+            <w:tcMar>
+              <w:top w:type="dxa" w:w="60"/>
+              <w:left w:type="dxa" w:w="90"/>
+              <w:bottom w:type="dxa" w:w="60"/>
+              <w:right w:type="dxa" w:w="90"/>
+            </w:tcMar>
+          </w:tcPr>
+          <w:p>
+            <w:r>
+              <w:rPr>
+                <w:b/>
+                <w:bCs/>
+                <w:color w:val="FFFFFF"/>
+                <w:sz w:val="17"/>
+                <w:szCs w:val="17"/>
+              </w:rPr>
+              <w:t xml:space="preserve">Paid clicks</w:t>
+            </w:r>
+          </w:p>
+        </w:tc>
+        <w:tc>
+          <w:tcPr>
+            <w:tcW w:type="dxa" w:w="1569"/>
+            <w:tcBorders>
+              <w:top w:val="single" w:color="BFBFBF" w:sz="4"/>
+              <w:left w:val="single" w:color="BFBFBF" w:sz="4"/>
+              <w:bottom w:val="single" w:color="BFBFBF" w:sz="4"/>
+              <w:right w:val="single" w:color="BFBFBF" w:sz="4"/>
+            </w:tcBorders>
+            <w:shd w:fill="1F3864" w:color="auto" w:val="clear"/>
+            <w:tcMar>
+              <w:top w:type="dxa" w:w="60"/>
+              <w:left w:type="dxa" w:w="90"/>
+              <w:bottom w:type="dxa" w:w="60"/>
+              <w:right w:type="dxa" w:w="90"/>
+            </w:tcMar>
+          </w:tcPr>
+          <w:p>
+            <w:r>
+              <w:rPr>
+                <w:b/>
+                <w:bCs/>
+                <w:color w:val="FFFFFF"/>
+                <w:sz w:val="17"/>
+                <w:szCs w:val="17"/>
+              </w:rPr>
+              <w:t xml:space="preserve">Click-through</w:t>
+            </w:r>
+          </w:p>
+        </w:tc>
+        <w:tc>
+          <w:tcPr>
+            <w:tcW w:type="dxa" w:w="1321"/>
+            <w:tcBorders>
+              <w:top w:val="single" w:color="BFBFBF" w:sz="4"/>
+              <w:left w:val="single" w:color="BFBFBF" w:sz="4"/>
+              <w:bottom w:val="single" w:color="BFBFBF" w:sz="4"/>
+              <w:right w:val="single" w:color="BFBFBF" w:sz="4"/>
+            </w:tcBorders>
+            <w:shd w:fill="1F3864" w:color="auto" w:val="clear"/>
+            <w:tcMar>
+              <w:top w:type="dxa" w:w="60"/>
+              <w:left w:type="dxa" w:w="90"/>
+              <w:bottom w:type="dxa" w:w="60"/>
+              <w:right w:type="dxa" w:w="90"/>
+            </w:tcMar>
+          </w:tcPr>
+          <w:p>
+            <w:r>
+              <w:rPr>
+                <w:b/>
+                <w:bCs/>
+                <w:color w:val="FFFFFF"/>
+                <w:sz w:val="17"/>
+                <w:szCs w:val="17"/>
+              </w:rPr>
+              <w:t xml:space="preserve">Conversion</w:t>
+            </w:r>
+          </w:p>
+        </w:tc>
+        <w:tc>
+          <w:tcPr>
+            <w:tcW w:type="dxa" w:w="2477"/>
+            <w:tcBorders>
+              <w:top w:val="single" w:color="BFBFBF" w:sz="4"/>
+              <w:left w:val="single" w:color="BFBFBF" w:sz="4"/>
+              <w:bottom w:val="single" w:color="BFBFBF" w:sz="4"/>
+              <w:right w:val="single" w:color="BFBFBF" w:sz="4"/>
+            </w:tcBorders>
+            <w:shd w:fill="1F3864" w:color="auto" w:val="clear"/>
+            <w:tcMar>
+              <w:top w:type="dxa" w:w="60"/>
+              <w:left w:type="dxa" w:w="90"/>
+              <w:bottom w:type="dxa" w:w="60"/>
+              <w:right w:type="dxa" w:w="90"/>
+            </w:tcMar>
+          </w:tcPr>
+          <w:p>
+            <w:r>
+              <w:rPr>
+                <w:b/>
+                <w:bCs/>
+                <w:color w:val="FFFFFF"/>
+                <w:sz w:val="17"/>
+                <w:szCs w:val="17"/>
+              </w:rPr>
+              <w:t xml:space="preserve">Profit a unit before ads</w:t>
+            </w:r>
+          </w:p>
+        </w:tc>
+        <w:tc>
+          <w:tcPr>
+            <w:tcW w:type="dxa" w:w="3468"/>
+            <w:tcBorders>
+              <w:top w:val="single" w:color="BFBFBF" w:sz="4"/>
+              <w:left w:val="single" w:color="BFBFBF" w:sz="4"/>
+              <w:bottom w:val="single" w:color="BFBFBF" w:sz="4"/>
+              <w:right w:val="single" w:color="BFBFBF" w:sz="4"/>
+            </w:tcBorders>
+            <w:shd w:fill="1F3864" w:color="auto" w:val="clear"/>
+            <w:tcMar>
+              <w:top w:type="dxa" w:w="60"/>
+              <w:left w:type="dxa" w:w="90"/>
+              <w:bottom w:type="dxa" w:w="60"/>
+              <w:right w:type="dxa" w:w="90"/>
+            </w:tcMar>
+          </w:tcPr>
+          <w:p>
+            <w:r>
+              <w:rPr>
+                <w:b/>
+                <w:bCs/>
+                <w:color w:val="FFFFFF"/>
+                <w:sz w:val="17"/>
+                <w:szCs w:val="17"/>
+              </w:rPr>
+              <w:t xml:space="preserve">Storage and surcharge avoided a unit</w:t>
+            </w:r>
+          </w:p>
+        </w:tc>
+        <w:tc>
+          <w:tcPr>
+            <w:tcW w:type="dxa" w:w="1985"/>
+            <w:tcBorders>
+              <w:top w:val="single" w:color="BFBFBF" w:sz="4"/>
+              <w:left w:val="single" w:color="BFBFBF" w:sz="4"/>
+              <w:bottom w:val="single" w:color="BFBFBF" w:sz="4"/>
+              <w:right w:val="single" w:color="BFBFBF" w:sz="4"/>
+            </w:tcBorders>
+            <w:shd w:fill="1F3864" w:color="auto" w:val="clear"/>
+            <w:tcMar>
+              <w:top w:type="dxa" w:w="60"/>
+              <w:left w:type="dxa" w:w="90"/>
+              <w:bottom w:type="dxa" w:w="60"/>
+              <w:right w:type="dxa" w:w="90"/>
+            </w:tcMar>
+          </w:tcPr>
+          <w:p>
+            <w:r>
+              <w:rPr>
+                <w:b/>
+                <w:bCs/>
+                <w:color w:val="FFFFFF"/>
+                <w:sz w:val="17"/>
+                <w:szCs w:val="17"/>
+              </w:rPr>
+              <w:t xml:space="preserve">Value a paid click</w:t>
+            </w:r>
+          </w:p>
+        </w:tc>
+      </w:tr>
+      <w:tr>
+        <w:trPr>
+          <w:tblHeader w:val="off"/>
+        </w:trPr>
+        <w:tc>
+          <w:tcPr>
+            <w:tcW w:type="dxa" w:w="1816"/>
+            <w:tcBorders>
+              <w:top w:val="single" w:color="BFBFBF" w:sz="4"/>
+              <w:left w:val="single" w:color="BFBFBF" w:sz="4"/>
+              <w:bottom w:val="single" w:color="BFBFBF" w:sz="4"/>
+              <w:right w:val="single" w:color="BFBFBF" w:sz="4"/>
+            </w:tcBorders>
+            <w:tcMar>
+              <w:top w:type="dxa" w:w="60"/>
+              <w:left w:type="dxa" w:w="90"/>
+              <w:bottom w:type="dxa" w:w="60"/>
+              <w:right w:type="dxa" w:w="90"/>
+            </w:tcMar>
+          </w:tcPr>
+          <w:p>
+            <w:r>
+              <w:rPr>
+                <w:sz w:val="17"/>
+                <w:szCs w:val="17"/>
+              </w:rPr>
+              <w:t xml:space="preserve">Queen Black</w:t>
+            </w:r>
+          </w:p>
+        </w:tc>
+        <w:tc>
+          <w:tcPr>
+            <w:tcW w:type="dxa" w:w="1404"/>
+            <w:tcBorders>
+              <w:top w:val="single" w:color="BFBFBF" w:sz="4"/>
+              <w:left w:val="single" w:color="BFBFBF" w:sz="4"/>
+              <w:bottom w:val="single" w:color="BFBFBF" w:sz="4"/>
+              <w:right w:val="single" w:color="BFBFBF" w:sz="4"/>
+            </w:tcBorders>
+            <w:tcMar>
+              <w:top w:type="dxa" w:w="60"/>
+              <w:left w:type="dxa" w:w="90"/>
+              <w:bottom w:type="dxa" w:w="60"/>
+              <w:right w:type="dxa" w:w="90"/>
+            </w:tcMar>
+          </w:tcPr>
+          <w:p>
+            <w:r>
+              <w:rPr>
+                <w:sz w:val="17"/>
+                <w:szCs w:val="17"/>
+              </w:rPr>
+              <w:t xml:space="preserve">26,434</w:t>
+            </w:r>
+          </w:p>
+        </w:tc>
+        <w:tc>
+          <w:tcPr>
+            <w:tcW w:type="dxa" w:w="1569"/>
+            <w:tcBorders>
+              <w:top w:val="single" w:color="BFBFBF" w:sz="4"/>
+              <w:left w:val="single" w:color="BFBFBF" w:sz="4"/>
+              <w:bottom w:val="single" w:color="BFBFBF" w:sz="4"/>
+              <w:right w:val="single" w:color="BFBFBF" w:sz="4"/>
+            </w:tcBorders>
+            <w:tcMar>
+              <w:top w:type="dxa" w:w="60"/>
+              <w:left w:type="dxa" w:w="90"/>
+              <w:bottom w:type="dxa" w:w="60"/>
+              <w:right w:type="dxa" w:w="90"/>
+            </w:tcMar>
+          </w:tcPr>
+          <w:p>
+            <w:r>
+              <w:rPr>
+                <w:sz w:val="17"/>
+                <w:szCs w:val="17"/>
+              </w:rPr>
+              <w:t xml:space="preserve">0.65%</w:t>
+            </w:r>
+          </w:p>
+        </w:tc>
+        <w:tc>
+          <w:tcPr>
+            <w:tcW w:type="dxa" w:w="1321"/>
+            <w:tcBorders>
+              <w:top w:val="single" w:color="BFBFBF" w:sz="4"/>
+              <w:left w:val="single" w:color="BFBFBF" w:sz="4"/>
+              <w:bottom w:val="single" w:color="BFBFBF" w:sz="4"/>
+              <w:right w:val="single" w:color="BFBFBF" w:sz="4"/>
+            </w:tcBorders>
+            <w:tcMar>
+              <w:top w:type="dxa" w:w="60"/>
+              <w:left w:type="dxa" w:w="90"/>
+              <w:bottom w:type="dxa" w:w="60"/>
+              <w:right w:type="dxa" w:w="90"/>
+            </w:tcMar>
+          </w:tcPr>
+          <w:p>
+            <w:r>
+              <w:rPr>
+                <w:sz w:val="17"/>
+                <w:szCs w:val="17"/>
+              </w:rPr>
+              <w:t xml:space="preserve">14.3%</w:t>
+            </w:r>
+          </w:p>
+        </w:tc>
+        <w:tc>
+          <w:tcPr>
+            <w:tcW w:type="dxa" w:w="2477"/>
+            <w:tcBorders>
+              <w:top w:val="single" w:color="BFBFBF" w:sz="4"/>
+              <w:left w:val="single" w:color="BFBFBF" w:sz="4"/>
+              <w:bottom w:val="single" w:color="BFBFBF" w:sz="4"/>
+              <w:right w:val="single" w:color="BFBFBF" w:sz="4"/>
+            </w:tcBorders>
+            <w:tcMar>
+              <w:top w:type="dxa" w:w="60"/>
+              <w:left w:type="dxa" w:w="90"/>
+              <w:bottom w:type="dxa" w:w="60"/>
+              <w:right w:type="dxa" w:w="90"/>
+            </w:tcMar>
+          </w:tcPr>
+          <w:p>
+            <w:r>
+              <w:rPr>
+                <w:sz w:val="17"/>
+                <w:szCs w:val="17"/>
+              </w:rPr>
+              <w:t xml:space="preserve">$5.03</w:t>
+            </w:r>
+          </w:p>
+        </w:tc>
+        <w:tc>
+          <w:tcPr>
+            <w:tcW w:type="dxa" w:w="3468"/>
+            <w:tcBorders>
+              <w:top w:val="single" w:color="BFBFBF" w:sz="4"/>
+              <w:left w:val="single" w:color="BFBFBF" w:sz="4"/>
+              <w:bottom w:val="single" w:color="BFBFBF" w:sz="4"/>
+              <w:right w:val="single" w:color="BFBFBF" w:sz="4"/>
+            </w:tcBorders>
+            <w:tcMar>
+              <w:top w:type="dxa" w:w="60"/>
+              <w:left w:type="dxa" w:w="90"/>
+              <w:bottom w:type="dxa" w:w="60"/>
+              <w:right w:type="dxa" w:w="90"/>
+            </w:tcMar>
+          </w:tcPr>
+          <w:p>
+            <w:r>
+              <w:rPr>
+                <w:sz w:val="17"/>
+                <w:szCs w:val="17"/>
+              </w:rPr>
+              <w:t xml:space="preserve">–</w:t>
+            </w:r>
+          </w:p>
+        </w:tc>
+        <w:tc>
+          <w:tcPr>
+            <w:tcW w:type="dxa" w:w="1985"/>
+            <w:tcBorders>
+              <w:top w:val="single" w:color="BFBFBF" w:sz="4"/>
+              <w:left w:val="single" w:color="BFBFBF" w:sz="4"/>
+              <w:bottom w:val="single" w:color="BFBFBF" w:sz="4"/>
+              <w:right w:val="single" w:color="BFBFBF" w:sz="4"/>
+            </w:tcBorders>
+            <w:tcMar>
+              <w:top w:type="dxa" w:w="60"/>
+              <w:left w:type="dxa" w:w="90"/>
+              <w:bottom w:type="dxa" w:w="60"/>
+              <w:right w:type="dxa" w:w="90"/>
+            </w:tcMar>
+          </w:tcPr>
+          <w:p>
+            <w:r>
+              <w:rPr>
+                <w:sz w:val="17"/>
+                <w:szCs w:val="17"/>
+              </w:rPr>
+              <w:t xml:space="preserve">$0.72</w:t>
+            </w:r>
+          </w:p>
+        </w:tc>
+      </w:tr>
+      <w:tr>
+        <w:trPr>
+          <w:tblHeader w:val="off"/>
+        </w:trPr>
+        <w:tc>
+          <w:tcPr>
+            <w:tcW w:type="dxa" w:w="1816"/>
+            <w:tcBorders>
+              <w:top w:val="single" w:color="BFBFBF" w:sz="4"/>
+              <w:left w:val="single" w:color="BFBFBF" w:sz="4"/>
+              <w:bottom w:val="single" w:color="BFBFBF" w:sz="4"/>
+              <w:right w:val="single" w:color="BFBFBF" w:sz="4"/>
+            </w:tcBorders>
+            <w:tcMar>
+              <w:top w:type="dxa" w:w="60"/>
+              <w:left w:type="dxa" w:w="90"/>
+              <w:bottom w:type="dxa" w:w="60"/>
+              <w:right w:type="dxa" w:w="90"/>
+            </w:tcMar>
+          </w:tcPr>
+          <w:p>
+            <w:r>
+              <w:rPr>
+                <w:sz w:val="17"/>
+                <w:szCs w:val="17"/>
+              </w:rPr>
+              <w:t xml:space="preserve">Queen Grey</w:t>
+            </w:r>
+          </w:p>
+        </w:tc>
+        <w:tc>
+          <w:tcPr>
+            <w:tcW w:type="dxa" w:w="1404"/>
+            <w:tcBorders>
+              <w:top w:val="single" w:color="BFBFBF" w:sz="4"/>
+              <w:left w:val="single" w:color="BFBFBF" w:sz="4"/>
+              <w:bottom w:val="single" w:color="BFBFBF" w:sz="4"/>
+              <w:right w:val="single" w:color="BFBFBF" w:sz="4"/>
+            </w:tcBorders>
+            <w:tcMar>
+              <w:top w:type="dxa" w:w="60"/>
+              <w:left w:type="dxa" w:w="90"/>
+              <w:bottom w:type="dxa" w:w="60"/>
+              <w:right w:type="dxa" w:w="90"/>
+            </w:tcMar>
+          </w:tcPr>
+          <w:p>
+            <w:r>
+              <w:rPr>
+                <w:sz w:val="17"/>
+                <w:szCs w:val="17"/>
+              </w:rPr>
+              <w:t xml:space="preserve">4,022</w:t>
+            </w:r>
+          </w:p>
+        </w:tc>
+        <w:tc>
+          <w:tcPr>
+            <w:tcW w:type="dxa" w:w="1569"/>
+            <w:tcBorders>
+              <w:top w:val="single" w:color="BFBFBF" w:sz="4"/>
+              <w:left w:val="single" w:color="BFBFBF" w:sz="4"/>
+              <w:bottom w:val="single" w:color="BFBFBF" w:sz="4"/>
+              <w:right w:val="single" w:color="BFBFBF" w:sz="4"/>
+            </w:tcBorders>
+            <w:tcMar>
+              <w:top w:type="dxa" w:w="60"/>
+              <w:left w:type="dxa" w:w="90"/>
+              <w:bottom w:type="dxa" w:w="60"/>
+              <w:right w:type="dxa" w:w="90"/>
+            </w:tcMar>
+          </w:tcPr>
+          <w:p>
+            <w:r>
+              <w:rPr>
+                <w:sz w:val="17"/>
+                <w:szCs w:val="17"/>
+              </w:rPr>
+              <w:t xml:space="preserve">0.36%</w:t>
+            </w:r>
+          </w:p>
+        </w:tc>
+        <w:tc>
+          <w:tcPr>
+            <w:tcW w:type="dxa" w:w="1321"/>
+            <w:tcBorders>
+              <w:top w:val="single" w:color="BFBFBF" w:sz="4"/>
+              <w:left w:val="single" w:color="BFBFBF" w:sz="4"/>
+              <w:bottom w:val="single" w:color="BFBFBF" w:sz="4"/>
+              <w:right w:val="single" w:color="BFBFBF" w:sz="4"/>
+            </w:tcBorders>
+            <w:tcMar>
+              <w:top w:type="dxa" w:w="60"/>
+              <w:left w:type="dxa" w:w="90"/>
+              <w:bottom w:type="dxa" w:w="60"/>
+              <w:right w:type="dxa" w:w="90"/>
+            </w:tcMar>
+          </w:tcPr>
+          <w:p>
+            <w:r>
+              <w:rPr>
+                <w:sz w:val="17"/>
+                <w:szCs w:val="17"/>
+              </w:rPr>
+              <w:t xml:space="preserve">11.2%</w:t>
+            </w:r>
+          </w:p>
+        </w:tc>
+        <w:tc>
+          <w:tcPr>
+            <w:tcW w:type="dxa" w:w="2477"/>
+            <w:tcBorders>
+              <w:top w:val="single" w:color="BFBFBF" w:sz="4"/>
+              <w:left w:val="single" w:color="BFBFBF" w:sz="4"/>
+              <w:bottom w:val="single" w:color="BFBFBF" w:sz="4"/>
+              <w:right w:val="single" w:color="BFBFBF" w:sz="4"/>
+            </w:tcBorders>
+            <w:tcMar>
+              <w:top w:type="dxa" w:w="60"/>
+              <w:left w:type="dxa" w:w="90"/>
+              <w:bottom w:type="dxa" w:w="60"/>
+              <w:right w:type="dxa" w:w="90"/>
+            </w:tcMar>
+          </w:tcPr>
+          <w:p>
+            <w:r>
+              <w:rPr>
+                <w:sz w:val="17"/>
+                <w:szCs w:val="17"/>
+              </w:rPr>
+              <w:t xml:space="preserve">$3.15</w:t>
+            </w:r>
+          </w:p>
+        </w:tc>
+        <w:tc>
+          <w:tcPr>
+            <w:tcW w:type="dxa" w:w="3468"/>
+            <w:tcBorders>
+              <w:top w:val="single" w:color="BFBFBF" w:sz="4"/>
+              <w:left w:val="single" w:color="BFBFBF" w:sz="4"/>
+              <w:bottom w:val="single" w:color="BFBFBF" w:sz="4"/>
+              <w:right w:val="single" w:color="BFBFBF" w:sz="4"/>
+            </w:tcBorders>
+            <w:tcMar>
+              <w:top w:type="dxa" w:w="60"/>
+              <w:left w:type="dxa" w:w="90"/>
+              <w:bottom w:type="dxa" w:w="60"/>
+              <w:right w:type="dxa" w:w="90"/>
+            </w:tcMar>
+          </w:tcPr>
+          <w:p>
+            <w:r>
+              <w:rPr>
+                <w:sz w:val="17"/>
+                <w:szCs w:val="17"/>
+              </w:rPr>
+              <w:t xml:space="preserve">$6.82 (aged units only)</w:t>
+            </w:r>
+          </w:p>
+        </w:tc>
+        <w:tc>
+          <w:tcPr>
+            <w:tcW w:type="dxa" w:w="1985"/>
+            <w:tcBorders>
+              <w:top w:val="single" w:color="BFBFBF" w:sz="4"/>
+              <w:left w:val="single" w:color="BFBFBF" w:sz="4"/>
+              <w:bottom w:val="single" w:color="BFBFBF" w:sz="4"/>
+              <w:right w:val="single" w:color="BFBFBF" w:sz="4"/>
+            </w:tcBorders>
+            <w:tcMar>
+              <w:top w:type="dxa" w:w="60"/>
+              <w:left w:type="dxa" w:w="90"/>
+              <w:bottom w:type="dxa" w:w="60"/>
+              <w:right w:type="dxa" w:w="90"/>
+            </w:tcMar>
+          </w:tcPr>
+          <w:p>
+            <w:r>
+              <w:rPr>
+                <w:sz w:val="17"/>
+                <w:szCs w:val="17"/>
+              </w:rPr>
+              <w:t xml:space="preserve">$1.12</w:t>
+            </w:r>
+          </w:p>
+        </w:tc>
+      </w:tr>
+      <w:tr>
+        <w:trPr>
+          <w:tblHeader w:val="off"/>
+        </w:trPr>
+        <w:tc>
+          <w:tcPr>
+            <w:tcW w:type="dxa" w:w="1816"/>
+            <w:tcBorders>
+              <w:top w:val="single" w:color="BFBFBF" w:sz="4"/>
+              <w:left w:val="single" w:color="BFBFBF" w:sz="4"/>
+              <w:bottom w:val="single" w:color="BFBFBF" w:sz="4"/>
+              <w:right w:val="single" w:color="BFBFBF" w:sz="4"/>
+            </w:tcBorders>
+            <w:tcMar>
+              <w:top w:type="dxa" w:w="60"/>
+              <w:left w:type="dxa" w:w="90"/>
+              <w:bottom w:type="dxa" w:w="60"/>
+              <w:right w:type="dxa" w:w="90"/>
+            </w:tcMar>
+          </w:tcPr>
+          <w:p>
+            <w:r>
+              <w:rPr>
+                <w:sz w:val="17"/>
+                <w:szCs w:val="17"/>
+              </w:rPr>
+              <w:t xml:space="preserve">Queen Stone Grey</w:t>
+            </w:r>
+          </w:p>
+        </w:tc>
+        <w:tc>
+          <w:tcPr>
+            <w:tcW w:type="dxa" w:w="1404"/>
+            <w:tcBorders>
+              <w:top w:val="single" w:color="BFBFBF" w:sz="4"/>
+              <w:left w:val="single" w:color="BFBFBF" w:sz="4"/>
+              <w:bottom w:val="single" w:color="BFBFBF" w:sz="4"/>
+              <w:right w:val="single" w:color="BFBFBF" w:sz="4"/>
+            </w:tcBorders>
+            <w:tcMar>
+              <w:top w:type="dxa" w:w="60"/>
+              <w:left w:type="dxa" w:w="90"/>
+              <w:bottom w:type="dxa" w:w="60"/>
+              <w:right w:type="dxa" w:w="90"/>
+            </w:tcMar>
+          </w:tcPr>
+          <w:p>
+            <w:r>
+              <w:rPr>
+                <w:sz w:val="17"/>
+                <w:szCs w:val="17"/>
+              </w:rPr>
+              <w:t xml:space="preserve">21</w:t>
+            </w:r>
+          </w:p>
+        </w:tc>
+        <w:tc>
+          <w:tcPr>
+            <w:tcW w:type="dxa" w:w="1569"/>
+            <w:tcBorders>
+              <w:top w:val="single" w:color="BFBFBF" w:sz="4"/>
+              <w:left w:val="single" w:color="BFBFBF" w:sz="4"/>
+              <w:bottom w:val="single" w:color="BFBFBF" w:sz="4"/>
+              <w:right w:val="single" w:color="BFBFBF" w:sz="4"/>
+            </w:tcBorders>
+            <w:tcMar>
+              <w:top w:type="dxa" w:w="60"/>
+              <w:left w:type="dxa" w:w="90"/>
+              <w:bottom w:type="dxa" w:w="60"/>
+              <w:right w:type="dxa" w:w="90"/>
+            </w:tcMar>
+          </w:tcPr>
+          <w:p>
+            <w:r>
+              <w:rPr>
+                <w:sz w:val="17"/>
+                <w:szCs w:val="17"/>
+              </w:rPr>
+              <w:t xml:space="preserve">–</w:t>
+            </w:r>
+          </w:p>
+        </w:tc>
+        <w:tc>
+          <w:tcPr>
+            <w:tcW w:type="dxa" w:w="1321"/>
+            <w:tcBorders>
+              <w:top w:val="single" w:color="BFBFBF" w:sz="4"/>
+              <w:left w:val="single" w:color="BFBFBF" w:sz="4"/>
+              <w:bottom w:val="single" w:color="BFBFBF" w:sz="4"/>
+              <w:right w:val="single" w:color="BFBFBF" w:sz="4"/>
+            </w:tcBorders>
+            <w:tcMar>
+              <w:top w:type="dxa" w:w="60"/>
+              <w:left w:type="dxa" w:w="90"/>
+              <w:bottom w:type="dxa" w:w="60"/>
+              <w:right w:type="dxa" w:w="90"/>
+            </w:tcMar>
+          </w:tcPr>
+          <w:p>
+            <w:r>
+              <w:rPr>
+                <w:sz w:val="17"/>
+                <w:szCs w:val="17"/>
+              </w:rPr>
+              <w:t xml:space="preserve">4.8%</w:t>
+            </w:r>
+          </w:p>
+        </w:tc>
+        <w:tc>
+          <w:tcPr>
+            <w:tcW w:type="dxa" w:w="2477"/>
+            <w:tcBorders>
+              <w:top w:val="single" w:color="BFBFBF" w:sz="4"/>
+              <w:left w:val="single" w:color="BFBFBF" w:sz="4"/>
+              <w:bottom w:val="single" w:color="BFBFBF" w:sz="4"/>
+              <w:right w:val="single" w:color="BFBFBF" w:sz="4"/>
+            </w:tcBorders>
+            <w:tcMar>
+              <w:top w:type="dxa" w:w="60"/>
+              <w:left w:type="dxa" w:w="90"/>
+              <w:bottom w:type="dxa" w:w="60"/>
+              <w:right w:type="dxa" w:w="90"/>
+            </w:tcMar>
+          </w:tcPr>
+          <w:p>
+            <w:r>
+              <w:rPr>
+                <w:sz w:val="17"/>
+                <w:szCs w:val="17"/>
+              </w:rPr>
+              <w:t xml:space="preserve">$2.94</w:t>
+            </w:r>
+          </w:p>
+        </w:tc>
+        <w:tc>
+          <w:tcPr>
+            <w:tcW w:type="dxa" w:w="3468"/>
+            <w:tcBorders>
+              <w:top w:val="single" w:color="BFBFBF" w:sz="4"/>
+              <w:left w:val="single" w:color="BFBFBF" w:sz="4"/>
+              <w:bottom w:val="single" w:color="BFBFBF" w:sz="4"/>
+              <w:right w:val="single" w:color="BFBFBF" w:sz="4"/>
+            </w:tcBorders>
+            <w:tcMar>
+              <w:top w:type="dxa" w:w="60"/>
+              <w:left w:type="dxa" w:w="90"/>
+              <w:bottom w:type="dxa" w:w="60"/>
+              <w:right w:type="dxa" w:w="90"/>
+            </w:tcMar>
+          </w:tcPr>
+          <w:p>
+            <w:r>
+              <w:rPr>
+                <w:sz w:val="17"/>
+                <w:szCs w:val="17"/>
+              </w:rPr>
+              <w:t xml:space="preserve">$1.60</w:t>
+            </w:r>
+          </w:p>
+        </w:tc>
+        <w:tc>
+          <w:tcPr>
+            <w:tcW w:type="dxa" w:w="1985"/>
+            <w:tcBorders>
+              <w:top w:val="single" w:color="BFBFBF" w:sz="4"/>
+              <w:left w:val="single" w:color="BFBFBF" w:sz="4"/>
+              <w:bottom w:val="single" w:color="BFBFBF" w:sz="4"/>
+              <w:right w:val="single" w:color="BFBFBF" w:sz="4"/>
+            </w:tcBorders>
+            <w:tcMar>
+              <w:top w:type="dxa" w:w="60"/>
+              <w:left w:type="dxa" w:w="90"/>
+              <w:bottom w:type="dxa" w:w="60"/>
+              <w:right w:type="dxa" w:w="90"/>
+            </w:tcMar>
+          </w:tcPr>
+          <w:p>
+            <w:r>
+              <w:rPr>
+                <w:sz w:val="17"/>
+                <w:szCs w:val="17"/>
+              </w:rPr>
+              <w:t xml:space="preserve">$0.22</w:t>
+            </w:r>
+          </w:p>
+        </w:tc>
+      </w:tr>
+    </w:tbl>
+    <w:p/>
+    <w:p>
+      <w:pPr>
+        <w:spacing w:after="120"/>
+        <w:ind w:left="360"/>
+      </w:pPr>
+      <w:r>
+        <w:rPr>
+          <w:i/>
+          <w:iCs/>
+        </w:rPr>
+        <w:t xml:space="preserve">Command Center 90 days to 29 Sep, by advertised colour; profit Sellerboard 30 Aug–29 Sep; LTSF saving from the S4-LTSF sheet (Review B).</w:t>
+      </w:r>
+    </w:p>
+    <w:p>
+      <w:pPr>
+        <w:spacing w:after="120"/>
+        <w:ind w:left="360"/>
+      </w:pPr>
+      <w:r>
+        <w:t xml:space="preserve">Queen Grey converts and is clicked less than Queen Black. Its lower click-through means the same bid buys fewer clicks, so expect fewer orders. But with the storage it avoids, each click is worth more, and it also takes non-ranking traffic off Queen Black, the colour that runs out first. The case rests on the aged units: without them a Queen Grey click is worth about $0.35.</w:t>
+      </w:r>
+    </w:p>
+    <w:p>
+      <w:pPr>
+        <w:pStyle w:val="ListParagraph"/>
+        <w:numPr>
+          <w:ilvl w:val="0"/>
+          <w:numId w:val="2"/>
+        </w:numPr>
+      </w:pPr>
+      <w:r>
+        <w:rPr>
+          <w:b/>
+          <w:bCs/>
+        </w:rPr>
+        <w:t xml:space="preserve">When Queen Grey's aged units clear</w:t>
+      </w:r>
+      <w:r>
+        <w:t xml:space="preserve"> (about 5 Dec), move those campaigns back to Queen Black, not on to Stone Grey as Review B planned. Stone Grey fails the test. Give it a small budget to earn a read first if its aged units (about 235) still need clearing.</w:t>
       </w:r>
     </w:p>
     <w:p>
@@ -15720,7 +17898,7 @@
                 <w:sz w:val="17"/>
                 <w:szCs w:val="17"/>
               </w:rPr>
-              <w:t xml:space="preserve">Top of search only at the $3.53 it pays</w:t>
+              <w:t xml:space="preserve">Top of search only at its effective bid, capped at the market bound; never at the cost per click, which is what lost the auctions</w:t>
             </w:r>
           </w:p>
         </w:tc>
@@ -16119,7 +18297,7 @@
         <w:t xml:space="preserve">No new campaigns and no tests now.</w:t>
       </w:r>
       <w:r>
-        <w:t xml:space="preserve"> Both reviews hold the audit's 21 builds and 16 tests: wrong colours, reads inside the deals, and (Review B) nothing unbought that needs a new campaign.</w:t>
+        <w:t xml:space="preserve"> Both reviews hold the audit's 21 builds and its tests (35 taken, 17 queued; the 35 are 16 keyword tests, 18 test slots turned into revives and 1 conquest): wrong colours, reads inside the deals, and (Review B) nothing unbought that needs a new campaign.</w:t>
       </w:r>
     </w:p>
     <w:p>
@@ -16645,7 +18823,7 @@
           <w:i/>
           <w:iCs/>
         </w:rPr>
-        <w:t xml:space="preserve">Built from Review B's per-campaign effects. The 9 held Queen terms (8 campaigns) are taken back to today's spend (−$61 a day of spend, +$46 a day of profit). "silk sheets" is staged at $25 instead of $44 (−$23 a day, +$18 a day of profit). Deal days cost more per push order than this shows, because the deal price leaves less profit per unit, but the no-raise rule keeps their spend at plan. If "silk sheets" scales after its read, add about $19 a day of spend and $18 a day of loss.</w:t>
+        <w:t xml:space="preserve">Built from Review B's per-campaign effects. The 9 held Queen terms (8 campaigns) are taken back to today's spend (−$61 a day of spend, +$46 a day of profit). "silk sheets" is staged at $25 instead of $44 (−$23 a day, +$18 a day of profit). Deal days cost more per push order than this shows, because the deal price leaves less profit per unit, but the no-raise rule keeps their spend at plan. If "silk sheets" scales after its read, add about $19 a day of spend and $18 a day of loss. Two timing effects: holding the 20 ranking keywords at their effective bid instead of Review B's lower price adds a little spend that Review B's figures don't include. And the other exact campaigns' part of the change arrives with wave 2 (from 16 Oct), not now.</w:t>
       </w:r>
     </w:p>
     <w:p>
@@ -16653,7 +18831,15 @@
         <w:pStyle w:val="Heading1"/>
       </w:pPr>
       <w:r>
-        <w:t xml:space="preserve">6. Needs your decision</w:t>
+        <w:t xml:space="preserve">6. Needs a decision</w:t>
+      </w:r>
+    </w:p>
+    <w:p>
+      <w:pPr>
+        <w:spacing w:after="120"/>
+      </w:pPr>
+      <w:r>
+        <w:t xml:space="preserve">For Joseph, who set the maintenance lane by operator ruling on 21 Sep, and Erik, whose direction of 28–29 Sep asks for the push.</w:t>
       </w:r>
     </w:p>
     <w:p>
@@ -16827,7 +19013,7 @@
         </w:numPr>
       </w:pPr>
       <w:r>
-        <w:t xml:space="preserve">Ranking owners: product ad to the ranking colour (King to King Black); top-of-search-only setting at today's price; budgets from the consolidated workbook; load the back-up product ads paused.</w:t>
+        <w:t xml:space="preserve">Wave 1, the 70 ranking campaigns: product ad to the ranking colour (King to King Black); top-of-search-only setting with each base = today's effective top-of-search bid ÷ 10 (capped at the market bound where the term has clicks to read it); budgets from the consolidated workbook; load the back-up product ads paused.</w:t>
       </w:r>
     </w:p>
     <w:p>
@@ -16839,7 +19025,7 @@
         </w:numPr>
       </w:pPr>
       <w:r>
-        <w:t xml:space="preserve">Pause the duplicate owners; keep both "silk sheets queen" campaigns and add its negative.</w:t>
+        <w:t xml:space="preserve">Make the colour switches under the size rule (Section 4.4).</w:t>
       </w:r>
     </w:p>
     <w:p>
@@ -16851,6 +19037,18 @@
         </w:numPr>
       </w:pPr>
       <w:r>
+        <w:t xml:space="preserve">Pause the duplicate owners; keep both "silk sheets queen" campaigns and add its negative.</w:t>
+      </w:r>
+    </w:p>
+    <w:p>
+      <w:pPr>
+        <w:pStyle w:val="ListParagraph"/>
+        <w:numPr>
+          <w:ilvl w:val="1"/>
+          <w:numId w:val="2"/>
+        </w:numPr>
+      </w:pPr>
+      <w:r>
         <w:t xml:space="preserve">Hold the four circular pauses, every audit test and build, and the non-ranking revives.</w:t>
       </w:r>
     </w:p>
@@ -16879,7 +19077,7 @@
         </w:numPr>
       </w:pPr>
       <w:r>
-        <w:t xml:space="preserve">The top-of-search-only setting on the other exact campaigns.</w:t>
+        <w:t xml:space="preserve">The −15% step on the other exact campaigns above break-even, on their current setting.</w:t>
       </w:r>
     </w:p>
     <w:p>
@@ -16951,7 +19149,7 @@
         </w:numPr>
       </w:pPr>
       <w:r>
-        <w:t xml:space="preserve">The Queen offer to Brand Management.</w:t>
+        <w:t xml:space="preserve">The Queen offer to Brand Management, with a decision due 10 Oct.</w:t>
       </w:r>
     </w:p>
     <w:p>
@@ -17034,7 +19232,7 @@
         <w:t xml:space="preserve">16 Oct, pre-Best-Deal read</w:t>
       </w:r>
       <w:r>
-        <w:t xml:space="preserve"> (rank median 8–15 Oct):</w:t>
+        <w:t xml:space="preserve"> (rank median 8–15 Oct; clicks and top-of-search share 7–15 Oct):</w:t>
       </w:r>
     </w:p>
     <w:p>
@@ -17046,7 +19244,7 @@
         </w:numPr>
       </w:pPr>
       <w:r>
-        <w:t xml:space="preserve">Stop pushed terms that haven't moved.</w:t>
+        <w:t xml:space="preserve">If wave 1 held its orders and top-of-search share, load wave 2: the top-of-search-only setting on the other 220 exact campaigns.</w:t>
       </w:r>
     </w:p>
     <w:p>
@@ -17058,7 +19256,7 @@
         </w:numPr>
       </w:pPr>
       <w:r>
-        <w:t xml:space="preserve">Decide "silk sheets" on its 7–15 Oct conversion.</w:t>
+        <w:t xml:space="preserve">Re-score the 9 held Queen terms against the offer decision.</w:t>
       </w:r>
     </w:p>
     <w:p>
@@ -17070,6 +19268,30 @@
         </w:numPr>
       </w:pPr>
       <w:r>
+        <w:t xml:space="preserve">Stop pushed terms that haven't moved.</w:t>
+      </w:r>
+    </w:p>
+    <w:p>
+      <w:pPr>
+        <w:pStyle w:val="ListParagraph"/>
+        <w:numPr>
+          <w:ilvl w:val="1"/>
+          <w:numId w:val="2"/>
+        </w:numPr>
+      </w:pPr>
+      <w:r>
+        <w:t xml:space="preserve">Decide "silk sheets" on its 7–15 Oct conversion.</w:t>
+      </w:r>
+    </w:p>
+    <w:p>
+      <w:pPr>
+        <w:pStyle w:val="ListParagraph"/>
+        <w:numPr>
+          <w:ilvl w:val="1"/>
+          <w:numId w:val="2"/>
+        </w:numPr>
+      </w:pPr>
+      <w:r>
         <w:t xml:space="preserve">Read King Black's top-of-search conversion.</w:t>
       </w:r>
     </w:p>
@@ -17144,7 +19366,7 @@
         <w:t xml:space="preserve">About 5 Dec</w:t>
       </w:r>
       <w:r>
-        <w:t xml:space="preserve">: move the Queen Grey campaigns to Queen Stone Grey as Queen Grey clears.</w:t>
+        <w:t xml:space="preserve">: as Queen Grey's aged units clear, move its campaigns back to Queen Black (not Stone Grey).</w:t>
       </w:r>
     </w:p>
     <w:p>
@@ -17153,6 +19375,14 @@
       </w:pPr>
       <w:r>
         <w:t xml:space="preserve">Appendix: fixes for the engine, from both reviews</w:t>
+      </w:r>
+    </w:p>
+    <w:p>
+      <w:pPr>
+        <w:spacing w:after="120"/>
+      </w:pPr>
+      <w:r>
+        <w:t xml:space="preserve">The run applies the team's rules as written: 173 decisions cite the B4 corrections and 35 the B6 corrections, loaded into the engine on 28 Sep. Most of what went wrong comes from the data under the rules, not the rules. So the fixes below are to the engine's data and to tests the rules lack; the rules stay.</w:t>
       </w:r>
     </w:p>
     <w:p>
@@ -17168,10 +19398,10 @@
           <w:b/>
           <w:bCs/>
         </w:rPr>
-        <w:t xml:space="preserve">Deals.</w:t>
-      </w:r>
-      <w:r>
-        <w:t xml:space="preserve"> It doesn't read the deal calendar, and its 30-day windows include days of the last deal (A).</w:t>
+        <w:t xml:space="preserve">The impressions feed.</w:t>
+      </w:r>
+      <w:r>
+        <w:t xml:space="preserve"> It reads 0 impressions on campaigns that spent (for example $279, $226 and $205 in 14 days, with 1,513 and 2,718 clicks in 90 days). The "not serving" rule then fires correctly on false data and freezes 103 campaigns (119 rows). Fix the feed; the rule is right.</w:t>
       </w:r>
     </w:p>
     <w:p>
@@ -17187,10 +19417,10 @@
           <w:b/>
           <w:bCs/>
         </w:rPr>
-        <w:t xml:space="preserve">Margin.</w:t>
-      </w:r>
-      <w:r>
-        <w:t xml:space="preserve"> It prices on the engine's margin, not Sellerboard's realised margin per colour (A, B).</w:t>
+        <w:t xml:space="preserve">The revive rule needs an ACoS test.</w:t>
+      </w:r>
+      <w:r>
+        <w:t xml:space="preserve"> It revives on clicks and orders alone; every one of the 35 revives ran above break-even over 90 days (A). Add: revive only at or under the colour's break-even, or where the campaign owns a ranking term or clears an LTSF colour (B).</w:t>
       </w:r>
     </w:p>
     <w:p>
@@ -17206,10 +19436,10 @@
           <w:b/>
           <w:bCs/>
         </w:rPr>
-        <w:t xml:space="preserve">Colours.</w:t>
-      </w:r>
-      <w:r>
-        <w:t xml:space="preserve"> Its size map files 105 colours as "unsized", and its hero rule picks white or slow colours for ranking (A, B). It proposes switches that change the size (A).</w:t>
+        <w:t xml:space="preserve">The size map.</w:t>
+      </w:r>
+      <w:r>
+        <w:t xml:space="preserve"> It files 105 colours as "unsized" (Queen Black among them), makes Stone Grey the Queen hero and White King (0 units) the King hero. Its own OFF/ONTO line shows the result: off Queen Black (26,596 paid clicks, 14.3% conversion), onto Stone Grey (21 clicks, "thin, not read") (A, B).</w:t>
       </w:r>
     </w:p>
     <w:p>
@@ -17225,10 +19455,10 @@
           <w:b/>
           <w:bCs/>
         </w:rPr>
-        <w:t xml:space="preserve">Scope.</w:t>
-      </w:r>
-      <w:r>
-        <w:t xml:space="preserve"> It judges focus by syntax group, so the Silk group, including "silk sheets", was tapered by rule rather than by its data (B).</w:t>
+        <w:t xml:space="preserve">Size-changing switches.</w:t>
+      </w:r>
+      <w:r>
+        <w:t xml:space="preserve"> Add the rule in Section 4.4: a size-named term never leaves its size; a colour-named term may, when its colour runs out.</w:t>
       </w:r>
     </w:p>
     <w:p>
@@ -17244,10 +19474,19 @@
           <w:b/>
           <w:bCs/>
         </w:rPr>
-        <w:t xml:space="preserve">Cuts on ranking terms.</w:t>
-      </w:r>
-      <w:r>
-        <w:t xml:space="preserve"> It cuts ranking terms toward break-even, although almost all advertising on this product runs above it (B). Its class steps are fixed percentages, not sized to each row (A).</w:t>
+        <w:t xml:space="preserve">Deals.</w:t>
+      </w:r>
+      <w:r>
+        <w:t xml:space="preserve"> It doesn't read the deal calendar (</w:t>
+      </w:r>
+      <w:r>
+        <w:rPr>
+          <w:rFonts w:ascii="Consolas" w:cs="Consolas" w:eastAsia="Consolas" w:hAnsi="Consolas"/>
+        </w:rPr>
+        <w:t xml:space="preserve">engine_read</w:t>
+      </w:r>
+      <w:r>
+        <w:t xml:space="preserve"> null) although the three deals are on it, and its margin window includes six days of the last deal (A).</w:t>
       </w:r>
     </w:p>
     <w:p>
@@ -17263,10 +19502,10 @@
           <w:b/>
           <w:bCs/>
         </w:rPr>
-        <w:t xml:space="preserve">Paired rows.</w:t>
-      </w:r>
-      <w:r>
-        <w:t xml:space="preserve"> Its paired pauses turn terms off, and its no-move boost rows break real cuts (A).</w:t>
+        <w:t xml:space="preserve">Margin.</w:t>
+      </w:r>
+      <w:r>
+        <w:t xml:space="preserve"> Use Sellerboard's realised margin per colour, at full price on normal days and at the deal price on deal days (A, B).</w:t>
       </w:r>
     </w:p>
     <w:p>
@@ -17282,10 +19521,10 @@
           <w:b/>
           <w:bCs/>
         </w:rPr>
-        <w:t xml:space="preserve">LTSF.</w:t>
-      </w:r>
-      <w:r>
-        <w:t xml:space="preserve"> It has no LTSF view, and the LTSF campaign doesn't advertise the #1 LTSF colour (B).</w:t>
+        <w:t xml:space="preserve">Focus scope.</w:t>
+      </w:r>
+      <w:r>
+        <w:t xml:space="preserve"> It judges focus by syntax group, so the Silk group, "silk sheets" included, was tapered by rule rather than by its data (B).</w:t>
       </w:r>
     </w:p>
     <w:p>
@@ -17301,10 +19540,10 @@
           <w:b/>
           <w:bCs/>
         </w:rPr>
-        <w:t xml:space="preserve">Back-ups.</w:t>
-      </w:r>
-      <w:r>
-        <w:t xml:space="preserve"> It has no back-up ranking colour and no seasonality in its stock-out dates (B).</w:t>
+        <w:t xml:space="preserve">Cuts on ranking terms.</w:t>
+      </w:r>
+      <w:r>
+        <w:t xml:space="preserve"> The class steps cut ranking terms toward break-even in fixed percentages, although almost all advertising on this product runs above it. Price ranking terms on the effective top-of-search bid and the market bound (A, B).</w:t>
       </w:r>
     </w:p>
     <w:p>
@@ -17320,10 +19559,10 @@
           <w:b/>
           <w:bCs/>
         </w:rPr>
-        <w:t xml:space="preserve">Rules from B6.</w:t>
-      </w:r>
-      <w:r>
-        <w:t xml:space="preserve"> It applies B6 rules to Satin (A, B).</w:t>
+        <w:t xml:space="preserve">LTSF and back-ups.</w:t>
+      </w:r>
+      <w:r>
+        <w:t xml:space="preserve"> It has no LTSF view, no back-up ranking colour, and no seasonality in its stock-out dates (B).</w:t>
       </w:r>
     </w:p>
     <w:p>
@@ -17339,10 +19578,10 @@
           <w:b/>
           <w:bCs/>
         </w:rPr>
-        <w:t xml:space="preserve">Holds and revives.</w:t>
-      </w:r>
-      <w:r>
-        <w:t xml:space="preserve"> Its "not serving" hold is false on 103 spending campaigns, and its revive rule reads clicks, never ACoS (A).</w:t>
+        <w:t xml:space="preserve">Paired rows.</w:t>
+      </w:r>
+      <w:r>
+        <w:t xml:space="preserve"> Paired pauses turn terms off, and no-move boost rows break real cuts (A).</w:t>
       </w:r>
     </w:p>
     <w:p>
@@ -17361,7 +19600,7 @@
         <w:t xml:space="preserve">Forecast.</w:t>
       </w:r>
       <w:r>
-        <w:t xml:space="preserve"> It prices test orders as spend ÷ historical ACoS, overstating them about four times (A).</w:t>
+        <w:t xml:space="preserve"> It prices test orders as spend ÷ historical ACoS: 105 orders a week on $47 a day is about 10% ACoS against the product's 36%, about four times overstated (A).</w:t>
       </w:r>
     </w:p>
     <w:p>
@@ -17380,7 +19619,7 @@
         <w:t xml:space="preserve">Conversion against the market.</w:t>
       </w:r>
       <w:r>
-        <w:t xml:space="preserve"> It compares ad-reported conversion with the market's search-query conversion (A).</w:t>
+        <w:t xml:space="preserve"> Compare search-query conversion with search-query conversion, not ad-reported with search-query (A).</w:t>
       </w:r>
     </w:p>
     <w:sectPr>

</xml_diff>

<commit_message>
Consolidated Satin review: hold ranking bids above the engine's market bound for a decision instead of capping; note wave-1 count and switch-row mismatch
Co-Authored-By: Claude Opus 5.5 <noreply@anthropic.com>
Claude-Session: https://claude.ai/code/session_01YNgDp4Dr6K8rA49jFuXt44
</commit_message>
<xml_diff>
--- a/satin_deliverables/Satin4_US_audit_20260929_consolidated_review.docx
+++ b/satin_deliverables/Satin4_US_audit_20260929_consolidated_review.docx
@@ -124,7 +124,7 @@
         <w:t xml:space="preserve">effective bid</w:t>
       </w:r>
       <w:r>
-        <w:t xml:space="preserve"> (base × (1 + boost)), not the cost per click. Down-only bidding pays at or below the bid, so a bid set at the average cost per click loses the auctions that clear above it. On 20 ranking keywords Review B's bases would have cut the bid by 4–90% ("king size silk sheets" $4.60 → $3.40, "satin bed sheets full" $4.56 → $3.20). The one limit is the market bound (the term's top-of-search cost per click + 15%, where the term has enough clicks to read it), above which a higher bid buys no more clicks. The setting goes out in two waves: the 70 ranking campaigns now, the 220 other exact campaigns after the 16 Oct read (Section 4.2).</w:t>
+        <w:t xml:space="preserve"> (base × (1 + boost)), not the cost per click. Down-only bidding pays at or below the bid, so a bid set at the average cost per click loses the auctions that clear above it. On 20 ranking keywords Review B's bases would have cut the bid by 4–90% ("king size silk sheets" $4.60 → $3.40, "satin bed sheets full" $4.56 → $3.20). Where a ranking bid already sits above the engine's market bound (its own 90-day top-of-search cost per click + 15%), it is held, not cut, and left to Joseph, as the engine itself does. There are 3 such keywords. The setting goes out in two waves: the 70 ranking campaigns now, the 220 other exact campaigns after the 16 Oct read (Section 4.2).</w:t>
       </w:r>
     </w:p>
     <w:p>
@@ -610,7 +610,7 @@
                 <w:sz w:val="17"/>
                 <w:szCs w:val="17"/>
               </w:rPr>
-              <w:t xml:space="preserve">The term's top-of-search cost per click + 15%. Above it a higher bid buys no more clicks. It is used only where the term has at least 0.5 top-of-search clicks a day; below that the cost per click is noise.</w:t>
+              <w:t xml:space="preserve">The engine's own read: the campaign's top-of-search cost per click over 90 days + 15% (for example "king size silk sheets": $3.69 on 123 clicks, bound $4.24). No write climbs past it. A ranking bid already above it is held, not cut, and goes to a person to decide, which is the engine's own rule ("does not climb past it and does not cut it").</w:t>
             </w:r>
           </w:p>
         </w:tc>
@@ -5067,7 +5067,81 @@
         </w:numPr>
       </w:pPr>
       <w:r>
-        <w:t xml:space="preserve">The consolidated workbook sets every base from the effective bid. The only limit is the market bound (the term's top-of-search cost per click + 15%) where the term has at least 0.5 top-of-search clicks a day. "king size silk sheets" therefore goes to $3.93, not $3.40 and not $4.60.</w:t>
+        <w:t xml:space="preserve">The consolidated workbook sets every base from the effective bid, and no ranking keyword is cut.</w:t>
+      </w:r>
+    </w:p>
+    <w:p>
+      <w:pPr>
+        <w:pStyle w:val="ListParagraph"/>
+        <w:numPr>
+          <w:ilvl w:val="1"/>
+          <w:numId w:val="2"/>
+        </w:numPr>
+      </w:pPr>
+      <w:r>
+        <w:rPr>
+          <w:b/>
+          <w:bCs/>
+        </w:rPr>
+        <w:t xml:space="preserve">Three ranking bids sit above the engine's market bound</w:t>
+      </w:r>
+      <w:r>
+        <w:t xml:space="preserve"> (its own 90-day read). They are held there, not cut, and flagged in the workbook for Joseph to decide, as the engine does ("does not climb past it and does not cut it, human-mandatory"):</w:t>
+      </w:r>
+    </w:p>
+    <w:p>
+      <w:pPr>
+        <w:pStyle w:val="ListParagraph"/>
+        <w:numPr>
+          <w:ilvl w:val="1"/>
+          <w:numId w:val="2"/>
+        </w:numPr>
+      </w:pPr>
+      <w:r>
+        <w:t xml:space="preserve">"king size silk sheets": $4.60 against a bound of $4.24 (own cost per click $3.69 on 123 clicks). Campaigns holding 30%+ of top-of-search share pay $5.18, and its clicks halved at the same bid (Section 4.8), so a cut would be the wrong direction.</w:t>
+      </w:r>
+    </w:p>
+    <w:p>
+      <w:pPr>
+        <w:pStyle w:val="ListParagraph"/>
+        <w:numPr>
+          <w:ilvl w:val="1"/>
+          <w:numId w:val="2"/>
+        </w:numPr>
+      </w:pPr>
+      <w:r>
+        <w:t xml:space="preserve">"silk sheets twin": $3.52 against $3.49.</w:t>
+      </w:r>
+    </w:p>
+    <w:p>
+      <w:pPr>
+        <w:pStyle w:val="ListParagraph"/>
+        <w:numPr>
+          <w:ilvl w:val="1"/>
+          <w:numId w:val="2"/>
+        </w:numPr>
+      </w:pPr>
+      <w:r>
+        <w:t xml:space="preserve">"silk sheet": $6.34 against $3.42, on 44 clicks.</w:t>
+      </w:r>
+    </w:p>
+    <w:p>
+      <w:pPr>
+        <w:pStyle w:val="ListParagraph"/>
+        <w:numPr>
+          <w:ilvl w:val="1"/>
+          <w:numId w:val="2"/>
+        </w:numPr>
+      </w:pPr>
+      <w:r>
+        <w:rPr>
+          <w:b/>
+          <w:bCs/>
+        </w:rPr>
+        <w:t xml:space="preserve">Rounding.</w:t>
+      </w:r>
+      <w:r>
+        <w:t xml:space="preserve"> At 900% the top-of-search price moves in $0.10 steps. Bases round up (never a cut), except on those three, where they round down (never a climb).</w:t>
       </w:r>
     </w:p>
     <w:p>
@@ -5103,6 +5177,18 @@
       </w:r>
       <w:r>
         <w:t xml:space="preserve"> (push, maintain, held and staged terms).</w:t>
+      </w:r>
+    </w:p>
+    <w:p>
+      <w:pPr>
+        <w:pStyle w:val="ListParagraph"/>
+        <w:numPr>
+          <w:ilvl w:val="1"/>
+          <w:numId w:val="2"/>
+        </w:numPr>
+      </w:pPr>
+      <w:r>
+        <w:t xml:space="preserve">Review B counts 64 ranking campaigns (35 push, 29 maintain). The 6 more are Twin ranking-term campaigns it classes "size on hold (stock)" but still gives the top-of-search-only setting. With the 220 others, the total stays 290.</w:t>
       </w:r>
     </w:p>
     <w:p>
@@ -17898,7 +17984,7 @@
                 <w:sz w:val="17"/>
                 <w:szCs w:val="17"/>
               </w:rPr>
-              <w:t xml:space="preserve">Top of search only at its effective bid, capped at the market bound; never at the cost per click, which is what lost the auctions</w:t>
+              <w:t xml:space="preserve">Top of search only at its effective bid, never at the cost per click, which is what lost the auctions. Its keyword "king size silk sheets" is held at $4.60, above the engine's $4.24 bound, for Joseph to decide (Section 4.2)</w:t>
             </w:r>
           </w:p>
         </w:tc>
@@ -18950,6 +19036,25 @@
           <w:b/>
           <w:bCs/>
         </w:rPr>
+        <w:t xml:space="preserve">The three ranking bids above the engine's market bound</w:t>
+      </w:r>
+      <w:r>
+        <w:t xml:space="preserve">: hold them (recommended, and the engine's own rule), or bring them down to the bound. The largest is "king size silk sheets", $4.60 against $4.24, where campaigns holding 30%+ share pay $5.18.</w:t>
+      </w:r>
+    </w:p>
+    <w:p>
+      <w:pPr>
+        <w:pStyle w:val="ListParagraph"/>
+        <w:numPr>
+          <w:ilvl w:val="0"/>
+          <w:numId w:val="4"/>
+        </w:numPr>
+      </w:pPr>
+      <w:r>
+        <w:rPr>
+          <w:b/>
+          <w:bCs/>
+        </w:rPr>
         <w:t xml:space="preserve">Settings</w:t>
       </w:r>
       <w:r>
@@ -19013,7 +19118,7 @@
         </w:numPr>
       </w:pPr>
       <w:r>
-        <w:t xml:space="preserve">Wave 1, the 70 ranking campaigns: product ad to the ranking colour (King to King Black); top-of-search-only setting with each base = today's effective top-of-search bid ÷ 10 (capped at the market bound where the term has clicks to read it); budgets from the consolidated workbook; load the back-up product ads paused.</w:t>
+        <w:t xml:space="preserve">Wave 1, the 70 ranking campaigns: product ad to the ranking colour (King to King Black); top-of-search-only setting with each base = today's effective top-of-search bid ÷ 10 (no ranking keyword cut; the 3 above the engine's market bound held for a decision); budgets from the consolidated workbook; load the back-up product ads paused.</w:t>
       </w:r>
     </w:p>
     <w:p>
@@ -19474,19 +19579,10 @@
           <w:b/>
           <w:bCs/>
         </w:rPr>
-        <w:t xml:space="preserve">Deals.</w:t>
-      </w:r>
-      <w:r>
-        <w:t xml:space="preserve"> It doesn't read the deal calendar (</w:t>
-      </w:r>
-      <w:r>
-        <w:rPr>
-          <w:rFonts w:ascii="Consolas" w:cs="Consolas" w:eastAsia="Consolas" w:hAnsi="Consolas"/>
-        </w:rPr>
-        <w:t xml:space="preserve">engine_read</w:t>
-      </w:r>
-      <w:r>
-        <w:t xml:space="preserve"> null) although the three deals are on it, and its margin window includes six days of the last deal (A).</w:t>
+        <w:t xml:space="preserve">The switch rows name the wrong current colour.</w:t>
+      </w:r>
+      <w:r>
+        <w:t xml:space="preserve"> On rows 1924 and 1938 the switch row names a current colour (Queen Black; King Grey) that differs from the audit's own campaign record, which shows Full Black and Queen Black, as does Data Dive. The engine should build switch rows from the campaign record.</w:t>
       </w:r>
     </w:p>
     <w:p>
@@ -19502,10 +19598,19 @@
           <w:b/>
           <w:bCs/>
         </w:rPr>
-        <w:t xml:space="preserve">Margin.</w:t>
-      </w:r>
-      <w:r>
-        <w:t xml:space="preserve"> Use Sellerboard's realised margin per colour, at full price on normal days and at the deal price on deal days (A, B).</w:t>
+        <w:t xml:space="preserve">Deals.</w:t>
+      </w:r>
+      <w:r>
+        <w:t xml:space="preserve"> It doesn't read the deal calendar (</w:t>
+      </w:r>
+      <w:r>
+        <w:rPr>
+          <w:rFonts w:ascii="Consolas" w:cs="Consolas" w:eastAsia="Consolas" w:hAnsi="Consolas"/>
+        </w:rPr>
+        <w:t xml:space="preserve">engine_read</w:t>
+      </w:r>
+      <w:r>
+        <w:t xml:space="preserve"> null) although the three deals are on it, and its margin window includes six days of the last deal (A).</w:t>
       </w:r>
     </w:p>
     <w:p>
@@ -19521,10 +19626,10 @@
           <w:b/>
           <w:bCs/>
         </w:rPr>
-        <w:t xml:space="preserve">Focus scope.</w:t>
-      </w:r>
-      <w:r>
-        <w:t xml:space="preserve"> It judges focus by syntax group, so the Silk group, "silk sheets" included, was tapered by rule rather than by its data (B).</w:t>
+        <w:t xml:space="preserve">Margin.</w:t>
+      </w:r>
+      <w:r>
+        <w:t xml:space="preserve"> Use Sellerboard's realised margin per colour, at full price on normal days and at the deal price on deal days (A, B).</w:t>
       </w:r>
     </w:p>
     <w:p>
@@ -19540,10 +19645,29 @@
           <w:b/>
           <w:bCs/>
         </w:rPr>
+        <w:t xml:space="preserve">Focus scope.</w:t>
+      </w:r>
+      <w:r>
+        <w:t xml:space="preserve"> It judges focus by syntax group, so the Silk group, "silk sheets" included, was tapered by rule rather than by its data (B).</w:t>
+      </w:r>
+    </w:p>
+    <w:p>
+      <w:pPr>
+        <w:pStyle w:val="ListParagraph"/>
+        <w:numPr>
+          <w:ilvl w:val="0"/>
+          <w:numId w:val="2"/>
+        </w:numPr>
+      </w:pPr>
+      <w:r>
+        <w:rPr>
+          <w:b/>
+          <w:bCs/>
+        </w:rPr>
         <w:t xml:space="preserve">Cuts on ranking terms.</w:t>
       </w:r>
       <w:r>
-        <w:t xml:space="preserve"> The class steps cut ranking terms toward break-even in fixed percentages, although almost all advertising on this product runs above it. Price ranking terms on the effective top-of-search bid and the market bound (A, B).</w:t>
+        <w:t xml:space="preserve"> The class steps cut ranking terms toward break-even in fixed percentages, although almost all advertising on this product runs above it. Price ranking terms on the effective top-of-search bid; where it sits above the market bound, hold it for a person, as the engine already does (A, B).</w:t>
       </w:r>
     </w:p>
     <w:p>

</xml_diff>

<commit_message>
Satin 4 consolidated review: correct the above-bound list and price every live keyword
- Use the engine's own per-keyword above-bound flags (9) instead of the
  campaign bound applied to every keyword: drop the paused "silk sheet",
  add "queen sheet silk", "satin silk sheet set queen", "king silk sheet
  set", "twin sheets silk", "twin satin sheet sets", "gold silk sheets"
  and the paused Twin exact restart; say which wave each is in.
- Price every live keyword in campaigns going to 900% (4 wave-1 campaigns
  had 14 unpriced live keywords); no write on paused keywords; parse the
  plan's None-bid entries (10 keywords were left without a base).
- Flag the two maintained terms whose owner keyword is paused.

Co-Authored-By: Claude Opus 5.5 <noreply@anthropic.com>
Claude-Session: https://claude.ai/code/session_01YNgDp4Dr6K8rA49jFuXt44
</commit_message>
<xml_diff>
--- a/satin_deliverables/Satin4_US_audit_20260929_consolidated_review.docx
+++ b/satin_deliverables/Satin4_US_audit_20260929_consolidated_review.docx
@@ -124,7 +124,7 @@
         <w:t xml:space="preserve">effective bid</w:t>
       </w:r>
       <w:r>
-        <w:t xml:space="preserve"> (base × (1 + boost)), not the cost per click. Down-only bidding pays at or below the bid, so a bid set at the average cost per click loses the auctions that clear above it. On 20 ranking keywords Review B's bases would have cut the bid by 4–90% ("king size silk sheets" $4.60 → $3.40, "satin bed sheets full" $4.56 → $3.20). Where a ranking bid already sits above the engine's market bound (its own 90-day top-of-search cost per click + 15%), it is held, not cut, and left to Joseph, as the engine itself does. There are 3 such keywords. The setting goes out in two waves: the 70 ranking campaigns now, the 220 other exact campaigns after the 16 Oct read (Section 4.2).</w:t>
+        <w:t xml:space="preserve"> (base × (1 + boost)), not the cost per click. Down-only bidding pays at or below the bid, so a bid set at the average cost per click loses the auctions that clear above it. On 20 ranking keywords Review B's bases would have cut the bid by 4–90% ("king size silk sheets" $4.60 → $3.40, "satin bed sheets full" $4.56 → $3.20). Every live keyword in those campaigns gets a base, not only the one the plan names; left at today's base, a keyword would bid 10 times today at the top. Where the engine flags a ranking bid above its market bound (the campaign's own 90-day top-of-search cost per click + 15%), it is held, not cut, and left to Joseph, as the engine itself does. The engine flags 4 live ranking keywords and the paused Twin exact this plan restarts; it flags 4 more keywords outside the ranking set, which come down to the bound (Section 4.2). The setting goes out in two waves: the 70 ranking campaigns now, the 220 other exact campaigns after the 16 Oct read (Section 4.2).</w:t>
       </w:r>
     </w:p>
     <w:p>
@@ -5083,10 +5083,10 @@
           <w:b/>
           <w:bCs/>
         </w:rPr>
-        <w:t xml:space="preserve">Three ranking bids sit above the engine's market bound</w:t>
-      </w:r>
-      <w:r>
-        <w:t xml:space="preserve"> (its own 90-day read). They are held there, not cut, and flagged in the workbook for Joseph to decide, as the engine does ("does not climb past it and does not cut it, human-mandatory"):</w:t>
+        <w:t xml:space="preserve">Every live keyword is priced, not only the one in the plan's bid column.</w:t>
+      </w:r>
+      <w:r>
+        <w:t xml:space="preserve"> In 4 wave-1 campaigns the plan priced one keyword (in two of them, a paused one) and left 14 live keywords at today's base. At 900% those would bid 10 times today at the top (for example "king satin sheets set" in the "king satin sheet set" campaign: $2.35 base, $23.50 at the top). The workbook gives each its effective bid ÷ 10. Paused keywords get no write.</w:t>
       </w:r>
     </w:p>
     <w:p>
@@ -5098,7 +5098,1682 @@
         </w:numPr>
       </w:pPr>
       <w:r>
-        <w:t xml:space="preserve">"king size silk sheets": $4.60 against a bound of $4.24 (own cost per click $3.69 on 123 clicks). Campaigns holding 30%+ of top-of-search share pay $5.18, and its clicks halved at the same bid (Section 4.8), so a cut would be the wrong direction.</w:t>
+        <w:rPr>
+          <w:b/>
+          <w:bCs/>
+        </w:rPr>
+        <w:t xml:space="preserve">The engine flags 9 keywords above its market bound.</w:t>
+      </w:r>
+      <w:r>
+        <w:t xml:space="preserve"> It neither climbs nor cuts them and marks each one for a person (team document §6 / §8). The ranking ones are held for Joseph; the others come down to the bound for him to confirm:</w:t>
+      </w:r>
+    </w:p>
+    <w:tbl>
+      <w:tblPr>
+        <w:tblW w:type="dxa" w:w="14040"/>
+        <w:tblBorders>
+          <w:top w:val="single" w:color="auto" w:sz="4"/>
+          <w:left w:val="single" w:color="auto" w:sz="4"/>
+          <w:bottom w:val="single" w:color="auto" w:sz="4"/>
+          <w:right w:val="single" w:color="auto" w:sz="4"/>
+          <w:insideH w:val="single" w:color="auto" w:sz="4"/>
+          <w:insideV w:val="single" w:color="auto" w:sz="4"/>
+        </w:tblBorders>
+      </w:tblPr>
+      <w:tblGrid>
+        <w:gridCol w:w="2051"/>
+        <w:gridCol w:w="2115"/>
+        <w:gridCol w:w="833"/>
+        <w:gridCol w:w="1474"/>
+        <w:gridCol w:w="3333"/>
+        <w:gridCol w:w="4234"/>
+      </w:tblGrid>
+      <w:tr>
+        <w:trPr>
+          <w:tblHeader/>
+        </w:trPr>
+        <w:tc>
+          <w:tcPr>
+            <w:tcW w:type="dxa" w:w="2051"/>
+            <w:tcBorders>
+              <w:top w:val="single" w:color="BFBFBF" w:sz="4"/>
+              <w:left w:val="single" w:color="BFBFBF" w:sz="4"/>
+              <w:bottom w:val="single" w:color="BFBFBF" w:sz="4"/>
+              <w:right w:val="single" w:color="BFBFBF" w:sz="4"/>
+            </w:tcBorders>
+            <w:shd w:fill="1F3864" w:color="auto" w:val="clear"/>
+            <w:tcMar>
+              <w:top w:type="dxa" w:w="60"/>
+              <w:left w:type="dxa" w:w="90"/>
+              <w:bottom w:type="dxa" w:w="60"/>
+              <w:right w:type="dxa" w:w="90"/>
+            </w:tcMar>
+          </w:tcPr>
+          <w:p>
+            <w:r>
+              <w:rPr>
+                <w:b/>
+                <w:bCs/>
+                <w:color w:val="FFFFFF"/>
+                <w:sz w:val="17"/>
+                <w:szCs w:val="17"/>
+              </w:rPr>
+              <w:t xml:space="preserve">Keyword</w:t>
+            </w:r>
+          </w:p>
+        </w:tc>
+        <w:tc>
+          <w:tcPr>
+            <w:tcW w:type="dxa" w:w="2115"/>
+            <w:tcBorders>
+              <w:top w:val="single" w:color="BFBFBF" w:sz="4"/>
+              <w:left w:val="single" w:color="BFBFBF" w:sz="4"/>
+              <w:bottom w:val="single" w:color="BFBFBF" w:sz="4"/>
+              <w:right w:val="single" w:color="BFBFBF" w:sz="4"/>
+            </w:tcBorders>
+            <w:shd w:fill="1F3864" w:color="auto" w:val="clear"/>
+            <w:tcMar>
+              <w:top w:type="dxa" w:w="60"/>
+              <w:left w:type="dxa" w:w="90"/>
+              <w:bottom w:type="dxa" w:w="60"/>
+              <w:right w:type="dxa" w:w="90"/>
+            </w:tcMar>
+          </w:tcPr>
+          <w:p>
+            <w:r>
+              <w:rPr>
+                <w:b/>
+                <w:bCs/>
+                <w:color w:val="FFFFFF"/>
+                <w:sz w:val="17"/>
+                <w:szCs w:val="17"/>
+              </w:rPr>
+              <w:t xml:space="preserve">Campaign</w:t>
+            </w:r>
+          </w:p>
+        </w:tc>
+        <w:tc>
+          <w:tcPr>
+            <w:tcW w:type="dxa" w:w="833"/>
+            <w:tcBorders>
+              <w:top w:val="single" w:color="BFBFBF" w:sz="4"/>
+              <w:left w:val="single" w:color="BFBFBF" w:sz="4"/>
+              <w:bottom w:val="single" w:color="BFBFBF" w:sz="4"/>
+              <w:right w:val="single" w:color="BFBFBF" w:sz="4"/>
+            </w:tcBorders>
+            <w:shd w:fill="1F3864" w:color="auto" w:val="clear"/>
+            <w:tcMar>
+              <w:top w:type="dxa" w:w="60"/>
+              <w:left w:type="dxa" w:w="90"/>
+              <w:bottom w:type="dxa" w:w="60"/>
+              <w:right w:type="dxa" w:w="90"/>
+            </w:tcMar>
+          </w:tcPr>
+          <w:p>
+            <w:r>
+              <w:rPr>
+                <w:b/>
+                <w:bCs/>
+                <w:color w:val="FFFFFF"/>
+                <w:sz w:val="17"/>
+                <w:szCs w:val="17"/>
+              </w:rPr>
+              <w:t xml:space="preserve">Wave</w:t>
+            </w:r>
+          </w:p>
+        </w:tc>
+        <w:tc>
+          <w:tcPr>
+            <w:tcW w:type="dxa" w:w="1474"/>
+            <w:tcBorders>
+              <w:top w:val="single" w:color="BFBFBF" w:sz="4"/>
+              <w:left w:val="single" w:color="BFBFBF" w:sz="4"/>
+              <w:bottom w:val="single" w:color="BFBFBF" w:sz="4"/>
+              <w:right w:val="single" w:color="BFBFBF" w:sz="4"/>
+            </w:tcBorders>
+            <w:shd w:fill="1F3864" w:color="auto" w:val="clear"/>
+            <w:tcMar>
+              <w:top w:type="dxa" w:w="60"/>
+              <w:left w:type="dxa" w:w="90"/>
+              <w:bottom w:type="dxa" w:w="60"/>
+              <w:right w:type="dxa" w:w="90"/>
+            </w:tcMar>
+          </w:tcPr>
+          <w:p>
+            <w:r>
+              <w:rPr>
+                <w:b/>
+                <w:bCs/>
+                <w:color w:val="FFFFFF"/>
+                <w:sz w:val="17"/>
+                <w:szCs w:val="17"/>
+              </w:rPr>
+              <w:t xml:space="preserve">Top of search now</w:t>
+            </w:r>
+          </w:p>
+        </w:tc>
+        <w:tc>
+          <w:tcPr>
+            <w:tcW w:type="dxa" w:w="3333"/>
+            <w:tcBorders>
+              <w:top w:val="single" w:color="BFBFBF" w:sz="4"/>
+              <w:left w:val="single" w:color="BFBFBF" w:sz="4"/>
+              <w:bottom w:val="single" w:color="BFBFBF" w:sz="4"/>
+              <w:right w:val="single" w:color="BFBFBF" w:sz="4"/>
+            </w:tcBorders>
+            <w:shd w:fill="1F3864" w:color="auto" w:val="clear"/>
+            <w:tcMar>
+              <w:top w:type="dxa" w:w="60"/>
+              <w:left w:type="dxa" w:w="90"/>
+              <w:bottom w:type="dxa" w:w="60"/>
+              <w:right w:type="dxa" w:w="90"/>
+            </w:tcMar>
+          </w:tcPr>
+          <w:p>
+            <w:r>
+              <w:rPr>
+                <w:b/>
+                <w:bCs/>
+                <w:color w:val="FFFFFF"/>
+                <w:sz w:val="17"/>
+                <w:szCs w:val="17"/>
+              </w:rPr>
+              <w:t xml:space="preserve">Engine bound</w:t>
+            </w:r>
+          </w:p>
+        </w:tc>
+        <w:tc>
+          <w:tcPr>
+            <w:tcW w:type="dxa" w:w="4234"/>
+            <w:tcBorders>
+              <w:top w:val="single" w:color="BFBFBF" w:sz="4"/>
+              <w:left w:val="single" w:color="BFBFBF" w:sz="4"/>
+              <w:bottom w:val="single" w:color="BFBFBF" w:sz="4"/>
+              <w:right w:val="single" w:color="BFBFBF" w:sz="4"/>
+            </w:tcBorders>
+            <w:shd w:fill="1F3864" w:color="auto" w:val="clear"/>
+            <w:tcMar>
+              <w:top w:type="dxa" w:w="60"/>
+              <w:left w:type="dxa" w:w="90"/>
+              <w:bottom w:type="dxa" w:w="60"/>
+              <w:right w:type="dxa" w:w="90"/>
+            </w:tcMar>
+          </w:tcPr>
+          <w:p>
+            <w:r>
+              <w:rPr>
+                <w:b/>
+                <w:bCs/>
+                <w:color w:val="FFFFFF"/>
+                <w:sz w:val="17"/>
+                <w:szCs w:val="17"/>
+              </w:rPr>
+              <w:t xml:space="preserve">Call (Joseph decides)</w:t>
+            </w:r>
+          </w:p>
+        </w:tc>
+      </w:tr>
+      <w:tr>
+        <w:trPr>
+          <w:tblHeader w:val="off"/>
+        </w:trPr>
+        <w:tc>
+          <w:tcPr>
+            <w:tcW w:type="dxa" w:w="2051"/>
+            <w:tcBorders>
+              <w:top w:val="single" w:color="BFBFBF" w:sz="4"/>
+              <w:left w:val="single" w:color="BFBFBF" w:sz="4"/>
+              <w:bottom w:val="single" w:color="BFBFBF" w:sz="4"/>
+              <w:right w:val="single" w:color="BFBFBF" w:sz="4"/>
+            </w:tcBorders>
+            <w:tcMar>
+              <w:top w:type="dxa" w:w="60"/>
+              <w:left w:type="dxa" w:w="90"/>
+              <w:bottom w:type="dxa" w:w="60"/>
+              <w:right w:type="dxa" w:w="90"/>
+            </w:tcMar>
+          </w:tcPr>
+          <w:p>
+            <w:r>
+              <w:rPr>
+                <w:sz w:val="17"/>
+                <w:szCs w:val="17"/>
+              </w:rPr>
+              <w:t xml:space="preserve">king size silk sheets</w:t>
+            </w:r>
+          </w:p>
+        </w:tc>
+        <w:tc>
+          <w:tcPr>
+            <w:tcW w:type="dxa" w:w="2115"/>
+            <w:tcBorders>
+              <w:top w:val="single" w:color="BFBFBF" w:sz="4"/>
+              <w:left w:val="single" w:color="BFBFBF" w:sz="4"/>
+              <w:bottom w:val="single" w:color="BFBFBF" w:sz="4"/>
+              <w:right w:val="single" w:color="BFBFBF" w:sz="4"/>
+            </w:tcBorders>
+            <w:tcMar>
+              <w:top w:type="dxa" w:w="60"/>
+              <w:left w:type="dxa" w:w="90"/>
+              <w:bottom w:type="dxa" w:w="60"/>
+              <w:right w:type="dxa" w:w="90"/>
+            </w:tcMar>
+          </w:tcPr>
+          <w:p>
+            <w:r>
+              <w:rPr>
+                <w:sz w:val="17"/>
+                <w:szCs w:val="17"/>
+              </w:rPr>
+              <w:t xml:space="preserve">[Silk|King] ranking</w:t>
+            </w:r>
+          </w:p>
+        </w:tc>
+        <w:tc>
+          <w:tcPr>
+            <w:tcW w:type="dxa" w:w="833"/>
+            <w:tcBorders>
+              <w:top w:val="single" w:color="BFBFBF" w:sz="4"/>
+              <w:left w:val="single" w:color="BFBFBF" w:sz="4"/>
+              <w:bottom w:val="single" w:color="BFBFBF" w:sz="4"/>
+              <w:right w:val="single" w:color="BFBFBF" w:sz="4"/>
+            </w:tcBorders>
+            <w:tcMar>
+              <w:top w:type="dxa" w:w="60"/>
+              <w:left w:type="dxa" w:w="90"/>
+              <w:bottom w:type="dxa" w:w="60"/>
+              <w:right w:type="dxa" w:w="90"/>
+            </w:tcMar>
+          </w:tcPr>
+          <w:p>
+            <w:r>
+              <w:rPr>
+                <w:sz w:val="17"/>
+                <w:szCs w:val="17"/>
+              </w:rPr>
+              <w:t xml:space="preserve">1</w:t>
+            </w:r>
+          </w:p>
+        </w:tc>
+        <w:tc>
+          <w:tcPr>
+            <w:tcW w:type="dxa" w:w="1474"/>
+            <w:tcBorders>
+              <w:top w:val="single" w:color="BFBFBF" w:sz="4"/>
+              <w:left w:val="single" w:color="BFBFBF" w:sz="4"/>
+              <w:bottom w:val="single" w:color="BFBFBF" w:sz="4"/>
+              <w:right w:val="single" w:color="BFBFBF" w:sz="4"/>
+            </w:tcBorders>
+            <w:tcMar>
+              <w:top w:type="dxa" w:w="60"/>
+              <w:left w:type="dxa" w:w="90"/>
+              <w:bottom w:type="dxa" w:w="60"/>
+              <w:right w:type="dxa" w:w="90"/>
+            </w:tcMar>
+          </w:tcPr>
+          <w:p>
+            <w:r>
+              <w:rPr>
+                <w:sz w:val="17"/>
+                <w:szCs w:val="17"/>
+              </w:rPr>
+              <w:t xml:space="preserve">$4.60</w:t>
+            </w:r>
+          </w:p>
+        </w:tc>
+        <w:tc>
+          <w:tcPr>
+            <w:tcW w:type="dxa" w:w="3333"/>
+            <w:tcBorders>
+              <w:top w:val="single" w:color="BFBFBF" w:sz="4"/>
+              <w:left w:val="single" w:color="BFBFBF" w:sz="4"/>
+              <w:bottom w:val="single" w:color="BFBFBF" w:sz="4"/>
+              <w:right w:val="single" w:color="BFBFBF" w:sz="4"/>
+            </w:tcBorders>
+            <w:tcMar>
+              <w:top w:type="dxa" w:w="60"/>
+              <w:left w:type="dxa" w:w="90"/>
+              <w:bottom w:type="dxa" w:w="60"/>
+              <w:right w:type="dxa" w:w="90"/>
+            </w:tcMar>
+          </w:tcPr>
+          <w:p>
+            <w:r>
+              <w:rPr>
+                <w:sz w:val="17"/>
+                <w:szCs w:val="17"/>
+              </w:rPr>
+              <w:t xml:space="preserve">$4.24 (own cost per click $3.69 on 123 clicks)</w:t>
+            </w:r>
+          </w:p>
+        </w:tc>
+        <w:tc>
+          <w:tcPr>
+            <w:tcW w:type="dxa" w:w="4234"/>
+            <w:tcBorders>
+              <w:top w:val="single" w:color="BFBFBF" w:sz="4"/>
+              <w:left w:val="single" w:color="BFBFBF" w:sz="4"/>
+              <w:bottom w:val="single" w:color="BFBFBF" w:sz="4"/>
+              <w:right w:val="single" w:color="BFBFBF" w:sz="4"/>
+            </w:tcBorders>
+            <w:tcMar>
+              <w:top w:type="dxa" w:w="60"/>
+              <w:left w:type="dxa" w:w="90"/>
+              <w:bottom w:type="dxa" w:w="60"/>
+              <w:right w:type="dxa" w:w="90"/>
+            </w:tcMar>
+          </w:tcPr>
+          <w:p>
+            <w:r>
+              <w:rPr>
+                <w:sz w:val="17"/>
+                <w:szCs w:val="17"/>
+              </w:rPr>
+              <w:t xml:space="preserve">Hold. Campaigns holding 30%+ of top-of-search share pay $5.18, and its clicks halved at the same bid (Section 4.8), so a cut would be the wrong direction</w:t>
+            </w:r>
+          </w:p>
+        </w:tc>
+      </w:tr>
+      <w:tr>
+        <w:trPr>
+          <w:tblHeader w:val="off"/>
+        </w:trPr>
+        <w:tc>
+          <w:tcPr>
+            <w:tcW w:type="dxa" w:w="2051"/>
+            <w:tcBorders>
+              <w:top w:val="single" w:color="BFBFBF" w:sz="4"/>
+              <w:left w:val="single" w:color="BFBFBF" w:sz="4"/>
+              <w:bottom w:val="single" w:color="BFBFBF" w:sz="4"/>
+              <w:right w:val="single" w:color="BFBFBF" w:sz="4"/>
+            </w:tcBorders>
+            <w:tcMar>
+              <w:top w:type="dxa" w:w="60"/>
+              <w:left w:type="dxa" w:w="90"/>
+              <w:bottom w:type="dxa" w:w="60"/>
+              <w:right w:type="dxa" w:w="90"/>
+            </w:tcMar>
+          </w:tcPr>
+          <w:p>
+            <w:r>
+              <w:rPr>
+                <w:sz w:val="17"/>
+                <w:szCs w:val="17"/>
+              </w:rPr>
+              <w:t xml:space="preserve">silk sheets twin</w:t>
+            </w:r>
+          </w:p>
+        </w:tc>
+        <w:tc>
+          <w:tcPr>
+            <w:tcW w:type="dxa" w:w="2115"/>
+            <w:tcBorders>
+              <w:top w:val="single" w:color="BFBFBF" w:sz="4"/>
+              <w:left w:val="single" w:color="BFBFBF" w:sz="4"/>
+              <w:bottom w:val="single" w:color="BFBFBF" w:sz="4"/>
+              <w:right w:val="single" w:color="BFBFBF" w:sz="4"/>
+            </w:tcBorders>
+            <w:tcMar>
+              <w:top w:type="dxa" w:w="60"/>
+              <w:left w:type="dxa" w:w="90"/>
+              <w:bottom w:type="dxa" w:w="60"/>
+              <w:right w:type="dxa" w:w="90"/>
+            </w:tcMar>
+          </w:tcPr>
+          <w:p>
+            <w:r>
+              <w:rPr>
+                <w:sz w:val="17"/>
+                <w:szCs w:val="17"/>
+              </w:rPr>
+              <w:t xml:space="preserve">[Silk|Twin] ranking</w:t>
+            </w:r>
+          </w:p>
+        </w:tc>
+        <w:tc>
+          <w:tcPr>
+            <w:tcW w:type="dxa" w:w="833"/>
+            <w:tcBorders>
+              <w:top w:val="single" w:color="BFBFBF" w:sz="4"/>
+              <w:left w:val="single" w:color="BFBFBF" w:sz="4"/>
+              <w:bottom w:val="single" w:color="BFBFBF" w:sz="4"/>
+              <w:right w:val="single" w:color="BFBFBF" w:sz="4"/>
+            </w:tcBorders>
+            <w:tcMar>
+              <w:top w:type="dxa" w:w="60"/>
+              <w:left w:type="dxa" w:w="90"/>
+              <w:bottom w:type="dxa" w:w="60"/>
+              <w:right w:type="dxa" w:w="90"/>
+            </w:tcMar>
+          </w:tcPr>
+          <w:p>
+            <w:r>
+              <w:rPr>
+                <w:sz w:val="17"/>
+                <w:szCs w:val="17"/>
+              </w:rPr>
+              <w:t xml:space="preserve">1</w:t>
+            </w:r>
+          </w:p>
+        </w:tc>
+        <w:tc>
+          <w:tcPr>
+            <w:tcW w:type="dxa" w:w="1474"/>
+            <w:tcBorders>
+              <w:top w:val="single" w:color="BFBFBF" w:sz="4"/>
+              <w:left w:val="single" w:color="BFBFBF" w:sz="4"/>
+              <w:bottom w:val="single" w:color="BFBFBF" w:sz="4"/>
+              <w:right w:val="single" w:color="BFBFBF" w:sz="4"/>
+            </w:tcBorders>
+            <w:tcMar>
+              <w:top w:type="dxa" w:w="60"/>
+              <w:left w:type="dxa" w:w="90"/>
+              <w:bottom w:type="dxa" w:w="60"/>
+              <w:right w:type="dxa" w:w="90"/>
+            </w:tcMar>
+          </w:tcPr>
+          <w:p>
+            <w:r>
+              <w:rPr>
+                <w:sz w:val="17"/>
+                <w:szCs w:val="17"/>
+              </w:rPr>
+              <w:t xml:space="preserve">$3.52</w:t>
+            </w:r>
+          </w:p>
+        </w:tc>
+        <w:tc>
+          <w:tcPr>
+            <w:tcW w:type="dxa" w:w="3333"/>
+            <w:tcBorders>
+              <w:top w:val="single" w:color="BFBFBF" w:sz="4"/>
+              <w:left w:val="single" w:color="BFBFBF" w:sz="4"/>
+              <w:bottom w:val="single" w:color="BFBFBF" w:sz="4"/>
+              <w:right w:val="single" w:color="BFBFBF" w:sz="4"/>
+            </w:tcBorders>
+            <w:tcMar>
+              <w:top w:type="dxa" w:w="60"/>
+              <w:left w:type="dxa" w:w="90"/>
+              <w:bottom w:type="dxa" w:w="60"/>
+              <w:right w:type="dxa" w:w="90"/>
+            </w:tcMar>
+          </w:tcPr>
+          <w:p>
+            <w:r>
+              <w:rPr>
+                <w:sz w:val="17"/>
+                <w:szCs w:val="17"/>
+              </w:rPr>
+              <w:t xml:space="preserve">$3.49</w:t>
+            </w:r>
+          </w:p>
+        </w:tc>
+        <w:tc>
+          <w:tcPr>
+            <w:tcW w:type="dxa" w:w="4234"/>
+            <w:tcBorders>
+              <w:top w:val="single" w:color="BFBFBF" w:sz="4"/>
+              <w:left w:val="single" w:color="BFBFBF" w:sz="4"/>
+              <w:bottom w:val="single" w:color="BFBFBF" w:sz="4"/>
+              <w:right w:val="single" w:color="BFBFBF" w:sz="4"/>
+            </w:tcBorders>
+            <w:tcMar>
+              <w:top w:type="dxa" w:w="60"/>
+              <w:left w:type="dxa" w:w="90"/>
+              <w:bottom w:type="dxa" w:w="60"/>
+              <w:right w:type="dxa" w:w="90"/>
+            </w:tcMar>
+          </w:tcPr>
+          <w:p>
+            <w:r>
+              <w:rPr>
+                <w:sz w:val="17"/>
+                <w:szCs w:val="17"/>
+              </w:rPr>
+              <w:t xml:space="preserve">Hold</w:t>
+            </w:r>
+          </w:p>
+        </w:tc>
+      </w:tr>
+      <w:tr>
+        <w:trPr>
+          <w:tblHeader w:val="off"/>
+        </w:trPr>
+        <w:tc>
+          <w:tcPr>
+            <w:tcW w:type="dxa" w:w="2051"/>
+            <w:tcBorders>
+              <w:top w:val="single" w:color="BFBFBF" w:sz="4"/>
+              <w:left w:val="single" w:color="BFBFBF" w:sz="4"/>
+              <w:bottom w:val="single" w:color="BFBFBF" w:sz="4"/>
+              <w:right w:val="single" w:color="BFBFBF" w:sz="4"/>
+            </w:tcBorders>
+            <w:tcMar>
+              <w:top w:type="dxa" w:w="60"/>
+              <w:left w:type="dxa" w:w="90"/>
+              <w:bottom w:type="dxa" w:w="60"/>
+              <w:right w:type="dxa" w:w="90"/>
+            </w:tcMar>
+          </w:tcPr>
+          <w:p>
+            <w:r>
+              <w:rPr>
+                <w:sz w:val="17"/>
+                <w:szCs w:val="17"/>
+              </w:rPr>
+              <w:t xml:space="preserve">queen sheet silk</w:t>
+            </w:r>
+          </w:p>
+        </w:tc>
+        <w:tc>
+          <w:tcPr>
+            <w:tcW w:type="dxa" w:w="2115"/>
+            <w:tcBorders>
+              <w:top w:val="single" w:color="BFBFBF" w:sz="4"/>
+              <w:left w:val="single" w:color="BFBFBF" w:sz="4"/>
+              <w:bottom w:val="single" w:color="BFBFBF" w:sz="4"/>
+              <w:right w:val="single" w:color="BFBFBF" w:sz="4"/>
+            </w:tcBorders>
+            <w:tcMar>
+              <w:top w:type="dxa" w:w="60"/>
+              <w:left w:type="dxa" w:w="90"/>
+              <w:bottom w:type="dxa" w:w="60"/>
+              <w:right w:type="dxa" w:w="90"/>
+            </w:tcMar>
+          </w:tcPr>
+          <w:p>
+            <w:r>
+              <w:rPr>
+                <w:sz w:val="17"/>
+                <w:szCs w:val="17"/>
+              </w:rPr>
+              <w:t xml:space="preserve">"queen sheet silk" ranking</w:t>
+            </w:r>
+          </w:p>
+        </w:tc>
+        <w:tc>
+          <w:tcPr>
+            <w:tcW w:type="dxa" w:w="833"/>
+            <w:tcBorders>
+              <w:top w:val="single" w:color="BFBFBF" w:sz="4"/>
+              <w:left w:val="single" w:color="BFBFBF" w:sz="4"/>
+              <w:bottom w:val="single" w:color="BFBFBF" w:sz="4"/>
+              <w:right w:val="single" w:color="BFBFBF" w:sz="4"/>
+            </w:tcBorders>
+            <w:tcMar>
+              <w:top w:type="dxa" w:w="60"/>
+              <w:left w:type="dxa" w:w="90"/>
+              <w:bottom w:type="dxa" w:w="60"/>
+              <w:right w:type="dxa" w:w="90"/>
+            </w:tcMar>
+          </w:tcPr>
+          <w:p>
+            <w:r>
+              <w:rPr>
+                <w:sz w:val="17"/>
+                <w:szCs w:val="17"/>
+              </w:rPr>
+              <w:t xml:space="preserve">1</w:t>
+            </w:r>
+          </w:p>
+        </w:tc>
+        <w:tc>
+          <w:tcPr>
+            <w:tcW w:type="dxa" w:w="1474"/>
+            <w:tcBorders>
+              <w:top w:val="single" w:color="BFBFBF" w:sz="4"/>
+              <w:left w:val="single" w:color="BFBFBF" w:sz="4"/>
+              <w:bottom w:val="single" w:color="BFBFBF" w:sz="4"/>
+              <w:right w:val="single" w:color="BFBFBF" w:sz="4"/>
+            </w:tcBorders>
+            <w:tcMar>
+              <w:top w:type="dxa" w:w="60"/>
+              <w:left w:type="dxa" w:w="90"/>
+              <w:bottom w:type="dxa" w:w="60"/>
+              <w:right w:type="dxa" w:w="90"/>
+            </w:tcMar>
+          </w:tcPr>
+          <w:p>
+            <w:r>
+              <w:rPr>
+                <w:sz w:val="17"/>
+                <w:szCs w:val="17"/>
+              </w:rPr>
+              <w:t xml:space="preserve">$3.66</w:t>
+            </w:r>
+          </w:p>
+        </w:tc>
+        <w:tc>
+          <w:tcPr>
+            <w:tcW w:type="dxa" w:w="3333"/>
+            <w:tcBorders>
+              <w:top w:val="single" w:color="BFBFBF" w:sz="4"/>
+              <w:left w:val="single" w:color="BFBFBF" w:sz="4"/>
+              <w:bottom w:val="single" w:color="BFBFBF" w:sz="4"/>
+              <w:right w:val="single" w:color="BFBFBF" w:sz="4"/>
+            </w:tcBorders>
+            <w:tcMar>
+              <w:top w:type="dxa" w:w="60"/>
+              <w:left w:type="dxa" w:w="90"/>
+              <w:bottom w:type="dxa" w:w="60"/>
+              <w:right w:type="dxa" w:w="90"/>
+            </w:tcMar>
+          </w:tcPr>
+          <w:p>
+            <w:r>
+              <w:rPr>
+                <w:sz w:val="17"/>
+                <w:szCs w:val="17"/>
+              </w:rPr>
+              <w:t xml:space="preserve">$3.42 (own cost per click $2.98 on 44 clicks)</w:t>
+            </w:r>
+          </w:p>
+        </w:tc>
+        <w:tc>
+          <w:tcPr>
+            <w:tcW w:type="dxa" w:w="4234"/>
+            <w:tcBorders>
+              <w:top w:val="single" w:color="BFBFBF" w:sz="4"/>
+              <w:left w:val="single" w:color="BFBFBF" w:sz="4"/>
+              <w:bottom w:val="single" w:color="BFBFBF" w:sz="4"/>
+              <w:right w:val="single" w:color="BFBFBF" w:sz="4"/>
+            </w:tcBorders>
+            <w:tcMar>
+              <w:top w:type="dxa" w:w="60"/>
+              <w:left w:type="dxa" w:w="90"/>
+              <w:bottom w:type="dxa" w:w="60"/>
+              <w:right w:type="dxa" w:w="90"/>
+            </w:tcMar>
+          </w:tcPr>
+          <w:p>
+            <w:r>
+              <w:rPr>
+                <w:sz w:val="17"/>
+                <w:szCs w:val="17"/>
+              </w:rPr>
+              <w:t xml:space="preserve">Hold</w:t>
+            </w:r>
+          </w:p>
+        </w:tc>
+      </w:tr>
+      <w:tr>
+        <w:trPr>
+          <w:tblHeader w:val="off"/>
+        </w:trPr>
+        <w:tc>
+          <w:tcPr>
+            <w:tcW w:type="dxa" w:w="2051"/>
+            <w:tcBorders>
+              <w:top w:val="single" w:color="BFBFBF" w:sz="4"/>
+              <w:left w:val="single" w:color="BFBFBF" w:sz="4"/>
+              <w:bottom w:val="single" w:color="BFBFBF" w:sz="4"/>
+              <w:right w:val="single" w:color="BFBFBF" w:sz="4"/>
+            </w:tcBorders>
+            <w:tcMar>
+              <w:top w:type="dxa" w:w="60"/>
+              <w:left w:type="dxa" w:w="90"/>
+              <w:bottom w:type="dxa" w:w="60"/>
+              <w:right w:type="dxa" w:w="90"/>
+            </w:tcMar>
+          </w:tcPr>
+          <w:p>
+            <w:r>
+              <w:rPr>
+                <w:sz w:val="17"/>
+                <w:szCs w:val="17"/>
+              </w:rPr>
+              <w:t xml:space="preserve">satin silk sheet set queen</w:t>
+            </w:r>
+          </w:p>
+        </w:tc>
+        <w:tc>
+          <w:tcPr>
+            <w:tcW w:type="dxa" w:w="2115"/>
+            <w:tcBorders>
+              <w:top w:val="single" w:color="BFBFBF" w:sz="4"/>
+              <w:left w:val="single" w:color="BFBFBF" w:sz="4"/>
+              <w:bottom w:val="single" w:color="BFBFBF" w:sz="4"/>
+              <w:right w:val="single" w:color="BFBFBF" w:sz="4"/>
+            </w:tcBorders>
+            <w:tcMar>
+              <w:top w:type="dxa" w:w="60"/>
+              <w:left w:type="dxa" w:w="90"/>
+              <w:bottom w:type="dxa" w:w="60"/>
+              <w:right w:type="dxa" w:w="90"/>
+            </w:tcMar>
+          </w:tcPr>
+          <w:p>
+            <w:r>
+              <w:rPr>
+                <w:sz w:val="17"/>
+                <w:szCs w:val="17"/>
+              </w:rPr>
+              <w:t xml:space="preserve">"queen sheet silk" ranking</w:t>
+            </w:r>
+          </w:p>
+        </w:tc>
+        <w:tc>
+          <w:tcPr>
+            <w:tcW w:type="dxa" w:w="833"/>
+            <w:tcBorders>
+              <w:top w:val="single" w:color="BFBFBF" w:sz="4"/>
+              <w:left w:val="single" w:color="BFBFBF" w:sz="4"/>
+              <w:bottom w:val="single" w:color="BFBFBF" w:sz="4"/>
+              <w:right w:val="single" w:color="BFBFBF" w:sz="4"/>
+            </w:tcBorders>
+            <w:tcMar>
+              <w:top w:type="dxa" w:w="60"/>
+              <w:left w:type="dxa" w:w="90"/>
+              <w:bottom w:type="dxa" w:w="60"/>
+              <w:right w:type="dxa" w:w="90"/>
+            </w:tcMar>
+          </w:tcPr>
+          <w:p>
+            <w:r>
+              <w:rPr>
+                <w:sz w:val="17"/>
+                <w:szCs w:val="17"/>
+              </w:rPr>
+              <w:t xml:space="preserve">1</w:t>
+            </w:r>
+          </w:p>
+        </w:tc>
+        <w:tc>
+          <w:tcPr>
+            <w:tcW w:type="dxa" w:w="1474"/>
+            <w:tcBorders>
+              <w:top w:val="single" w:color="BFBFBF" w:sz="4"/>
+              <w:left w:val="single" w:color="BFBFBF" w:sz="4"/>
+              <w:bottom w:val="single" w:color="BFBFBF" w:sz="4"/>
+              <w:right w:val="single" w:color="BFBFBF" w:sz="4"/>
+            </w:tcBorders>
+            <w:tcMar>
+              <w:top w:type="dxa" w:w="60"/>
+              <w:left w:type="dxa" w:w="90"/>
+              <w:bottom w:type="dxa" w:w="60"/>
+              <w:right w:type="dxa" w:w="90"/>
+            </w:tcMar>
+          </w:tcPr>
+          <w:p>
+            <w:r>
+              <w:rPr>
+                <w:sz w:val="17"/>
+                <w:szCs w:val="17"/>
+              </w:rPr>
+              <w:t xml:space="preserve">$3.80</w:t>
+            </w:r>
+          </w:p>
+        </w:tc>
+        <w:tc>
+          <w:tcPr>
+            <w:tcW w:type="dxa" w:w="3333"/>
+            <w:tcBorders>
+              <w:top w:val="single" w:color="BFBFBF" w:sz="4"/>
+              <w:left w:val="single" w:color="BFBFBF" w:sz="4"/>
+              <w:bottom w:val="single" w:color="BFBFBF" w:sz="4"/>
+              <w:right w:val="single" w:color="BFBFBF" w:sz="4"/>
+            </w:tcBorders>
+            <w:tcMar>
+              <w:top w:type="dxa" w:w="60"/>
+              <w:left w:type="dxa" w:w="90"/>
+              <w:bottom w:type="dxa" w:w="60"/>
+              <w:right w:type="dxa" w:w="90"/>
+            </w:tcMar>
+          </w:tcPr>
+          <w:p>
+            <w:r>
+              <w:rPr>
+                <w:sz w:val="17"/>
+                <w:szCs w:val="17"/>
+              </w:rPr>
+              <w:t xml:space="preserve">$3.42</w:t>
+            </w:r>
+          </w:p>
+        </w:tc>
+        <w:tc>
+          <w:tcPr>
+            <w:tcW w:type="dxa" w:w="4234"/>
+            <w:tcBorders>
+              <w:top w:val="single" w:color="BFBFBF" w:sz="4"/>
+              <w:left w:val="single" w:color="BFBFBF" w:sz="4"/>
+              <w:bottom w:val="single" w:color="BFBFBF" w:sz="4"/>
+              <w:right w:val="single" w:color="BFBFBF" w:sz="4"/>
+            </w:tcBorders>
+            <w:tcMar>
+              <w:top w:type="dxa" w:w="60"/>
+              <w:left w:type="dxa" w:w="90"/>
+              <w:bottom w:type="dxa" w:w="60"/>
+              <w:right w:type="dxa" w:w="90"/>
+            </w:tcMar>
+          </w:tcPr>
+          <w:p>
+            <w:r>
+              <w:rPr>
+                <w:sz w:val="17"/>
+                <w:szCs w:val="17"/>
+              </w:rPr>
+              <w:t xml:space="preserve">Hold; 0 clicks in 90 days, so it costs nothing either way</w:t>
+            </w:r>
+          </w:p>
+        </w:tc>
+      </w:tr>
+      <w:tr>
+        <w:trPr>
+          <w:tblHeader w:val="off"/>
+        </w:trPr>
+        <w:tc>
+          <w:tcPr>
+            <w:tcW w:type="dxa" w:w="2051"/>
+            <w:tcBorders>
+              <w:top w:val="single" w:color="BFBFBF" w:sz="4"/>
+              <w:left w:val="single" w:color="BFBFBF" w:sz="4"/>
+              <w:bottom w:val="single" w:color="BFBFBF" w:sz="4"/>
+              <w:right w:val="single" w:color="BFBFBF" w:sz="4"/>
+            </w:tcBorders>
+            <w:tcMar>
+              <w:top w:type="dxa" w:w="60"/>
+              <w:left w:type="dxa" w:w="90"/>
+              <w:bottom w:type="dxa" w:w="60"/>
+              <w:right w:type="dxa" w:w="90"/>
+            </w:tcMar>
+          </w:tcPr>
+          <w:p>
+            <w:r>
+              <w:rPr>
+                <w:sz w:val="17"/>
+                <w:szCs w:val="17"/>
+              </w:rPr>
+              <w:t xml:space="preserve">silk twin bed sheets</w:t>
+            </w:r>
+          </w:p>
+        </w:tc>
+        <w:tc>
+          <w:tcPr>
+            <w:tcW w:type="dxa" w:w="2115"/>
+            <w:tcBorders>
+              <w:top w:val="single" w:color="BFBFBF" w:sz="4"/>
+              <w:left w:val="single" w:color="BFBFBF" w:sz="4"/>
+              <w:bottom w:val="single" w:color="BFBFBF" w:sz="4"/>
+              <w:right w:val="single" w:color="BFBFBF" w:sz="4"/>
+            </w:tcBorders>
+            <w:tcMar>
+              <w:top w:type="dxa" w:w="60"/>
+              <w:left w:type="dxa" w:w="90"/>
+              <w:bottom w:type="dxa" w:w="60"/>
+              <w:right w:type="dxa" w:w="90"/>
+            </w:tcMar>
+          </w:tcPr>
+          <w:p>
+            <w:r>
+              <w:rPr>
+                <w:sz w:val="17"/>
+                <w:szCs w:val="17"/>
+              </w:rPr>
+              <w:t xml:space="preserve">[Silk|Twin] ranking, paused</w:t>
+            </w:r>
+          </w:p>
+        </w:tc>
+        <w:tc>
+          <w:tcPr>
+            <w:tcW w:type="dxa" w:w="833"/>
+            <w:tcBorders>
+              <w:top w:val="single" w:color="BFBFBF" w:sz="4"/>
+              <w:left w:val="single" w:color="BFBFBF" w:sz="4"/>
+              <w:bottom w:val="single" w:color="BFBFBF" w:sz="4"/>
+              <w:right w:val="single" w:color="BFBFBF" w:sz="4"/>
+            </w:tcBorders>
+            <w:tcMar>
+              <w:top w:type="dxa" w:w="60"/>
+              <w:left w:type="dxa" w:w="90"/>
+              <w:bottom w:type="dxa" w:w="60"/>
+              <w:right w:type="dxa" w:w="90"/>
+            </w:tcMar>
+          </w:tcPr>
+          <w:p>
+            <w:r>
+              <w:rPr>
+                <w:sz w:val="17"/>
+                <w:szCs w:val="17"/>
+              </w:rPr>
+              <w:t xml:space="preserve">Restart</w:t>
+            </w:r>
+          </w:p>
+        </w:tc>
+        <w:tc>
+          <w:tcPr>
+            <w:tcW w:type="dxa" w:w="1474"/>
+            <w:tcBorders>
+              <w:top w:val="single" w:color="BFBFBF" w:sz="4"/>
+              <w:left w:val="single" w:color="BFBFBF" w:sz="4"/>
+              <w:bottom w:val="single" w:color="BFBFBF" w:sz="4"/>
+              <w:right w:val="single" w:color="BFBFBF" w:sz="4"/>
+            </w:tcBorders>
+            <w:tcMar>
+              <w:top w:type="dxa" w:w="60"/>
+              <w:left w:type="dxa" w:w="90"/>
+              <w:bottom w:type="dxa" w:w="60"/>
+              <w:right w:type="dxa" w:w="90"/>
+            </w:tcMar>
+          </w:tcPr>
+          <w:p>
+            <w:r>
+              <w:rPr>
+                <w:sz w:val="17"/>
+                <w:szCs w:val="17"/>
+              </w:rPr>
+              <w:t xml:space="preserve">$5.16</w:t>
+            </w:r>
+          </w:p>
+        </w:tc>
+        <w:tc>
+          <w:tcPr>
+            <w:tcW w:type="dxa" w:w="3333"/>
+            <w:tcBorders>
+              <w:top w:val="single" w:color="BFBFBF" w:sz="4"/>
+              <w:left w:val="single" w:color="BFBFBF" w:sz="4"/>
+              <w:bottom w:val="single" w:color="BFBFBF" w:sz="4"/>
+              <w:right w:val="single" w:color="BFBFBF" w:sz="4"/>
+            </w:tcBorders>
+            <w:tcMar>
+              <w:top w:type="dxa" w:w="60"/>
+              <w:left w:type="dxa" w:w="90"/>
+              <w:bottom w:type="dxa" w:w="60"/>
+              <w:right w:type="dxa" w:w="90"/>
+            </w:tcMar>
+          </w:tcPr>
+          <w:p>
+            <w:r>
+              <w:rPr>
+                <w:sz w:val="17"/>
+                <w:szCs w:val="17"/>
+              </w:rPr>
+              <w:t xml:space="preserve">$3.90</w:t>
+            </w:r>
+          </w:p>
+        </w:tc>
+        <w:tc>
+          <w:tcPr>
+            <w:tcW w:type="dxa" w:w="4234"/>
+            <w:tcBorders>
+              <w:top w:val="single" w:color="BFBFBF" w:sz="4"/>
+              <w:left w:val="single" w:color="BFBFBF" w:sz="4"/>
+              <w:bottom w:val="single" w:color="BFBFBF" w:sz="4"/>
+              <w:right w:val="single" w:color="BFBFBF" w:sz="4"/>
+            </w:tcBorders>
+            <w:tcMar>
+              <w:top w:type="dxa" w:w="60"/>
+              <w:left w:type="dxa" w:w="90"/>
+              <w:bottom w:type="dxa" w:w="60"/>
+              <w:right w:type="dxa" w:w="90"/>
+            </w:tcMar>
+          </w:tcPr>
+          <w:p>
+            <w:r>
+              <w:rPr>
+                <w:sz w:val="17"/>
+                <w:szCs w:val="17"/>
+              </w:rPr>
+              <w:t xml:space="preserve">Restart at $5.16 to win back the rank lost after the pause (8 → 100), or at the bound ($0.97 base at 300%); Section 4.8</w:t>
+            </w:r>
+          </w:p>
+        </w:tc>
+      </w:tr>
+      <w:tr>
+        <w:trPr>
+          <w:tblHeader w:val="off"/>
+        </w:trPr>
+        <w:tc>
+          <w:tcPr>
+            <w:tcW w:type="dxa" w:w="2051"/>
+            <w:tcBorders>
+              <w:top w:val="single" w:color="BFBFBF" w:sz="4"/>
+              <w:left w:val="single" w:color="BFBFBF" w:sz="4"/>
+              <w:bottom w:val="single" w:color="BFBFBF" w:sz="4"/>
+              <w:right w:val="single" w:color="BFBFBF" w:sz="4"/>
+            </w:tcBorders>
+            <w:tcMar>
+              <w:top w:type="dxa" w:w="60"/>
+              <w:left w:type="dxa" w:w="90"/>
+              <w:bottom w:type="dxa" w:w="60"/>
+              <w:right w:type="dxa" w:w="90"/>
+            </w:tcMar>
+          </w:tcPr>
+          <w:p>
+            <w:r>
+              <w:rPr>
+                <w:sz w:val="17"/>
+                <w:szCs w:val="17"/>
+              </w:rPr>
+              <w:t xml:space="preserve">king silk sheet set</w:t>
+            </w:r>
+          </w:p>
+        </w:tc>
+        <w:tc>
+          <w:tcPr>
+            <w:tcW w:type="dxa" w:w="2115"/>
+            <w:tcBorders>
+              <w:top w:val="single" w:color="BFBFBF" w:sz="4"/>
+              <w:left w:val="single" w:color="BFBFBF" w:sz="4"/>
+              <w:bottom w:val="single" w:color="BFBFBF" w:sz="4"/>
+              <w:right w:val="single" w:color="BFBFBF" w:sz="4"/>
+            </w:tcBorders>
+            <w:tcMar>
+              <w:top w:type="dxa" w:w="60"/>
+              <w:left w:type="dxa" w:w="90"/>
+              <w:bottom w:type="dxa" w:w="60"/>
+              <w:right w:type="dxa" w:w="90"/>
+            </w:tcMar>
+          </w:tcPr>
+          <w:p>
+            <w:r>
+              <w:rPr>
+                <w:sz w:val="17"/>
+                <w:szCs w:val="17"/>
+              </w:rPr>
+              <w:t xml:space="preserve">[Silk|King]</w:t>
+            </w:r>
+          </w:p>
+        </w:tc>
+        <w:tc>
+          <w:tcPr>
+            <w:tcW w:type="dxa" w:w="833"/>
+            <w:tcBorders>
+              <w:top w:val="single" w:color="BFBFBF" w:sz="4"/>
+              <w:left w:val="single" w:color="BFBFBF" w:sz="4"/>
+              <w:bottom w:val="single" w:color="BFBFBF" w:sz="4"/>
+              <w:right w:val="single" w:color="BFBFBF" w:sz="4"/>
+            </w:tcBorders>
+            <w:tcMar>
+              <w:top w:type="dxa" w:w="60"/>
+              <w:left w:type="dxa" w:w="90"/>
+              <w:bottom w:type="dxa" w:w="60"/>
+              <w:right w:type="dxa" w:w="90"/>
+            </w:tcMar>
+          </w:tcPr>
+          <w:p>
+            <w:r>
+              <w:rPr>
+                <w:sz w:val="17"/>
+                <w:szCs w:val="17"/>
+              </w:rPr>
+              <w:t xml:space="preserve">2</w:t>
+            </w:r>
+          </w:p>
+        </w:tc>
+        <w:tc>
+          <w:tcPr>
+            <w:tcW w:type="dxa" w:w="1474"/>
+            <w:tcBorders>
+              <w:top w:val="single" w:color="BFBFBF" w:sz="4"/>
+              <w:left w:val="single" w:color="BFBFBF" w:sz="4"/>
+              <w:bottom w:val="single" w:color="BFBFBF" w:sz="4"/>
+              <w:right w:val="single" w:color="BFBFBF" w:sz="4"/>
+            </w:tcBorders>
+            <w:tcMar>
+              <w:top w:type="dxa" w:w="60"/>
+              <w:left w:type="dxa" w:w="90"/>
+              <w:bottom w:type="dxa" w:w="60"/>
+              <w:right w:type="dxa" w:w="90"/>
+            </w:tcMar>
+          </w:tcPr>
+          <w:p>
+            <w:r>
+              <w:rPr>
+                <w:sz w:val="17"/>
+                <w:szCs w:val="17"/>
+              </w:rPr>
+              <w:t xml:space="preserve">$5.50</w:t>
+            </w:r>
+          </w:p>
+        </w:tc>
+        <w:tc>
+          <w:tcPr>
+            <w:tcW w:type="dxa" w:w="3333"/>
+            <w:tcBorders>
+              <w:top w:val="single" w:color="BFBFBF" w:sz="4"/>
+              <w:left w:val="single" w:color="BFBFBF" w:sz="4"/>
+              <w:bottom w:val="single" w:color="BFBFBF" w:sz="4"/>
+              <w:right w:val="single" w:color="BFBFBF" w:sz="4"/>
+            </w:tcBorders>
+            <w:tcMar>
+              <w:top w:type="dxa" w:w="60"/>
+              <w:left w:type="dxa" w:w="90"/>
+              <w:bottom w:type="dxa" w:w="60"/>
+              <w:right w:type="dxa" w:w="90"/>
+            </w:tcMar>
+          </w:tcPr>
+          <w:p>
+            <w:r>
+              <w:rPr>
+                <w:sz w:val="17"/>
+                <w:szCs w:val="17"/>
+              </w:rPr>
+              <w:t xml:space="preserve">$4.17</w:t>
+            </w:r>
+          </w:p>
+        </w:tc>
+        <w:tc>
+          <w:tcPr>
+            <w:tcW w:type="dxa" w:w="4234"/>
+            <w:tcBorders>
+              <w:top w:val="single" w:color="BFBFBF" w:sz="4"/>
+              <w:left w:val="single" w:color="BFBFBF" w:sz="4"/>
+              <w:bottom w:val="single" w:color="BFBFBF" w:sz="4"/>
+              <w:right w:val="single" w:color="BFBFBF" w:sz="4"/>
+            </w:tcBorders>
+            <w:tcMar>
+              <w:top w:type="dxa" w:w="60"/>
+              <w:left w:type="dxa" w:w="90"/>
+              <w:bottom w:type="dxa" w:w="60"/>
+              <w:right w:type="dxa" w:w="90"/>
+            </w:tcMar>
+          </w:tcPr>
+          <w:p>
+            <w:r>
+              <w:rPr>
+                <w:sz w:val="17"/>
+                <w:szCs w:val="17"/>
+              </w:rPr>
+              <w:t xml:space="preserve">Not one of the ranking terms. ACoS 58% against 15% break-even: to the bound now ($2.75 → $2.08 base, $4.16)</w:t>
+            </w:r>
+          </w:p>
+        </w:tc>
+      </w:tr>
+      <w:tr>
+        <w:trPr>
+          <w:tblHeader w:val="off"/>
+        </w:trPr>
+        <w:tc>
+          <w:tcPr>
+            <w:tcW w:type="dxa" w:w="2051"/>
+            <w:tcBorders>
+              <w:top w:val="single" w:color="BFBFBF" w:sz="4"/>
+              <w:left w:val="single" w:color="BFBFBF" w:sz="4"/>
+              <w:bottom w:val="single" w:color="BFBFBF" w:sz="4"/>
+              <w:right w:val="single" w:color="BFBFBF" w:sz="4"/>
+            </w:tcBorders>
+            <w:tcMar>
+              <w:top w:type="dxa" w:w="60"/>
+              <w:left w:type="dxa" w:w="90"/>
+              <w:bottom w:type="dxa" w:w="60"/>
+              <w:right w:type="dxa" w:w="90"/>
+            </w:tcMar>
+          </w:tcPr>
+          <w:p>
+            <w:r>
+              <w:rPr>
+                <w:sz w:val="17"/>
+                <w:szCs w:val="17"/>
+              </w:rPr>
+              <w:t xml:space="preserve">twin sheets silk</w:t>
+            </w:r>
+          </w:p>
+        </w:tc>
+        <w:tc>
+          <w:tcPr>
+            <w:tcW w:type="dxa" w:w="2115"/>
+            <w:tcBorders>
+              <w:top w:val="single" w:color="BFBFBF" w:sz="4"/>
+              <w:left w:val="single" w:color="BFBFBF" w:sz="4"/>
+              <w:bottom w:val="single" w:color="BFBFBF" w:sz="4"/>
+              <w:right w:val="single" w:color="BFBFBF" w:sz="4"/>
+            </w:tcBorders>
+            <w:tcMar>
+              <w:top w:type="dxa" w:w="60"/>
+              <w:left w:type="dxa" w:w="90"/>
+              <w:bottom w:type="dxa" w:w="60"/>
+              <w:right w:type="dxa" w:w="90"/>
+            </w:tcMar>
+          </w:tcPr>
+          <w:p>
+            <w:r>
+              <w:rPr>
+                <w:sz w:val="17"/>
+                <w:szCs w:val="17"/>
+              </w:rPr>
+              <w:t xml:space="preserve">[Silk|Twin]</w:t>
+            </w:r>
+          </w:p>
+        </w:tc>
+        <w:tc>
+          <w:tcPr>
+            <w:tcW w:type="dxa" w:w="833"/>
+            <w:tcBorders>
+              <w:top w:val="single" w:color="BFBFBF" w:sz="4"/>
+              <w:left w:val="single" w:color="BFBFBF" w:sz="4"/>
+              <w:bottom w:val="single" w:color="BFBFBF" w:sz="4"/>
+              <w:right w:val="single" w:color="BFBFBF" w:sz="4"/>
+            </w:tcBorders>
+            <w:tcMar>
+              <w:top w:type="dxa" w:w="60"/>
+              <w:left w:type="dxa" w:w="90"/>
+              <w:bottom w:type="dxa" w:w="60"/>
+              <w:right w:type="dxa" w:w="90"/>
+            </w:tcMar>
+          </w:tcPr>
+          <w:p>
+            <w:r>
+              <w:rPr>
+                <w:sz w:val="17"/>
+                <w:szCs w:val="17"/>
+              </w:rPr>
+              <w:t xml:space="preserve">2</w:t>
+            </w:r>
+          </w:p>
+        </w:tc>
+        <w:tc>
+          <w:tcPr>
+            <w:tcW w:type="dxa" w:w="1474"/>
+            <w:tcBorders>
+              <w:top w:val="single" w:color="BFBFBF" w:sz="4"/>
+              <w:left w:val="single" w:color="BFBFBF" w:sz="4"/>
+              <w:bottom w:val="single" w:color="BFBFBF" w:sz="4"/>
+              <w:right w:val="single" w:color="BFBFBF" w:sz="4"/>
+            </w:tcBorders>
+            <w:tcMar>
+              <w:top w:type="dxa" w:w="60"/>
+              <w:left w:type="dxa" w:w="90"/>
+              <w:bottom w:type="dxa" w:w="60"/>
+              <w:right w:type="dxa" w:w="90"/>
+            </w:tcMar>
+          </w:tcPr>
+          <w:p>
+            <w:r>
+              <w:rPr>
+                <w:sz w:val="17"/>
+                <w:szCs w:val="17"/>
+              </w:rPr>
+              <w:t xml:space="preserve">$4.15</w:t>
+            </w:r>
+          </w:p>
+        </w:tc>
+        <w:tc>
+          <w:tcPr>
+            <w:tcW w:type="dxa" w:w="3333"/>
+            <w:tcBorders>
+              <w:top w:val="single" w:color="BFBFBF" w:sz="4"/>
+              <w:left w:val="single" w:color="BFBFBF" w:sz="4"/>
+              <w:bottom w:val="single" w:color="BFBFBF" w:sz="4"/>
+              <w:right w:val="single" w:color="BFBFBF" w:sz="4"/>
+            </w:tcBorders>
+            <w:tcMar>
+              <w:top w:type="dxa" w:w="60"/>
+              <w:left w:type="dxa" w:w="90"/>
+              <w:bottom w:type="dxa" w:w="60"/>
+              <w:right w:type="dxa" w:w="90"/>
+            </w:tcMar>
+          </w:tcPr>
+          <w:p>
+            <w:r>
+              <w:rPr>
+                <w:sz w:val="17"/>
+                <w:szCs w:val="17"/>
+              </w:rPr>
+              <w:t xml:space="preserve">$3.13</w:t>
+            </w:r>
+          </w:p>
+        </w:tc>
+        <w:tc>
+          <w:tcPr>
+            <w:tcW w:type="dxa" w:w="4234"/>
+            <w:tcBorders>
+              <w:top w:val="single" w:color="BFBFBF" w:sz="4"/>
+              <w:left w:val="single" w:color="BFBFBF" w:sz="4"/>
+              <w:bottom w:val="single" w:color="BFBFBF" w:sz="4"/>
+              <w:right w:val="single" w:color="BFBFBF" w:sz="4"/>
+            </w:tcBorders>
+            <w:tcMar>
+              <w:top w:type="dxa" w:w="60"/>
+              <w:left w:type="dxa" w:w="90"/>
+              <w:bottom w:type="dxa" w:w="60"/>
+              <w:right w:type="dxa" w:w="90"/>
+            </w:tcMar>
+          </w:tcPr>
+          <w:p>
+            <w:r>
+              <w:rPr>
+                <w:sz w:val="17"/>
+                <w:szCs w:val="17"/>
+              </w:rPr>
+              <w:t xml:space="preserve">Not one of the ranking terms. ACoS 88% against 31%: to the bound now ($1.66 → $1.25 base, $3.12)</w:t>
+            </w:r>
+          </w:p>
+        </w:tc>
+      </w:tr>
+      <w:tr>
+        <w:trPr>
+          <w:tblHeader w:val="off"/>
+        </w:trPr>
+        <w:tc>
+          <w:tcPr>
+            <w:tcW w:type="dxa" w:w="2051"/>
+            <w:tcBorders>
+              <w:top w:val="single" w:color="BFBFBF" w:sz="4"/>
+              <w:left w:val="single" w:color="BFBFBF" w:sz="4"/>
+              <w:bottom w:val="single" w:color="BFBFBF" w:sz="4"/>
+              <w:right w:val="single" w:color="BFBFBF" w:sz="4"/>
+            </w:tcBorders>
+            <w:tcMar>
+              <w:top w:type="dxa" w:w="60"/>
+              <w:left w:type="dxa" w:w="90"/>
+              <w:bottom w:type="dxa" w:w="60"/>
+              <w:right w:type="dxa" w:w="90"/>
+            </w:tcMar>
+          </w:tcPr>
+          <w:p>
+            <w:r>
+              <w:rPr>
+                <w:sz w:val="17"/>
+                <w:szCs w:val="17"/>
+              </w:rPr>
+              <w:t xml:space="preserve">twin satin sheet sets</w:t>
+            </w:r>
+          </w:p>
+        </w:tc>
+        <w:tc>
+          <w:tcPr>
+            <w:tcW w:type="dxa" w:w="2115"/>
+            <w:tcBorders>
+              <w:top w:val="single" w:color="BFBFBF" w:sz="4"/>
+              <w:left w:val="single" w:color="BFBFBF" w:sz="4"/>
+              <w:bottom w:val="single" w:color="BFBFBF" w:sz="4"/>
+              <w:right w:val="single" w:color="BFBFBF" w:sz="4"/>
+            </w:tcBorders>
+            <w:tcMar>
+              <w:top w:type="dxa" w:w="60"/>
+              <w:left w:type="dxa" w:w="90"/>
+              <w:bottom w:type="dxa" w:w="60"/>
+              <w:right w:type="dxa" w:w="90"/>
+            </w:tcMar>
+          </w:tcPr>
+          <w:p>
+            <w:r>
+              <w:rPr>
+                <w:sz w:val="17"/>
+                <w:szCs w:val="17"/>
+              </w:rPr>
+              <w:t xml:space="preserve">Twin Grey exact</w:t>
+            </w:r>
+          </w:p>
+        </w:tc>
+        <w:tc>
+          <w:tcPr>
+            <w:tcW w:type="dxa" w:w="833"/>
+            <w:tcBorders>
+              <w:top w:val="single" w:color="BFBFBF" w:sz="4"/>
+              <w:left w:val="single" w:color="BFBFBF" w:sz="4"/>
+              <w:bottom w:val="single" w:color="BFBFBF" w:sz="4"/>
+              <w:right w:val="single" w:color="BFBFBF" w:sz="4"/>
+            </w:tcBorders>
+            <w:tcMar>
+              <w:top w:type="dxa" w:w="60"/>
+              <w:left w:type="dxa" w:w="90"/>
+              <w:bottom w:type="dxa" w:w="60"/>
+              <w:right w:type="dxa" w:w="90"/>
+            </w:tcMar>
+          </w:tcPr>
+          <w:p>
+            <w:r>
+              <w:rPr>
+                <w:sz w:val="17"/>
+                <w:szCs w:val="17"/>
+              </w:rPr>
+              <w:t xml:space="preserve">2</w:t>
+            </w:r>
+          </w:p>
+        </w:tc>
+        <w:tc>
+          <w:tcPr>
+            <w:tcW w:type="dxa" w:w="1474"/>
+            <w:tcBorders>
+              <w:top w:val="single" w:color="BFBFBF" w:sz="4"/>
+              <w:left w:val="single" w:color="BFBFBF" w:sz="4"/>
+              <w:bottom w:val="single" w:color="BFBFBF" w:sz="4"/>
+              <w:right w:val="single" w:color="BFBFBF" w:sz="4"/>
+            </w:tcBorders>
+            <w:tcMar>
+              <w:top w:type="dxa" w:w="60"/>
+              <w:left w:type="dxa" w:w="90"/>
+              <w:bottom w:type="dxa" w:w="60"/>
+              <w:right w:type="dxa" w:w="90"/>
+            </w:tcMar>
+          </w:tcPr>
+          <w:p>
+            <w:r>
+              <w:rPr>
+                <w:sz w:val="17"/>
+                <w:szCs w:val="17"/>
+              </w:rPr>
+              <w:t xml:space="preserve">$7.04</w:t>
+            </w:r>
+          </w:p>
+        </w:tc>
+        <w:tc>
+          <w:tcPr>
+            <w:tcW w:type="dxa" w:w="3333"/>
+            <w:tcBorders>
+              <w:top w:val="single" w:color="BFBFBF" w:sz="4"/>
+              <w:left w:val="single" w:color="BFBFBF" w:sz="4"/>
+              <w:bottom w:val="single" w:color="BFBFBF" w:sz="4"/>
+              <w:right w:val="single" w:color="BFBFBF" w:sz="4"/>
+            </w:tcBorders>
+            <w:tcMar>
+              <w:top w:type="dxa" w:w="60"/>
+              <w:left w:type="dxa" w:w="90"/>
+              <w:bottom w:type="dxa" w:w="60"/>
+              <w:right w:type="dxa" w:w="90"/>
+            </w:tcMar>
+          </w:tcPr>
+          <w:p>
+            <w:r>
+              <w:rPr>
+                <w:sz w:val="17"/>
+                <w:szCs w:val="17"/>
+              </w:rPr>
+              <w:t xml:space="preserve">$4.46</w:t>
+            </w:r>
+          </w:p>
+        </w:tc>
+        <w:tc>
+          <w:tcPr>
+            <w:tcW w:type="dxa" w:w="4234"/>
+            <w:tcBorders>
+              <w:top w:val="single" w:color="BFBFBF" w:sz="4"/>
+              <w:left w:val="single" w:color="BFBFBF" w:sz="4"/>
+              <w:bottom w:val="single" w:color="BFBFBF" w:sz="4"/>
+              <w:right w:val="single" w:color="BFBFBF" w:sz="4"/>
+            </w:tcBorders>
+            <w:tcMar>
+              <w:top w:type="dxa" w:w="60"/>
+              <w:left w:type="dxa" w:w="90"/>
+              <w:bottom w:type="dxa" w:w="60"/>
+              <w:right w:type="dxa" w:w="90"/>
+            </w:tcMar>
+          </w:tcPr>
+          <w:p>
+            <w:r>
+              <w:rPr>
+                <w:sz w:val="17"/>
+                <w:szCs w:val="17"/>
+              </w:rPr>
+              <w:t xml:space="preserve">ACoS 101% against 31%: −25% now ($1.76 → $1.32 base, $5.28), then to the bound</w:t>
+            </w:r>
+          </w:p>
+        </w:tc>
+      </w:tr>
+      <w:tr>
+        <w:trPr>
+          <w:tblHeader w:val="off"/>
+        </w:trPr>
+        <w:tc>
+          <w:tcPr>
+            <w:tcW w:type="dxa" w:w="2051"/>
+            <w:tcBorders>
+              <w:top w:val="single" w:color="BFBFBF" w:sz="4"/>
+              <w:left w:val="single" w:color="BFBFBF" w:sz="4"/>
+              <w:bottom w:val="single" w:color="BFBFBF" w:sz="4"/>
+              <w:right w:val="single" w:color="BFBFBF" w:sz="4"/>
+            </w:tcBorders>
+            <w:tcMar>
+              <w:top w:type="dxa" w:w="60"/>
+              <w:left w:type="dxa" w:w="90"/>
+              <w:bottom w:type="dxa" w:w="60"/>
+              <w:right w:type="dxa" w:w="90"/>
+            </w:tcMar>
+          </w:tcPr>
+          <w:p>
+            <w:r>
+              <w:rPr>
+                <w:sz w:val="17"/>
+                <w:szCs w:val="17"/>
+              </w:rPr>
+              <w:t xml:space="preserve">gold silk sheets</w:t>
+            </w:r>
+          </w:p>
+        </w:tc>
+        <w:tc>
+          <w:tcPr>
+            <w:tcW w:type="dxa" w:w="2115"/>
+            <w:tcBorders>
+              <w:top w:val="single" w:color="BFBFBF" w:sz="4"/>
+              <w:left w:val="single" w:color="BFBFBF" w:sz="4"/>
+              <w:bottom w:val="single" w:color="BFBFBF" w:sz="4"/>
+              <w:right w:val="single" w:color="BFBFBF" w:sz="4"/>
+            </w:tcBorders>
+            <w:tcMar>
+              <w:top w:type="dxa" w:w="60"/>
+              <w:left w:type="dxa" w:w="90"/>
+              <w:bottom w:type="dxa" w:w="60"/>
+              <w:right w:type="dxa" w:w="90"/>
+            </w:tcMar>
+          </w:tcPr>
+          <w:p>
+            <w:r>
+              <w:rPr>
+                <w:sz w:val="17"/>
+                <w:szCs w:val="17"/>
+              </w:rPr>
+              <w:t xml:space="preserve">Gold colour exact</w:t>
+            </w:r>
+          </w:p>
+        </w:tc>
+        <w:tc>
+          <w:tcPr>
+            <w:tcW w:type="dxa" w:w="833"/>
+            <w:tcBorders>
+              <w:top w:val="single" w:color="BFBFBF" w:sz="4"/>
+              <w:left w:val="single" w:color="BFBFBF" w:sz="4"/>
+              <w:bottom w:val="single" w:color="BFBFBF" w:sz="4"/>
+              <w:right w:val="single" w:color="BFBFBF" w:sz="4"/>
+            </w:tcBorders>
+            <w:tcMar>
+              <w:top w:type="dxa" w:w="60"/>
+              <w:left w:type="dxa" w:w="90"/>
+              <w:bottom w:type="dxa" w:w="60"/>
+              <w:right w:type="dxa" w:w="90"/>
+            </w:tcMar>
+          </w:tcPr>
+          <w:p>
+            <w:r>
+              <w:rPr>
+                <w:sz w:val="17"/>
+                <w:szCs w:val="17"/>
+              </w:rPr>
+              <w:t xml:space="preserve">2</w:t>
+            </w:r>
+          </w:p>
+        </w:tc>
+        <w:tc>
+          <w:tcPr>
+            <w:tcW w:type="dxa" w:w="1474"/>
+            <w:tcBorders>
+              <w:top w:val="single" w:color="BFBFBF" w:sz="4"/>
+              <w:left w:val="single" w:color="BFBFBF" w:sz="4"/>
+              <w:bottom w:val="single" w:color="BFBFBF" w:sz="4"/>
+              <w:right w:val="single" w:color="BFBFBF" w:sz="4"/>
+            </w:tcBorders>
+            <w:tcMar>
+              <w:top w:type="dxa" w:w="60"/>
+              <w:left w:type="dxa" w:w="90"/>
+              <w:bottom w:type="dxa" w:w="60"/>
+              <w:right w:type="dxa" w:w="90"/>
+            </w:tcMar>
+          </w:tcPr>
+          <w:p>
+            <w:r>
+              <w:rPr>
+                <w:sz w:val="17"/>
+                <w:szCs w:val="17"/>
+              </w:rPr>
+              <w:t xml:space="preserve">$1.59</w:t>
+            </w:r>
+          </w:p>
+        </w:tc>
+        <w:tc>
+          <w:tcPr>
+            <w:tcW w:type="dxa" w:w="3333"/>
+            <w:tcBorders>
+              <w:top w:val="single" w:color="BFBFBF" w:sz="4"/>
+              <w:left w:val="single" w:color="BFBFBF" w:sz="4"/>
+              <w:bottom w:val="single" w:color="BFBFBF" w:sz="4"/>
+              <w:right w:val="single" w:color="BFBFBF" w:sz="4"/>
+            </w:tcBorders>
+            <w:tcMar>
+              <w:top w:type="dxa" w:w="60"/>
+              <w:left w:type="dxa" w:w="90"/>
+              <w:bottom w:type="dxa" w:w="60"/>
+              <w:right w:type="dxa" w:w="90"/>
+            </w:tcMar>
+          </w:tcPr>
+          <w:p>
+            <w:r>
+              <w:rPr>
+                <w:sz w:val="17"/>
+                <w:szCs w:val="17"/>
+              </w:rPr>
+              <w:t xml:space="preserve">$1.57</w:t>
+            </w:r>
+          </w:p>
+        </w:tc>
+        <w:tc>
+          <w:tcPr>
+            <w:tcW w:type="dxa" w:w="4234"/>
+            <w:tcBorders>
+              <w:top w:val="single" w:color="BFBFBF" w:sz="4"/>
+              <w:left w:val="single" w:color="BFBFBF" w:sz="4"/>
+              <w:bottom w:val="single" w:color="BFBFBF" w:sz="4"/>
+              <w:right w:val="single" w:color="BFBFBF" w:sz="4"/>
+            </w:tcBorders>
+            <w:tcMar>
+              <w:top w:type="dxa" w:w="60"/>
+              <w:left w:type="dxa" w:w="90"/>
+              <w:bottom w:type="dxa" w:w="60"/>
+              <w:right w:type="dxa" w:w="90"/>
+            </w:tcMar>
+          </w:tcPr>
+          <w:p>
+            <w:r>
+              <w:rPr>
+                <w:sz w:val="17"/>
+                <w:szCs w:val="17"/>
+              </w:rPr>
+              <w:t xml:space="preserve">Colour term: to the bound ($0.59 → $0.58 base, $1.57)</w:t>
+            </w:r>
+          </w:p>
+        </w:tc>
+      </w:tr>
+    </w:tbl>
+    <w:p/>
+    <w:p>
+      <w:pPr>
+        <w:pStyle w:val="ListParagraph"/>
+        <w:numPr>
+          <w:ilvl w:val="1"/>
+          <w:numId w:val="2"/>
+        </w:numPr>
+      </w:pPr>
+      <w:r>
+        <w:t xml:space="preserve">"king silk sheet set" and "twin sheets silk" sit in campaigns named for ranking, but neither is one of the 69 ranking terms (the plan classes both as long-tail), so they go top of search only in wave 2. Their cut to the bound is on today's setting and doesn't wait for it.</w:t>
       </w:r>
     </w:p>
     <w:p>
@@ -5110,7 +6785,7 @@
         </w:numPr>
       </w:pPr>
       <w:r>
-        <w:t xml:space="preserve">"silk sheets twin": $3.52 against $3.49.</w:t>
+        <w:t xml:space="preserve">"silk sheet" is not on the list. It is a paused keyword with 0 clicks in the "queen sheet silk" campaign ($3.17 base at 100%), so there is nothing to hold; the $3.42 bound and $2.98 cost per click belong to that campaign's live keyword "queen sheet silk". It is also the term the plan maintains through that campaign, so it has no live exact owner (Section 6).</w:t>
       </w:r>
     </w:p>
     <w:p>
@@ -5122,18 +6797,6 @@
         </w:numPr>
       </w:pPr>
       <w:r>
-        <w:t xml:space="preserve">"silk sheet": $6.34 against $3.42, on 44 clicks.</w:t>
-      </w:r>
-    </w:p>
-    <w:p>
-      <w:pPr>
-        <w:pStyle w:val="ListParagraph"/>
-        <w:numPr>
-          <w:ilvl w:val="1"/>
-          <w:numId w:val="2"/>
-        </w:numPr>
-      </w:pPr>
-      <w:r>
         <w:rPr>
           <w:b/>
           <w:bCs/>
@@ -5141,7 +6804,7 @@
         <w:t xml:space="preserve">Rounding.</w:t>
       </w:r>
       <w:r>
-        <w:t xml:space="preserve"> At 900% the top-of-search price moves in $0.10 steps. Bases round up (never a cut), except on those three, where they round down (never a climb).</w:t>
+        <w:t xml:space="preserve"> At 900% the top-of-search price moves in $0.10 steps. Bases round up (never a cut) unless that would cross the engine's bound; on the ranking keywords above the bound they round down (never a climb).</w:t>
       </w:r>
     </w:p>
     <w:p>
@@ -17548,7 +19211,7 @@
                 <w:sz w:val="17"/>
                 <w:szCs w:val="17"/>
               </w:rPr>
-              <w:t xml:space="preserve">Restart 224280280721130 at its old price once the Twin listing check is clear</w:t>
+              <w:t xml:space="preserve">Restart 224280280721130 once the Twin listing check is clear. Its old price, $5.16, is above the engine's $3.90 bound: Joseph decides the price (Section 4.2)</w:t>
             </w:r>
           </w:p>
         </w:tc>
@@ -19036,10 +20699,58 @@
           <w:b/>
           <w:bCs/>
         </w:rPr>
-        <w:t xml:space="preserve">The three ranking bids above the engine's market bound</w:t>
-      </w:r>
-      <w:r>
-        <w:t xml:space="preserve">: hold them (recommended, and the engine's own rule), or bring them down to the bound. The largest is "king size silk sheets", $4.60 against $4.24, where campaigns holding 30%+ share pay $5.18.</w:t>
+        <w:t xml:space="preserve">The keywords above the engine's market bound</w:t>
+      </w:r>
+      <w:r>
+        <w:t xml:space="preserve"> (Section 4.2 lists all 9):</w:t>
+      </w:r>
+    </w:p>
+    <w:p>
+      <w:pPr>
+        <w:pStyle w:val="ListParagraph"/>
+        <w:numPr>
+          <w:ilvl w:val="1"/>
+          <w:numId w:val="2"/>
+        </w:numPr>
+      </w:pPr>
+      <w:r>
+        <w:t xml:space="preserve">The 4 live ranking keywords: hold them (recommended, and the engine's own rule), or bring them down to the bound. The largest is "king size silk sheets", $4.60 against $4.24, where campaigns holding 30%+ share pay $5.18.</w:t>
+      </w:r>
+    </w:p>
+    <w:p>
+      <w:pPr>
+        <w:pStyle w:val="ListParagraph"/>
+        <w:numPr>
+          <w:ilvl w:val="1"/>
+          <w:numId w:val="2"/>
+        </w:numPr>
+      </w:pPr>
+      <w:r>
+        <w:t xml:space="preserve">"silk twin bed sheets": restart at its old $5.16 (recommended, to win back rank 8) or at the $3.90 bound.</w:t>
+      </w:r>
+    </w:p>
+    <w:p>
+      <w:pPr>
+        <w:pStyle w:val="ListParagraph"/>
+        <w:numPr>
+          <w:ilvl w:val="1"/>
+          <w:numId w:val="2"/>
+        </w:numPr>
+      </w:pPr>
+      <w:r>
+        <w:t xml:space="preserve">The 4 outside the ranking set ("king silk sheet set", "twin sheets silk", "twin satin sheet sets", "gold silk sheets"): confirm the cut to the bound (at most −25% a step).</w:t>
+      </w:r>
+    </w:p>
+    <w:p>
+      <w:pPr>
+        <w:pStyle w:val="ListParagraph"/>
+        <w:numPr>
+          <w:ilvl w:val="1"/>
+          <w:numId w:val="2"/>
+        </w:numPr>
+      </w:pPr>
+      <w:r>
+        <w:t xml:space="preserve">Two maintained terms have no live exact: "silk sheet" and "king size sheets set silk" are paused in the campaigns the plan gives them to. Unpause "silk sheet" at the $3.42 bound ($1.71 base at 100%, not its old $6.34) and "king size sheets set silk" at its old $1.98, or take both off the maintain list.</w:t>
       </w:r>
     </w:p>
     <w:p>
@@ -19118,7 +20829,7 @@
         </w:numPr>
       </w:pPr>
       <w:r>
-        <w:t xml:space="preserve">Wave 1, the 70 ranking campaigns: product ad to the ranking colour (King to King Black); top-of-search-only setting with each base = today's effective top-of-search bid ÷ 10 (no ranking keyword cut; the 3 above the engine's market bound held for a decision); budgets from the consolidated workbook; load the back-up product ads paused.</w:t>
+        <w:t xml:space="preserve">Wave 1, the 70 ranking campaigns: product ad to the ranking colour (King to King Black); top-of-search-only setting with each base = today's effective top-of-search bid ÷ 10 (no ranking keyword cut; every live keyword priced, not only the one the plan names; the 4 above the engine's market bound held for a decision); budgets from the consolidated workbook; load the back-up product ads paused.</w:t>
       </w:r>
     </w:p>
     <w:p>

</xml_diff>